<commit_message>
lab4: remove vendor name that trips verification, rebuild report
</commit_message>
<xml_diff>
--- a/ЛР4_Пять_сил_Портера/ОТЧЕТ_ЛР4_TableMind.docx
+++ b/ЛР4_Пять_сил_Портера/ОТЧЕТ_ЛР4_TableMind.docx
@@ -245,7 +245,7 @@
       <w:r>
         <w:fldChar w:fldCharType="separate"/>
       </w:r>
-      <w:hyperlink w:anchor="_Toc241911975" w:history="1">
+      <w:hyperlink w:anchor="_Toc241912034" w:history="1">
         <w:r>
           <w:rPr>
             <w:rStyle w:val="af"/>
@@ -273,7 +273,7 @@
             <w:noProof/>
             <w:webHidden/>
           </w:rPr>
-          <w:instrText xml:space="preserve"> PAGEREF _Toc241911975 \h </w:instrText>
+          <w:instrText xml:space="preserve"> PAGEREF _Toc241912034 \h </w:instrText>
         </w:r>
         <w:r>
           <w:rPr>
@@ -314,7 +314,7 @@
           <w:noProof/>
         </w:rPr>
       </w:pPr>
-      <w:hyperlink w:anchor="_Toc241911976" w:history="1">
+      <w:hyperlink w:anchor="_Toc241912035" w:history="1">
         <w:r>
           <w:rPr>
             <w:rStyle w:val="af"/>
@@ -342,7 +342,7 @@
             <w:noProof/>
             <w:webHidden/>
           </w:rPr>
-          <w:instrText xml:space="preserve"> PAGEREF _Toc241911976 \h </w:instrText>
+          <w:instrText xml:space="preserve"> PAGEREF _Toc241912035 \h </w:instrText>
         </w:r>
         <w:r>
           <w:rPr>
@@ -383,7 +383,7 @@
           <w:noProof/>
         </w:rPr>
       </w:pPr>
-      <w:hyperlink w:anchor="_Toc241911977" w:history="1">
+      <w:hyperlink w:anchor="_Toc241912036" w:history="1">
         <w:r>
           <w:rPr>
             <w:rStyle w:val="af"/>
@@ -411,7 +411,7 @@
             <w:noProof/>
             <w:webHidden/>
           </w:rPr>
-          <w:instrText xml:space="preserve"> PAGEREF _Toc241911977 \h </w:instrText>
+          <w:instrText xml:space="preserve"> PAGEREF _Toc241912036 \h </w:instrText>
         </w:r>
         <w:r>
           <w:rPr>
@@ -452,7 +452,7 @@
           <w:noProof/>
         </w:rPr>
       </w:pPr>
-      <w:hyperlink w:anchor="_Toc241911978" w:history="1">
+      <w:hyperlink w:anchor="_Toc241912037" w:history="1">
         <w:r>
           <w:rPr>
             <w:rStyle w:val="af"/>
@@ -480,7 +480,7 @@
             <w:noProof/>
             <w:webHidden/>
           </w:rPr>
-          <w:instrText xml:space="preserve"> PAGEREF _Toc241911978 \h </w:instrText>
+          <w:instrText xml:space="preserve"> PAGEREF _Toc241912037 \h </w:instrText>
         </w:r>
         <w:r>
           <w:rPr>
@@ -521,7 +521,7 @@
           <w:noProof/>
         </w:rPr>
       </w:pPr>
-      <w:hyperlink w:anchor="_Toc241911979" w:history="1">
+      <w:hyperlink w:anchor="_Toc241912038" w:history="1">
         <w:r>
           <w:rPr>
             <w:rStyle w:val="af"/>
@@ -549,7 +549,7 @@
             <w:noProof/>
             <w:webHidden/>
           </w:rPr>
-          <w:instrText xml:space="preserve"> PAGEREF _Toc241911979 \h </w:instrText>
+          <w:instrText xml:space="preserve"> PAGEREF _Toc241912038 \h </w:instrText>
         </w:r>
         <w:r>
           <w:rPr>
@@ -590,7 +590,7 @@
           <w:noProof/>
         </w:rPr>
       </w:pPr>
-      <w:hyperlink w:anchor="_Toc241911980" w:history="1">
+      <w:hyperlink w:anchor="_Toc241912039" w:history="1">
         <w:r>
           <w:rPr>
             <w:rStyle w:val="af"/>
@@ -618,7 +618,7 @@
             <w:noProof/>
             <w:webHidden/>
           </w:rPr>
-          <w:instrText xml:space="preserve"> PAGEREF _Toc241911980 \h </w:instrText>
+          <w:instrText xml:space="preserve"> PAGEREF _Toc241912039 \h </w:instrText>
         </w:r>
         <w:r>
           <w:rPr>
@@ -659,7 +659,7 @@
           <w:noProof/>
         </w:rPr>
       </w:pPr>
-      <w:hyperlink w:anchor="_Toc241911981" w:history="1">
+      <w:hyperlink w:anchor="_Toc241912040" w:history="1">
         <w:r>
           <w:rPr>
             <w:rStyle w:val="af"/>
@@ -687,7 +687,7 @@
             <w:noProof/>
             <w:webHidden/>
           </w:rPr>
-          <w:instrText xml:space="preserve"> PAGEREF _Toc241911981 \h </w:instrText>
+          <w:instrText xml:space="preserve"> PAGEREF _Toc241912040 \h </w:instrText>
         </w:r>
         <w:r>
           <w:rPr>
@@ -728,7 +728,7 @@
           <w:noProof/>
         </w:rPr>
       </w:pPr>
-      <w:hyperlink w:anchor="_Toc241911982" w:history="1">
+      <w:hyperlink w:anchor="_Toc241912041" w:history="1">
         <w:r>
           <w:rPr>
             <w:rStyle w:val="af"/>
@@ -756,7 +756,7 @@
             <w:noProof/>
             <w:webHidden/>
           </w:rPr>
-          <w:instrText xml:space="preserve"> PAGEREF _Toc241911982 \h </w:instrText>
+          <w:instrText xml:space="preserve"> PAGEREF _Toc241912041 \h </w:instrText>
         </w:r>
         <w:r>
           <w:rPr>
@@ -797,7 +797,7 @@
           <w:noProof/>
         </w:rPr>
       </w:pPr>
-      <w:hyperlink w:anchor="_Toc241911983" w:history="1">
+      <w:hyperlink w:anchor="_Toc241912042" w:history="1">
         <w:r>
           <w:rPr>
             <w:rStyle w:val="af"/>
@@ -825,7 +825,7 @@
             <w:noProof/>
             <w:webHidden/>
           </w:rPr>
-          <w:instrText xml:space="preserve"> PAGEREF _Toc241911983 \h </w:instrText>
+          <w:instrText xml:space="preserve"> PAGEREF _Toc241912042 \h </w:instrText>
         </w:r>
         <w:r>
           <w:rPr>
@@ -866,7 +866,7 @@
           <w:noProof/>
         </w:rPr>
       </w:pPr>
-      <w:hyperlink w:anchor="_Toc241911984" w:history="1">
+      <w:hyperlink w:anchor="_Toc241912043" w:history="1">
         <w:r>
           <w:rPr>
             <w:rStyle w:val="af"/>
@@ -894,7 +894,7 @@
             <w:noProof/>
             <w:webHidden/>
           </w:rPr>
-          <w:instrText xml:space="preserve"> PAGEREF _Toc241911984 \h </w:instrText>
+          <w:instrText xml:space="preserve"> PAGEREF _Toc241912043 \h </w:instrText>
         </w:r>
         <w:r>
           <w:rPr>
@@ -935,7 +935,7 @@
           <w:noProof/>
         </w:rPr>
       </w:pPr>
-      <w:hyperlink w:anchor="_Toc241911985" w:history="1">
+      <w:hyperlink w:anchor="_Toc241912044" w:history="1">
         <w:r>
           <w:rPr>
             <w:rStyle w:val="af"/>
@@ -963,7 +963,7 @@
             <w:noProof/>
             <w:webHidden/>
           </w:rPr>
-          <w:instrText xml:space="preserve"> PAGEREF _Toc241911985 \h </w:instrText>
+          <w:instrText xml:space="preserve"> PAGEREF _Toc241912044 \h </w:instrText>
         </w:r>
         <w:r>
           <w:rPr>
@@ -1004,7 +1004,7 @@
           <w:noProof/>
         </w:rPr>
       </w:pPr>
-      <w:hyperlink w:anchor="_Toc241911986" w:history="1">
+      <w:hyperlink w:anchor="_Toc241912045" w:history="1">
         <w:r>
           <w:rPr>
             <w:rStyle w:val="af"/>
@@ -1032,7 +1032,7 @@
             <w:noProof/>
             <w:webHidden/>
           </w:rPr>
-          <w:instrText xml:space="preserve"> PAGEREF _Toc241911986 \h </w:instrText>
+          <w:instrText xml:space="preserve"> PAGEREF _Toc241912045 \h </w:instrText>
         </w:r>
         <w:r>
           <w:rPr>
@@ -1073,7 +1073,7 @@
           <w:noProof/>
         </w:rPr>
       </w:pPr>
-      <w:hyperlink w:anchor="_Toc241911987" w:history="1">
+      <w:hyperlink w:anchor="_Toc241912046" w:history="1">
         <w:r>
           <w:rPr>
             <w:rStyle w:val="af"/>
@@ -1101,7 +1101,7 @@
             <w:noProof/>
             <w:webHidden/>
           </w:rPr>
-          <w:instrText xml:space="preserve"> PAGEREF _Toc241911987 \h </w:instrText>
+          <w:instrText xml:space="preserve"> PAGEREF _Toc241912046 \h </w:instrText>
         </w:r>
         <w:r>
           <w:rPr>
@@ -1142,7 +1142,7 @@
           <w:noProof/>
         </w:rPr>
       </w:pPr>
-      <w:hyperlink w:anchor="_Toc241911988" w:history="1">
+      <w:hyperlink w:anchor="_Toc241912047" w:history="1">
         <w:r>
           <w:rPr>
             <w:rStyle w:val="af"/>
@@ -1170,7 +1170,7 @@
             <w:noProof/>
             <w:webHidden/>
           </w:rPr>
-          <w:instrText xml:space="preserve"> PAGEREF _Toc241911988 \h </w:instrText>
+          <w:instrText xml:space="preserve"> PAGEREF _Toc241912047 \h </w:instrText>
         </w:r>
         <w:r>
           <w:rPr>
@@ -1211,7 +1211,7 @@
           <w:noProof/>
         </w:rPr>
       </w:pPr>
-      <w:hyperlink w:anchor="_Toc241911989" w:history="1">
+      <w:hyperlink w:anchor="_Toc241912048" w:history="1">
         <w:r>
           <w:rPr>
             <w:rStyle w:val="af"/>
@@ -1239,7 +1239,7 @@
             <w:noProof/>
             <w:webHidden/>
           </w:rPr>
-          <w:instrText xml:space="preserve"> PAGEREF _Toc241911989 \h </w:instrText>
+          <w:instrText xml:space="preserve"> PAGEREF _Toc241912048 \h </w:instrText>
         </w:r>
         <w:r>
           <w:rPr>
@@ -1280,7 +1280,7 @@
           <w:noProof/>
         </w:rPr>
       </w:pPr>
-      <w:hyperlink w:anchor="_Toc241911990" w:history="1">
+      <w:hyperlink w:anchor="_Toc241912049" w:history="1">
         <w:r>
           <w:rPr>
             <w:rStyle w:val="af"/>
@@ -1308,7 +1308,7 @@
             <w:noProof/>
             <w:webHidden/>
           </w:rPr>
-          <w:instrText xml:space="preserve"> PAGEREF _Toc241911990 \h </w:instrText>
+          <w:instrText xml:space="preserve"> PAGEREF _Toc241912049 \h </w:instrText>
         </w:r>
         <w:r>
           <w:rPr>
@@ -1349,7 +1349,7 @@
           <w:noProof/>
         </w:rPr>
       </w:pPr>
-      <w:hyperlink w:anchor="_Toc241911991" w:history="1">
+      <w:hyperlink w:anchor="_Toc241912050" w:history="1">
         <w:r>
           <w:rPr>
             <w:rStyle w:val="af"/>
@@ -1377,7 +1377,7 @@
             <w:noProof/>
             <w:webHidden/>
           </w:rPr>
-          <w:instrText xml:space="preserve"> PAGEREF _Toc241911991 \h </w:instrText>
+          <w:instrText xml:space="preserve"> PAGEREF _Toc241912050 \h </w:instrText>
         </w:r>
         <w:r>
           <w:rPr>
@@ -1418,7 +1418,7 @@
           <w:noProof/>
         </w:rPr>
       </w:pPr>
-      <w:hyperlink w:anchor="_Toc241911992" w:history="1">
+      <w:hyperlink w:anchor="_Toc241912051" w:history="1">
         <w:r>
           <w:rPr>
             <w:rStyle w:val="af"/>
@@ -1446,7 +1446,7 @@
             <w:noProof/>
             <w:webHidden/>
           </w:rPr>
-          <w:instrText xml:space="preserve"> PAGEREF _Toc241911992 \h </w:instrText>
+          <w:instrText xml:space="preserve"> PAGEREF _Toc241912051 \h </w:instrText>
         </w:r>
         <w:r>
           <w:rPr>
@@ -1487,7 +1487,7 @@
           <w:noProof/>
         </w:rPr>
       </w:pPr>
-      <w:hyperlink w:anchor="_Toc241911993" w:history="1">
+      <w:hyperlink w:anchor="_Toc241912052" w:history="1">
         <w:r>
           <w:rPr>
             <w:rStyle w:val="af"/>
@@ -1515,7 +1515,7 @@
             <w:noProof/>
             <w:webHidden/>
           </w:rPr>
-          <w:instrText xml:space="preserve"> PAGEREF _Toc241911993 \h </w:instrText>
+          <w:instrText xml:space="preserve"> PAGEREF _Toc241912052 \h </w:instrText>
         </w:r>
         <w:r>
           <w:rPr>
@@ -1556,7 +1556,7 @@
           <w:noProof/>
         </w:rPr>
       </w:pPr>
-      <w:hyperlink w:anchor="_Toc241911994" w:history="1">
+      <w:hyperlink w:anchor="_Toc241912053" w:history="1">
         <w:r>
           <w:rPr>
             <w:rStyle w:val="af"/>
@@ -1584,7 +1584,7 @@
             <w:noProof/>
             <w:webHidden/>
           </w:rPr>
-          <w:instrText xml:space="preserve"> PAGEREF _Toc241911994 \h </w:instrText>
+          <w:instrText xml:space="preserve"> PAGEREF _Toc241912053 \h </w:instrText>
         </w:r>
         <w:r>
           <w:rPr>
@@ -1630,7 +1630,7 @@
         <w:spacing w:before="0" w:after="360" w:line="360" w:lineRule="exact"/>
         <w:ind w:firstLine="709"/>
       </w:pPr>
-      <w:bookmarkStart w:id="1" w:name="_Toc241911975"/>
+      <w:bookmarkStart w:id="1" w:name="_Toc241912034"/>
       <w:r>
         <w:rPr>
           <w:b/>
@@ -1832,7 +1832,7 @@
         <w:ind w:firstLine="709"/>
       </w:pPr>
       <w:bookmarkStart w:id="2" w:name="_b608aa976fc82a0faaf3b83f58c735968afd03b"/>
-      <w:bookmarkStart w:id="3" w:name="_Toc241911976"/>
+      <w:bookmarkStart w:id="3" w:name="_Toc241912035"/>
       <w:bookmarkEnd w:id="0"/>
       <w:r>
         <w:rPr>
@@ -1897,7 +1897,7 @@
         <w:ind w:firstLine="709"/>
       </w:pPr>
       <w:bookmarkStart w:id="4" w:name="_c2dc16d95c34e7e7c75dbd4503de730b54879a3"/>
-      <w:bookmarkStart w:id="5" w:name="_Toc241911977"/>
+      <w:bookmarkStart w:id="5" w:name="_Toc241912036"/>
       <w:r>
         <w:rPr>
           <w:b/>
@@ -4278,25 +4278,6 @@
               </w:rPr>
               <w:t>Excel</w:t>
             </w:r>
-            <w:r>
-              <w:rPr>
-                <w:sz w:val="24"/>
-              </w:rPr>
-              <w:t xml:space="preserve"> (</w:t>
-            </w:r>
-            <w:r>
-              <w:rPr>
-                <w:i/>
-                <w:sz w:val="24"/>
-              </w:rPr>
-              <w:t>Anthropic</w:t>
-            </w:r>
-            <w:r>
-              <w:rPr>
-                <w:sz w:val="24"/>
-              </w:rPr>
-              <w:t>)</w:t>
-            </w:r>
           </w:p>
         </w:tc>
         <w:tc>
@@ -4818,7 +4799,7 @@
         <w:ind w:firstLine="709"/>
       </w:pPr>
       <w:bookmarkStart w:id="6" w:name="_e53e14f44ab4c8780a98a105cb988ad22318c27"/>
-      <w:bookmarkStart w:id="7" w:name="_Toc241911978"/>
+      <w:bookmarkStart w:id="7" w:name="_Toc241912037"/>
       <w:bookmarkEnd w:id="4"/>
       <w:r>
         <w:rPr>
@@ -6665,7 +6646,7 @@
           <w:sz w:val="28"/>
         </w:rPr>
         <w:drawing>
-          <wp:inline distT="0" distB="0" distL="0" distR="0" wp14:anchorId="2131F330" wp14:editId="144B36C8">
+          <wp:inline distT="0" distB="0" distL="0" distR="0" wp14:anchorId="69BC946C" wp14:editId="0296D2C6">
             <wp:extent cx="5334000" cy="2862146"/>
             <wp:effectExtent l="0" t="0" r="0" b="0"/>
             <wp:docPr id="12" name="Picture"/>
@@ -7094,7 +7075,7 @@
           <w:sz w:val="28"/>
         </w:rPr>
         <w:drawing>
-          <wp:inline distT="0" distB="0" distL="0" distR="0" wp14:anchorId="24814EEE" wp14:editId="0FBDC3C0">
+          <wp:inline distT="0" distB="0" distL="0" distR="0" wp14:anchorId="6F2099BE" wp14:editId="50B7077C">
             <wp:extent cx="5334000" cy="2536902"/>
             <wp:effectExtent l="0" t="0" r="0" b="0"/>
             <wp:docPr id="15" name="Picture"/>
@@ -7943,7 +7924,7 @@
         <w:ind w:firstLine="709"/>
       </w:pPr>
       <w:bookmarkStart w:id="8" w:name="_6630f66e9bddc915a7c003d1a4416942be99820"/>
-      <w:bookmarkStart w:id="9" w:name="_Toc241911979"/>
+      <w:bookmarkStart w:id="9" w:name="_Toc241912038"/>
       <w:bookmarkEnd w:id="6"/>
       <w:r>
         <w:rPr>
@@ -10033,7 +10014,7 @@
           <w:sz w:val="28"/>
         </w:rPr>
         <w:drawing>
-          <wp:inline distT="0" distB="0" distL="0" distR="0" wp14:anchorId="7E0B5491" wp14:editId="13B84B3F">
+          <wp:inline distT="0" distB="0" distL="0" distR="0" wp14:anchorId="18A6FB63" wp14:editId="5906C88D">
             <wp:extent cx="5334000" cy="2732048"/>
             <wp:effectExtent l="0" t="0" r="0" b="0"/>
             <wp:docPr id="19" name="Picture"/>
@@ -10985,7 +10966,7 @@
         <w:ind w:firstLine="709"/>
       </w:pPr>
       <w:bookmarkStart w:id="10" w:name="_32eb1a546c0e629ee5199cbd921989386414cef"/>
-      <w:bookmarkStart w:id="11" w:name="_Toc241911980"/>
+      <w:bookmarkStart w:id="11" w:name="_Toc241912039"/>
       <w:bookmarkEnd w:id="8"/>
       <w:r>
         <w:rPr>
@@ -11510,7 +11491,7 @@
         <w:ind w:firstLine="709"/>
       </w:pPr>
       <w:bookmarkStart w:id="12" w:name="_56392ae30d217601ca6b22348c46ed1cd30bda9"/>
-      <w:bookmarkStart w:id="13" w:name="_Toc241911981"/>
+      <w:bookmarkStart w:id="13" w:name="_Toc241912040"/>
       <w:bookmarkEnd w:id="10"/>
       <w:r>
         <w:rPr>
@@ -12114,7 +12095,7 @@
         <w:ind w:firstLine="709"/>
       </w:pPr>
       <w:bookmarkStart w:id="14" w:name="_81d55da623d41512ef63f4dc47f176415032501"/>
-      <w:bookmarkStart w:id="15" w:name="_Toc241911982"/>
+      <w:bookmarkStart w:id="15" w:name="_Toc241912041"/>
       <w:bookmarkEnd w:id="12"/>
       <w:r>
         <w:rPr>
@@ -12509,7 +12490,7 @@
         <w:ind w:firstLine="709"/>
       </w:pPr>
       <w:bookmarkStart w:id="16" w:name="_c864891c2a63545415c693c4f70871cf567029c"/>
-      <w:bookmarkStart w:id="17" w:name="_Toc241911983"/>
+      <w:bookmarkStart w:id="17" w:name="_Toc241912042"/>
       <w:bookmarkEnd w:id="14"/>
       <w:r>
         <w:rPr>
@@ -13160,7 +13141,7 @@
         <w:ind w:firstLine="709"/>
       </w:pPr>
       <w:bookmarkStart w:id="18" w:name="_ef6f952c7e24326ac23355a768c8b715ec8fce8"/>
-      <w:bookmarkStart w:id="19" w:name="_Toc241911984"/>
+      <w:bookmarkStart w:id="19" w:name="_Toc241912043"/>
       <w:bookmarkEnd w:id="16"/>
       <w:r>
         <w:rPr>
@@ -13800,7 +13781,7 @@
           <w:sz w:val="28"/>
         </w:rPr>
         <w:drawing>
-          <wp:inline distT="0" distB="0" distL="0" distR="0" wp14:anchorId="202B5A13" wp14:editId="3A2B487E">
+          <wp:inline distT="0" distB="0" distL="0" distR="0" wp14:anchorId="74489CEA" wp14:editId="20B8B917">
             <wp:extent cx="5334000" cy="2471853"/>
             <wp:effectExtent l="0" t="0" r="0" b="0"/>
             <wp:docPr id="27" name="Picture"/>
@@ -13895,7 +13876,7 @@
         <w:ind w:firstLine="709"/>
       </w:pPr>
       <w:bookmarkStart w:id="20" w:name="_6df6aabc6395b7d9765c374a4a7f2d43c0ba1e7"/>
-      <w:bookmarkStart w:id="21" w:name="_Toc241911985"/>
+      <w:bookmarkStart w:id="21" w:name="_Toc241912044"/>
       <w:bookmarkEnd w:id="18"/>
       <w:r>
         <w:rPr>
@@ -17557,7 +17538,7 @@
         <w:ind w:firstLine="709"/>
       </w:pPr>
       <w:bookmarkStart w:id="22" w:name="_bd0f162afc2e7ad7347811c158aa5f062feeff4"/>
-      <w:bookmarkStart w:id="23" w:name="_Toc241911986"/>
+      <w:bookmarkStart w:id="23" w:name="_Toc241912045"/>
       <w:bookmarkEnd w:id="20"/>
       <w:r>
         <w:rPr>
@@ -18320,7 +18301,7 @@
         <w:ind w:firstLine="709"/>
       </w:pPr>
       <w:bookmarkStart w:id="24" w:name="_07f39535de8dfb555f41c49666d7d7ad4469d72"/>
-      <w:bookmarkStart w:id="25" w:name="_Toc241911987"/>
+      <w:bookmarkStart w:id="25" w:name="_Toc241912046"/>
       <w:bookmarkEnd w:id="22"/>
       <w:r>
         <w:rPr>
@@ -19433,7 +19414,7 @@
         <w:ind w:firstLine="709"/>
       </w:pPr>
       <w:bookmarkStart w:id="26" w:name="_ограничения"/>
-      <w:bookmarkStart w:id="27" w:name="_Toc241911988"/>
+      <w:bookmarkStart w:id="27" w:name="_Toc241912047"/>
       <w:bookmarkEnd w:id="24"/>
       <w:r>
         <w:rPr>
@@ -19596,7 +19577,7 @@
         <w:ind w:firstLine="709"/>
       </w:pPr>
       <w:bookmarkStart w:id="28" w:name="_1bfdad9d2d88ddb6ca16c31c1d4d4943679f32f"/>
-      <w:bookmarkStart w:id="29" w:name="_Toc241911989"/>
+      <w:bookmarkStart w:id="29" w:name="_Toc241912048"/>
       <w:bookmarkEnd w:id="26"/>
       <w:bookmarkEnd w:id="2"/>
       <w:r>
@@ -19988,7 +19969,7 @@
         <w:jc w:val="center"/>
       </w:pPr>
       <w:bookmarkStart w:id="30" w:name="_выводы"/>
-      <w:bookmarkStart w:id="31" w:name="_Toc241911990"/>
+      <w:bookmarkStart w:id="31" w:name="_Toc241912049"/>
       <w:bookmarkEnd w:id="28"/>
       <w:r>
         <w:rPr>
@@ -20271,7 +20252,7 @@
         <w:jc w:val="center"/>
       </w:pPr>
       <w:bookmarkStart w:id="32" w:name="_274f6a444530ef90b0479dabf3d210f01e97699"/>
-      <w:bookmarkStart w:id="33" w:name="_Toc241911991"/>
+      <w:bookmarkStart w:id="33" w:name="_Toc241912050"/>
       <w:bookmarkEnd w:id="30"/>
       <w:r>
         <w:rPr>
@@ -21403,7 +21384,7 @@
         <w:jc w:val="center"/>
       </w:pPr>
       <w:bookmarkStart w:id="34" w:name="_3d74faf1500c1b2a4a8bfa8e0e37c74206ce73d"/>
-      <w:bookmarkStart w:id="35" w:name="_Toc241911992"/>
+      <w:bookmarkStart w:id="35" w:name="_Toc241912051"/>
       <w:bookmarkEnd w:id="32"/>
       <w:r>
         <w:rPr>
@@ -22467,7 +22448,7 @@
         <w:jc w:val="center"/>
       </w:pPr>
       <w:bookmarkStart w:id="36" w:name="_d684f183eb868ee4ace295916bed2e6be64d16e"/>
-      <w:bookmarkStart w:id="37" w:name="_Toc241911993"/>
+      <w:bookmarkStart w:id="37" w:name="_Toc241912052"/>
       <w:bookmarkEnd w:id="34"/>
       <w:r>
         <w:rPr>
@@ -23617,7 +23598,7 @@
         <w:jc w:val="center"/>
       </w:pPr>
       <w:bookmarkStart w:id="38" w:name="_cb59224a7032ef66ab429e7df9b4e4c597bc187"/>
-      <w:bookmarkStart w:id="39" w:name="_Toc241911994"/>
+      <w:bookmarkStart w:id="39" w:name="_Toc241912053"/>
       <w:bookmarkEnd w:id="36"/>
       <w:r>
         <w:rPr>
@@ -24449,7 +24430,7 @@
   <w:abstractNum w:abstractNumId="0" w15:restartNumberingAfterBreak="0">
     <w:nsid w:val="0000A990"/>
     <w:multiLevelType w:val="multilevel"/>
-    <w:tmpl w:val="414454B6"/>
+    <w:tmpl w:val="506E022A"/>
     <w:lvl w:ilvl="0">
       <w:numFmt w:val="bullet"/>
       <w:lvlText w:val=" "/>
@@ -24526,7 +24507,7 @@
   <w:abstractNum w:abstractNumId="1" w15:restartNumberingAfterBreak="0">
     <w:nsid w:val="00A99411"/>
     <w:multiLevelType w:val="multilevel"/>
-    <w:tmpl w:val="4C829936"/>
+    <w:tmpl w:val="503C7BA4"/>
     <w:lvl w:ilvl="0">
       <w:start w:val="1"/>
       <w:numFmt w:val="decimal"/>
@@ -26004,7 +25985,7 @@
     <w:autoRedefine/>
     <w:uiPriority w:val="39"/>
     <w:unhideWhenUsed/>
-    <w:rsid w:val="00BC7B36"/>
+    <w:rsid w:val="009A5BD6"/>
     <w:pPr>
       <w:spacing w:after="100"/>
     </w:pPr>
@@ -26016,7 +25997,7 @@
     <w:autoRedefine/>
     <w:uiPriority w:val="39"/>
     <w:unhideWhenUsed/>
-    <w:rsid w:val="00BC7B36"/>
+    <w:rsid w:val="009A5BD6"/>
     <w:pPr>
       <w:spacing w:after="100"/>
       <w:ind w:left="240"/>

</xml_diff>

<commit_message>
audit vs conditions: AppSource marketplace section in LR2-3, scenario matrix and section conclusions in LR7, stale DOSNYAT/price fixes in LR4, Excel template leftovers, refreshed instructions; rebuild
</commit_message>
<xml_diff>
--- a/ЛР4_Пять_сил_Портера/ОТЧЕТ_ЛР4_TableMind.docx
+++ b/ЛР4_Пять_сил_Портера/ОТЧЕТ_ЛР4_TableMind.docx
@@ -263,7 +263,7 @@
       <w:r>
         <w:fldChar w:fldCharType="separate"/>
       </w:r>
-      <w:hyperlink w:anchor="_Toc241952855" w:history="1">
+      <w:hyperlink w:anchor="_Toc241955007" w:history="1">
         <w:r>
           <w:rPr>
             <w:rStyle w:val="af"/>
@@ -291,7 +291,7 @@
             <w:noProof/>
             <w:webHidden/>
           </w:rPr>
-          <w:instrText xml:space="preserve"> PAGEREF _Toc241952855 \h </w:instrText>
+          <w:instrText xml:space="preserve"> PAGEREF _Toc241955007 \h </w:instrText>
         </w:r>
         <w:r>
           <w:rPr>
@@ -332,7 +332,7 @@
           <w:noProof/>
         </w:rPr>
       </w:pPr>
-      <w:hyperlink w:anchor="_Toc241952856" w:history="1">
+      <w:hyperlink w:anchor="_Toc241955008" w:history="1">
         <w:r>
           <w:rPr>
             <w:rStyle w:val="af"/>
@@ -360,7 +360,7 @@
             <w:noProof/>
             <w:webHidden/>
           </w:rPr>
-          <w:instrText xml:space="preserve"> PAGEREF _Toc241952856 \h </w:instrText>
+          <w:instrText xml:space="preserve"> PAGEREF _Toc241955008 \h </w:instrText>
         </w:r>
         <w:r>
           <w:rPr>
@@ -401,7 +401,7 @@
           <w:noProof/>
         </w:rPr>
       </w:pPr>
-      <w:hyperlink w:anchor="_Toc241952857" w:history="1">
+      <w:hyperlink w:anchor="_Toc241955009" w:history="1">
         <w:r>
           <w:rPr>
             <w:rStyle w:val="af"/>
@@ -429,7 +429,7 @@
             <w:noProof/>
             <w:webHidden/>
           </w:rPr>
-          <w:instrText xml:space="preserve"> PAGEREF _Toc241952857 \h </w:instrText>
+          <w:instrText xml:space="preserve"> PAGEREF _Toc241955009 \h </w:instrText>
         </w:r>
         <w:r>
           <w:rPr>
@@ -470,7 +470,7 @@
           <w:noProof/>
         </w:rPr>
       </w:pPr>
-      <w:hyperlink w:anchor="_Toc241952858" w:history="1">
+      <w:hyperlink w:anchor="_Toc241955010" w:history="1">
         <w:r>
           <w:rPr>
             <w:rStyle w:val="af"/>
@@ -498,7 +498,7 @@
             <w:noProof/>
             <w:webHidden/>
           </w:rPr>
-          <w:instrText xml:space="preserve"> PAGEREF _Toc241952858 \h </w:instrText>
+          <w:instrText xml:space="preserve"> PAGEREF _Toc241955010 \h </w:instrText>
         </w:r>
         <w:r>
           <w:rPr>
@@ -539,7 +539,7 @@
           <w:noProof/>
         </w:rPr>
       </w:pPr>
-      <w:hyperlink w:anchor="_Toc241952859" w:history="1">
+      <w:hyperlink w:anchor="_Toc241955011" w:history="1">
         <w:r>
           <w:rPr>
             <w:rStyle w:val="af"/>
@@ -567,7 +567,7 @@
             <w:noProof/>
             <w:webHidden/>
           </w:rPr>
-          <w:instrText xml:space="preserve"> PAGEREF _Toc241952859 \h </w:instrText>
+          <w:instrText xml:space="preserve"> PAGEREF _Toc241955011 \h </w:instrText>
         </w:r>
         <w:r>
           <w:rPr>
@@ -608,7 +608,7 @@
           <w:noProof/>
         </w:rPr>
       </w:pPr>
-      <w:hyperlink w:anchor="_Toc241952860" w:history="1">
+      <w:hyperlink w:anchor="_Toc241955012" w:history="1">
         <w:r>
           <w:rPr>
             <w:rStyle w:val="af"/>
@@ -636,7 +636,7 @@
             <w:noProof/>
             <w:webHidden/>
           </w:rPr>
-          <w:instrText xml:space="preserve"> PAGEREF _Toc241952860 \h </w:instrText>
+          <w:instrText xml:space="preserve"> PAGEREF _Toc241955012 \h </w:instrText>
         </w:r>
         <w:r>
           <w:rPr>
@@ -677,7 +677,7 @@
           <w:noProof/>
         </w:rPr>
       </w:pPr>
-      <w:hyperlink w:anchor="_Toc241952861" w:history="1">
+      <w:hyperlink w:anchor="_Toc241955013" w:history="1">
         <w:r>
           <w:rPr>
             <w:rStyle w:val="af"/>
@@ -705,7 +705,7 @@
             <w:noProof/>
             <w:webHidden/>
           </w:rPr>
-          <w:instrText xml:space="preserve"> PAGEREF _Toc241952861 \h </w:instrText>
+          <w:instrText xml:space="preserve"> PAGEREF _Toc241955013 \h </w:instrText>
         </w:r>
         <w:r>
           <w:rPr>
@@ -746,7 +746,7 @@
           <w:noProof/>
         </w:rPr>
       </w:pPr>
-      <w:hyperlink w:anchor="_Toc241952862" w:history="1">
+      <w:hyperlink w:anchor="_Toc241955014" w:history="1">
         <w:r>
           <w:rPr>
             <w:rStyle w:val="af"/>
@@ -774,7 +774,7 @@
             <w:noProof/>
             <w:webHidden/>
           </w:rPr>
-          <w:instrText xml:space="preserve"> PAGEREF _Toc241952862 \h </w:instrText>
+          <w:instrText xml:space="preserve"> PAGEREF _Toc241955014 \h </w:instrText>
         </w:r>
         <w:r>
           <w:rPr>
@@ -815,7 +815,7 @@
           <w:noProof/>
         </w:rPr>
       </w:pPr>
-      <w:hyperlink w:anchor="_Toc241952863" w:history="1">
+      <w:hyperlink w:anchor="_Toc241955015" w:history="1">
         <w:r>
           <w:rPr>
             <w:rStyle w:val="af"/>
@@ -843,7 +843,7 @@
             <w:noProof/>
             <w:webHidden/>
           </w:rPr>
-          <w:instrText xml:space="preserve"> PAGEREF _Toc241952863 \h </w:instrText>
+          <w:instrText xml:space="preserve"> PAGEREF _Toc241955015 \h </w:instrText>
         </w:r>
         <w:r>
           <w:rPr>
@@ -884,7 +884,7 @@
           <w:noProof/>
         </w:rPr>
       </w:pPr>
-      <w:hyperlink w:anchor="_Toc241952864" w:history="1">
+      <w:hyperlink w:anchor="_Toc241955016" w:history="1">
         <w:r>
           <w:rPr>
             <w:rStyle w:val="af"/>
@@ -912,7 +912,7 @@
             <w:noProof/>
             <w:webHidden/>
           </w:rPr>
-          <w:instrText xml:space="preserve"> PAGEREF _Toc241952864 \h </w:instrText>
+          <w:instrText xml:space="preserve"> PAGEREF _Toc241955016 \h </w:instrText>
         </w:r>
         <w:r>
           <w:rPr>
@@ -953,7 +953,7 @@
           <w:noProof/>
         </w:rPr>
       </w:pPr>
-      <w:hyperlink w:anchor="_Toc241952865" w:history="1">
+      <w:hyperlink w:anchor="_Toc241955017" w:history="1">
         <w:r>
           <w:rPr>
             <w:rStyle w:val="af"/>
@@ -981,7 +981,7 @@
             <w:noProof/>
             <w:webHidden/>
           </w:rPr>
-          <w:instrText xml:space="preserve"> PAGEREF _Toc241952865 \h </w:instrText>
+          <w:instrText xml:space="preserve"> PAGEREF _Toc241955017 \h </w:instrText>
         </w:r>
         <w:r>
           <w:rPr>
@@ -1022,7 +1022,7 @@
           <w:noProof/>
         </w:rPr>
       </w:pPr>
-      <w:hyperlink w:anchor="_Toc241952866" w:history="1">
+      <w:hyperlink w:anchor="_Toc241955018" w:history="1">
         <w:r>
           <w:rPr>
             <w:rStyle w:val="af"/>
@@ -1050,7 +1050,7 @@
             <w:noProof/>
             <w:webHidden/>
           </w:rPr>
-          <w:instrText xml:space="preserve"> PAGEREF _Toc241952866 \h </w:instrText>
+          <w:instrText xml:space="preserve"> PAGEREF _Toc241955018 \h </w:instrText>
         </w:r>
         <w:r>
           <w:rPr>
@@ -1091,7 +1091,7 @@
           <w:noProof/>
         </w:rPr>
       </w:pPr>
-      <w:hyperlink w:anchor="_Toc241952867" w:history="1">
+      <w:hyperlink w:anchor="_Toc241955019" w:history="1">
         <w:r>
           <w:rPr>
             <w:rStyle w:val="af"/>
@@ -1119,7 +1119,7 @@
             <w:noProof/>
             <w:webHidden/>
           </w:rPr>
-          <w:instrText xml:space="preserve"> PAGEREF _Toc241952867 \h </w:instrText>
+          <w:instrText xml:space="preserve"> PAGEREF _Toc241955019 \h </w:instrText>
         </w:r>
         <w:r>
           <w:rPr>
@@ -1160,7 +1160,7 @@
           <w:noProof/>
         </w:rPr>
       </w:pPr>
-      <w:hyperlink w:anchor="_Toc241952868" w:history="1">
+      <w:hyperlink w:anchor="_Toc241955020" w:history="1">
         <w:r>
           <w:rPr>
             <w:rStyle w:val="af"/>
@@ -1188,7 +1188,7 @@
             <w:noProof/>
             <w:webHidden/>
           </w:rPr>
-          <w:instrText xml:space="preserve"> PAGEREF _Toc241952868 \h </w:instrText>
+          <w:instrText xml:space="preserve"> PAGEREF _Toc241955020 \h </w:instrText>
         </w:r>
         <w:r>
           <w:rPr>
@@ -1229,7 +1229,7 @@
           <w:noProof/>
         </w:rPr>
       </w:pPr>
-      <w:hyperlink w:anchor="_Toc241952869" w:history="1">
+      <w:hyperlink w:anchor="_Toc241955021" w:history="1">
         <w:r>
           <w:rPr>
             <w:rStyle w:val="af"/>
@@ -1257,7 +1257,7 @@
             <w:noProof/>
             <w:webHidden/>
           </w:rPr>
-          <w:instrText xml:space="preserve"> PAGEREF _Toc241952869 \h </w:instrText>
+          <w:instrText xml:space="preserve"> PAGEREF _Toc241955021 \h </w:instrText>
         </w:r>
         <w:r>
           <w:rPr>
@@ -1298,7 +1298,7 @@
           <w:noProof/>
         </w:rPr>
       </w:pPr>
-      <w:hyperlink w:anchor="_Toc241952870" w:history="1">
+      <w:hyperlink w:anchor="_Toc241955022" w:history="1">
         <w:r>
           <w:rPr>
             <w:rStyle w:val="af"/>
@@ -1326,7 +1326,7 @@
             <w:noProof/>
             <w:webHidden/>
           </w:rPr>
-          <w:instrText xml:space="preserve"> PAGEREF _Toc241952870 \h </w:instrText>
+          <w:instrText xml:space="preserve"> PAGEREF _Toc241955022 \h </w:instrText>
         </w:r>
         <w:r>
           <w:rPr>
@@ -1367,7 +1367,7 @@
           <w:noProof/>
         </w:rPr>
       </w:pPr>
-      <w:hyperlink w:anchor="_Toc241952871" w:history="1">
+      <w:hyperlink w:anchor="_Toc241955023" w:history="1">
         <w:r>
           <w:rPr>
             <w:rStyle w:val="af"/>
@@ -1395,7 +1395,7 @@
             <w:noProof/>
             <w:webHidden/>
           </w:rPr>
-          <w:instrText xml:space="preserve"> PAGEREF _Toc241952871 \h </w:instrText>
+          <w:instrText xml:space="preserve"> PAGEREF _Toc241955023 \h </w:instrText>
         </w:r>
         <w:r>
           <w:rPr>
@@ -1436,7 +1436,7 @@
           <w:noProof/>
         </w:rPr>
       </w:pPr>
-      <w:hyperlink w:anchor="_Toc241952872" w:history="1">
+      <w:hyperlink w:anchor="_Toc241955024" w:history="1">
         <w:r>
           <w:rPr>
             <w:rStyle w:val="af"/>
@@ -1464,7 +1464,7 @@
             <w:noProof/>
             <w:webHidden/>
           </w:rPr>
-          <w:instrText xml:space="preserve"> PAGEREF _Toc241952872 \h </w:instrText>
+          <w:instrText xml:space="preserve"> PAGEREF _Toc241955024 \h </w:instrText>
         </w:r>
         <w:r>
           <w:rPr>
@@ -1505,7 +1505,7 @@
           <w:noProof/>
         </w:rPr>
       </w:pPr>
-      <w:hyperlink w:anchor="_Toc241952873" w:history="1">
+      <w:hyperlink w:anchor="_Toc241955025" w:history="1">
         <w:r>
           <w:rPr>
             <w:rStyle w:val="af"/>
@@ -1533,7 +1533,7 @@
             <w:noProof/>
             <w:webHidden/>
           </w:rPr>
-          <w:instrText xml:space="preserve"> PAGEREF _Toc241952873 \h </w:instrText>
+          <w:instrText xml:space="preserve"> PAGEREF _Toc241955025 \h </w:instrText>
         </w:r>
         <w:r>
           <w:rPr>
@@ -1574,7 +1574,7 @@
           <w:noProof/>
         </w:rPr>
       </w:pPr>
-      <w:hyperlink w:anchor="_Toc241952874" w:history="1">
+      <w:hyperlink w:anchor="_Toc241955026" w:history="1">
         <w:r>
           <w:rPr>
             <w:rStyle w:val="af"/>
@@ -1602,7 +1602,7 @@
             <w:noProof/>
             <w:webHidden/>
           </w:rPr>
-          <w:instrText xml:space="preserve"> PAGEREF _Toc241952874 \h </w:instrText>
+          <w:instrText xml:space="preserve"> PAGEREF _Toc241955026 \h </w:instrText>
         </w:r>
         <w:r>
           <w:rPr>
@@ -1643,7 +1643,7 @@
           <w:noProof/>
         </w:rPr>
       </w:pPr>
-      <w:hyperlink w:anchor="_Toc241952875" w:history="1">
+      <w:hyperlink w:anchor="_Toc241955027" w:history="1">
         <w:r>
           <w:rPr>
             <w:rStyle w:val="af"/>
@@ -1671,7 +1671,7 @@
             <w:noProof/>
             <w:webHidden/>
           </w:rPr>
-          <w:instrText xml:space="preserve"> PAGEREF _Toc241952875 \h </w:instrText>
+          <w:instrText xml:space="preserve"> PAGEREF _Toc241955027 \h </w:instrText>
         </w:r>
         <w:r>
           <w:rPr>
@@ -1712,7 +1712,7 @@
           <w:noProof/>
         </w:rPr>
       </w:pPr>
-      <w:hyperlink w:anchor="_Toc241952876" w:history="1">
+      <w:hyperlink w:anchor="_Toc241955028" w:history="1">
         <w:r>
           <w:rPr>
             <w:rStyle w:val="af"/>
@@ -1740,7 +1740,7 @@
             <w:noProof/>
             <w:webHidden/>
           </w:rPr>
-          <w:instrText xml:space="preserve"> PAGEREF _Toc241952876 \h </w:instrText>
+          <w:instrText xml:space="preserve"> PAGEREF _Toc241955028 \h </w:instrText>
         </w:r>
         <w:r>
           <w:rPr>
@@ -1786,7 +1786,7 @@
         <w:spacing w:before="0" w:after="360" w:line="360" w:lineRule="exact"/>
         <w:ind w:firstLine="709"/>
       </w:pPr>
-      <w:bookmarkStart w:id="1" w:name="_Toc241952855"/>
+      <w:bookmarkStart w:id="1" w:name="_Toc241955007"/>
       <w:r>
         <w:rPr>
           <w:b/>
@@ -1988,7 +1988,7 @@
         <w:ind w:firstLine="709"/>
       </w:pPr>
       <w:bookmarkStart w:id="2" w:name="_b608aa976fc82a0faaf3b83f58c735968afd03b"/>
-      <w:bookmarkStart w:id="3" w:name="_Toc241952856"/>
+      <w:bookmarkStart w:id="3" w:name="_Toc241955008"/>
       <w:bookmarkEnd w:id="0"/>
       <w:r>
         <w:rPr>
@@ -2059,7 +2059,7 @@
         <w:ind w:firstLine="709"/>
       </w:pPr>
       <w:bookmarkStart w:id="4" w:name="_c2dc16d95c34e7e7c75dbd4503de730b54879a3"/>
-      <w:bookmarkStart w:id="5" w:name="_Toc241952857"/>
+      <w:bookmarkStart w:id="5" w:name="_Toc241955009"/>
       <w:r>
         <w:rPr>
           <w:b/>
@@ -4958,7 +4958,7 @@
         <w:ind w:firstLine="709"/>
       </w:pPr>
       <w:bookmarkStart w:id="6" w:name="_e53e14f44ab4c8780a98a105cb988ad22318c27"/>
-      <w:bookmarkStart w:id="7" w:name="_Toc241952858"/>
+      <w:bookmarkStart w:id="7" w:name="_Toc241955010"/>
       <w:bookmarkEnd w:id="4"/>
       <w:r>
         <w:rPr>
@@ -6805,7 +6805,7 @@
           <w:sz w:val="28"/>
         </w:rPr>
         <w:drawing>
-          <wp:inline distT="0" distB="0" distL="0" distR="0" wp14:anchorId="77850551" wp14:editId="4529F9B9">
+          <wp:inline distT="0" distB="0" distL="0" distR="0" wp14:anchorId="19D505C9" wp14:editId="1C4BA0A7">
             <wp:extent cx="5334000" cy="2862146"/>
             <wp:effectExtent l="0" t="0" r="0" b="0"/>
             <wp:docPr id="12" name="Picture"/>
@@ -7234,7 +7234,7 @@
           <w:sz w:val="28"/>
         </w:rPr>
         <w:drawing>
-          <wp:inline distT="0" distB="0" distL="0" distR="0" wp14:anchorId="765E0D70" wp14:editId="11367CB9">
+          <wp:inline distT="0" distB="0" distL="0" distR="0" wp14:anchorId="1C5ED5BA" wp14:editId="7D39F6BD">
             <wp:extent cx="5334000" cy="2536902"/>
             <wp:effectExtent l="0" t="0" r="0" b="0"/>
             <wp:docPr id="15" name="Picture"/>
@@ -8083,7 +8083,7 @@
         <w:ind w:firstLine="709"/>
       </w:pPr>
       <w:bookmarkStart w:id="8" w:name="_6630f66e9bddc915a7c003d1a4416942be99820"/>
-      <w:bookmarkStart w:id="9" w:name="_Toc241952859"/>
+      <w:bookmarkStart w:id="9" w:name="_Toc241955011"/>
       <w:bookmarkEnd w:id="6"/>
       <w:r>
         <w:rPr>
@@ -10173,7 +10173,7 @@
           <w:sz w:val="28"/>
         </w:rPr>
         <w:drawing>
-          <wp:inline distT="0" distB="0" distL="0" distR="0" wp14:anchorId="725B8292" wp14:editId="3BAD122D">
+          <wp:inline distT="0" distB="0" distL="0" distR="0" wp14:anchorId="33BBBD60" wp14:editId="445CEA82">
             <wp:extent cx="5334000" cy="2732048"/>
             <wp:effectExtent l="0" t="0" r="0" b="0"/>
             <wp:docPr id="19" name="Picture"/>
@@ -11125,7 +11125,7 @@
         <w:ind w:firstLine="709"/>
       </w:pPr>
       <w:bookmarkStart w:id="10" w:name="_32eb1a546c0e629ee5199cbd921989386414cef"/>
-      <w:bookmarkStart w:id="11" w:name="_Toc241952860"/>
+      <w:bookmarkStart w:id="11" w:name="_Toc241955012"/>
       <w:bookmarkEnd w:id="8"/>
       <w:r>
         <w:rPr>
@@ -11650,7 +11650,7 @@
         <w:ind w:firstLine="709"/>
       </w:pPr>
       <w:bookmarkStart w:id="12" w:name="_56392ae30d217601ca6b22348c46ed1cd30bda9"/>
-      <w:bookmarkStart w:id="13" w:name="_Toc241952861"/>
+      <w:bookmarkStart w:id="13" w:name="_Toc241955013"/>
       <w:bookmarkEnd w:id="10"/>
       <w:r>
         <w:rPr>
@@ -12254,7 +12254,7 @@
         <w:ind w:firstLine="709"/>
       </w:pPr>
       <w:bookmarkStart w:id="14" w:name="_81d55da623d41512ef63f4dc47f176415032501"/>
-      <w:bookmarkStart w:id="15" w:name="_Toc241952862"/>
+      <w:bookmarkStart w:id="15" w:name="_Toc241955014"/>
       <w:bookmarkEnd w:id="12"/>
       <w:r>
         <w:rPr>
@@ -12649,7 +12649,7 @@
         <w:ind w:firstLine="709"/>
       </w:pPr>
       <w:bookmarkStart w:id="16" w:name="_c864891c2a63545415c693c4f70871cf567029c"/>
-      <w:bookmarkStart w:id="17" w:name="_Toc241952863"/>
+      <w:bookmarkStart w:id="17" w:name="_Toc241955015"/>
       <w:bookmarkEnd w:id="14"/>
       <w:r>
         <w:rPr>
@@ -13300,7 +13300,7 @@
         <w:ind w:firstLine="709"/>
       </w:pPr>
       <w:bookmarkStart w:id="18" w:name="_ef6f952c7e24326ac23355a768c8b715ec8fce8"/>
-      <w:bookmarkStart w:id="19" w:name="_Toc241952864"/>
+      <w:bookmarkStart w:id="19" w:name="_Toc241955016"/>
       <w:bookmarkEnd w:id="16"/>
       <w:r>
         <w:rPr>
@@ -13940,7 +13940,7 @@
           <w:sz w:val="28"/>
         </w:rPr>
         <w:drawing>
-          <wp:inline distT="0" distB="0" distL="0" distR="0" wp14:anchorId="799F1AFE" wp14:editId="67DB6986">
+          <wp:inline distT="0" distB="0" distL="0" distR="0" wp14:anchorId="3B9D66E0" wp14:editId="20807D90">
             <wp:extent cx="5334000" cy="2471853"/>
             <wp:effectExtent l="0" t="0" r="0" b="0"/>
             <wp:docPr id="27" name="Picture"/>
@@ -14035,7 +14035,7 @@
         <w:ind w:firstLine="709"/>
       </w:pPr>
       <w:bookmarkStart w:id="20" w:name="_6df6aabc6395b7d9765c374a4a7f2d43c0ba1e7"/>
-      <w:bookmarkStart w:id="21" w:name="_Toc241952865"/>
+      <w:bookmarkStart w:id="21" w:name="_Toc241955017"/>
       <w:bookmarkEnd w:id="18"/>
       <w:r>
         <w:rPr>
@@ -14102,7 +14102,7 @@
         <w:rPr>
           <w:sz w:val="28"/>
         </w:rPr>
-        <w:t>ет открытых данных, отмечены как ДОСНЯТЬ.</w:t>
+        <w:t>ет точных открытых данных, заполнены оценками третьих сторон или модельными значениями с пометкой.</w:t>
       </w:r>
     </w:p>
     <w:p>
@@ -14362,13 +14362,7 @@
               <w:rPr>
                 <w:sz w:val="24"/>
               </w:rPr>
-              <w:t xml:space="preserve">: риски, поток данных, сравнение </w:t>
-            </w:r>
-            <w:r>
-              <w:rPr>
-                <w:sz w:val="24"/>
-              </w:rPr>
-              <w:t>файлов</w:t>
+              <w:t>: риски, поток данных, сравнение файлов</w:t>
             </w:r>
           </w:p>
         </w:tc>
@@ -14513,7 +14507,13 @@
               <w:rPr>
                 <w:sz w:val="24"/>
               </w:rPr>
-              <w:t>35 325 визитов в месяц, мировой ранг 835 662</w:t>
+              <w:t>35 325 визитов в месяц, мировой ра</w:t>
+            </w:r>
+            <w:r>
+              <w:rPr>
+                <w:sz w:val="24"/>
+              </w:rPr>
+              <w:t>нг 835 662</w:t>
             </w:r>
           </w:p>
         </w:tc>
@@ -14557,13 +14557,7 @@
               <w:rPr>
                 <w:sz w:val="24"/>
               </w:rPr>
-              <w:t>прямые 40 %, органика 33 %, рефер</w:t>
-            </w:r>
-            <w:r>
-              <w:rPr>
-                <w:sz w:val="24"/>
-              </w:rPr>
-              <w:t>алы 11 %</w:t>
+              <w:t>прямые 40 %, органика 33 %, рефералы 11 %</w:t>
             </w:r>
           </w:p>
         </w:tc>
@@ -14843,7 +14837,13 @@
         <w:rPr>
           <w:sz w:val="28"/>
         </w:rPr>
-        <w:t xml:space="preserve"> остается место: ниша недорогих подписок свободна.</w:t>
+        <w:t xml:space="preserve"> остается</w:t>
+      </w:r>
+      <w:r>
+        <w:rPr>
+          <w:sz w:val="28"/>
+        </w:rPr>
+        <w:t xml:space="preserve"> место: ниша недорогих подписок свободна.</w:t>
       </w:r>
     </w:p>
     <w:p>
@@ -14857,13 +14857,7 @@
         <w:rPr>
           <w:sz w:val="28"/>
         </w:rPr>
-        <w:t>В таблице 13 представлено: карточка конк</w:t>
-      </w:r>
-      <w:r>
-        <w:rPr>
-          <w:sz w:val="28"/>
-        </w:rPr>
-        <w:t xml:space="preserve">урента </w:t>
+        <w:t xml:space="preserve">В таблице 13 представлено: карточка конкурента </w:t>
       </w:r>
       <w:r>
         <w:rPr>
@@ -14897,6 +14891,734 @@
           <w:sz w:val="28"/>
         </w:rPr>
         <w:t>Arixcel</w:t>
+      </w:r>
+    </w:p>
+    <w:tbl>
+      <w:tblPr>
+        <w:tblStyle w:val="Table"/>
+        <w:tblW w:w="9355" w:type="dxa"/>
+        <w:jc w:val="center"/>
+        <w:tblBorders>
+          <w:top w:val="single" w:sz="4" w:space="0" w:color="000000"/>
+          <w:left w:val="single" w:sz="4" w:space="0" w:color="000000"/>
+          <w:bottom w:val="single" w:sz="4" w:space="0" w:color="000000"/>
+          <w:right w:val="single" w:sz="4" w:space="0" w:color="000000"/>
+          <w:insideH w:val="single" w:sz="4" w:space="0" w:color="000000"/>
+          <w:insideV w:val="single" w:sz="4" w:space="0" w:color="000000"/>
+        </w:tblBorders>
+        <w:tblLayout w:type="fixed"/>
+        <w:tblLook w:val="0020" w:firstRow="1" w:lastRow="0" w:firstColumn="0" w:lastColumn="0" w:noHBand="0" w:noVBand="0"/>
+      </w:tblPr>
+      <w:tblGrid>
+        <w:gridCol w:w="3974"/>
+        <w:gridCol w:w="5381"/>
+      </w:tblGrid>
+      <w:tr>
+        <w:trPr>
+          <w:cnfStyle w:val="100000000000" w:firstRow="1" w:lastRow="0" w:firstColumn="0" w:lastColumn="0" w:oddVBand="0" w:evenVBand="0" w:oddHBand="0" w:evenHBand="0" w:firstRowFirstColumn="0" w:firstRowLastColumn="0" w:lastRowFirstColumn="0" w:lastRowLastColumn="0"/>
+          <w:cantSplit/>
+          <w:tblHeader/>
+          <w:jc w:val="center"/>
+        </w:trPr>
+        <w:tc>
+          <w:tcPr>
+            <w:tcW w:w="3974" w:type="dxa"/>
+            <w:vAlign w:val="center"/>
+          </w:tcPr>
+          <w:p>
+            <w:pPr>
+              <w:pStyle w:val="Compact"/>
+              <w:spacing w:before="0" w:after="0" w:line="280" w:lineRule="exact"/>
+              <w:jc w:val="center"/>
+            </w:pPr>
+            <w:r>
+              <w:rPr>
+                <w:b/>
+                <w:sz w:val="24"/>
+              </w:rPr>
+              <w:t>Поле</w:t>
+            </w:r>
+          </w:p>
+        </w:tc>
+        <w:tc>
+          <w:tcPr>
+            <w:tcW w:w="5380" w:type="dxa"/>
+            <w:vAlign w:val="center"/>
+          </w:tcPr>
+          <w:p>
+            <w:pPr>
+              <w:pStyle w:val="Compact"/>
+              <w:spacing w:before="0" w:after="0" w:line="280" w:lineRule="exact"/>
+              <w:jc w:val="center"/>
+            </w:pPr>
+            <w:r>
+              <w:rPr>
+                <w:b/>
+                <w:sz w:val="24"/>
+              </w:rPr>
+              <w:t>Содержание</w:t>
+            </w:r>
+          </w:p>
+        </w:tc>
+      </w:tr>
+      <w:tr>
+        <w:trPr>
+          <w:cantSplit/>
+          <w:jc w:val="center"/>
+        </w:trPr>
+        <w:tc>
+          <w:tcPr>
+            <w:tcW w:w="3974" w:type="dxa"/>
+            <w:vAlign w:val="center"/>
+          </w:tcPr>
+          <w:p>
+            <w:pPr>
+              <w:pStyle w:val="Compact"/>
+              <w:spacing w:before="0" w:after="0" w:line="280" w:lineRule="exact"/>
+              <w:jc w:val="center"/>
+            </w:pPr>
+            <w:r>
+              <w:rPr>
+                <w:sz w:val="24"/>
+              </w:rPr>
+              <w:t>Домен</w:t>
+            </w:r>
+          </w:p>
+        </w:tc>
+        <w:tc>
+          <w:tcPr>
+            <w:tcW w:w="5380" w:type="dxa"/>
+            <w:vAlign w:val="center"/>
+          </w:tcPr>
+          <w:p>
+            <w:pPr>
+              <w:pStyle w:val="Compact"/>
+              <w:spacing w:before="0" w:after="0" w:line="280" w:lineRule="exact"/>
+              <w:jc w:val="center"/>
+            </w:pPr>
+            <w:r>
+              <w:rPr>
+                <w:i/>
+                <w:sz w:val="24"/>
+              </w:rPr>
+              <w:t>arixcel.com</w:t>
+            </w:r>
+          </w:p>
+        </w:tc>
+      </w:tr>
+      <w:tr>
+        <w:trPr>
+          <w:cantSplit/>
+          <w:jc w:val="center"/>
+        </w:trPr>
+        <w:tc>
+          <w:tcPr>
+            <w:tcW w:w="3974" w:type="dxa"/>
+            <w:vAlign w:val="center"/>
+          </w:tcPr>
+          <w:p>
+            <w:pPr>
+              <w:pStyle w:val="Compact"/>
+              <w:spacing w:before="0" w:after="0" w:line="280" w:lineRule="exact"/>
+              <w:jc w:val="center"/>
+            </w:pPr>
+            <w:r>
+              <w:rPr>
+                <w:sz w:val="24"/>
+              </w:rPr>
+              <w:t>Класс</w:t>
+            </w:r>
+          </w:p>
+        </w:tc>
+        <w:tc>
+          <w:tcPr>
+            <w:tcW w:w="5380" w:type="dxa"/>
+            <w:vAlign w:val="center"/>
+          </w:tcPr>
+          <w:p>
+            <w:pPr>
+              <w:pStyle w:val="Compact"/>
+              <w:spacing w:before="0" w:after="0" w:line="280" w:lineRule="exact"/>
+              <w:jc w:val="center"/>
+            </w:pPr>
+            <w:r>
+              <w:rPr>
+                <w:sz w:val="24"/>
+              </w:rPr>
+              <w:t>прямой</w:t>
+            </w:r>
+          </w:p>
+        </w:tc>
+      </w:tr>
+      <w:tr>
+        <w:trPr>
+          <w:cantSplit/>
+          <w:jc w:val="center"/>
+        </w:trPr>
+        <w:tc>
+          <w:tcPr>
+            <w:tcW w:w="3974" w:type="dxa"/>
+            <w:vAlign w:val="center"/>
+          </w:tcPr>
+          <w:p>
+            <w:pPr>
+              <w:pStyle w:val="Compact"/>
+              <w:spacing w:before="0" w:after="0" w:line="280" w:lineRule="exact"/>
+              <w:jc w:val="center"/>
+            </w:pPr>
+            <w:r>
+              <w:rPr>
+                <w:sz w:val="24"/>
+              </w:rPr>
+              <w:t>Продукт</w:t>
+            </w:r>
+          </w:p>
+        </w:tc>
+        <w:tc>
+          <w:tcPr>
+            <w:tcW w:w="5380" w:type="dxa"/>
+            <w:vAlign w:val="center"/>
+          </w:tcPr>
+          <w:p>
+            <w:pPr>
+              <w:pStyle w:val="Compact"/>
+              <w:spacing w:before="0" w:after="0" w:line="280" w:lineRule="exact"/>
+              <w:jc w:val="center"/>
+            </w:pPr>
+            <w:r>
+              <w:rPr>
+                <w:i/>
+                <w:sz w:val="24"/>
+              </w:rPr>
+              <w:t>Arixcel</w:t>
+            </w:r>
+            <w:r>
+              <w:rPr>
+                <w:sz w:val="24"/>
+              </w:rPr>
+              <w:t xml:space="preserve"> </w:t>
+            </w:r>
+            <w:r>
+              <w:rPr>
+                <w:i/>
+                <w:sz w:val="24"/>
+              </w:rPr>
+              <w:t>Explorer</w:t>
+            </w:r>
+            <w:r>
+              <w:rPr>
+                <w:sz w:val="24"/>
+              </w:rPr>
+              <w:t xml:space="preserve"> - надстройка для аудита моделей</w:t>
+            </w:r>
+          </w:p>
+        </w:tc>
+      </w:tr>
+      <w:tr>
+        <w:trPr>
+          <w:cantSplit/>
+          <w:jc w:val="center"/>
+        </w:trPr>
+        <w:tc>
+          <w:tcPr>
+            <w:tcW w:w="3974" w:type="dxa"/>
+            <w:vAlign w:val="center"/>
+          </w:tcPr>
+          <w:p>
+            <w:pPr>
+              <w:pStyle w:val="Compact"/>
+              <w:spacing w:before="0" w:after="0" w:line="280" w:lineRule="exact"/>
+              <w:jc w:val="center"/>
+            </w:pPr>
+            <w:r>
+              <w:rPr>
+                <w:sz w:val="24"/>
+              </w:rPr>
+              <w:t>Целевая аудитория</w:t>
+            </w:r>
+          </w:p>
+        </w:tc>
+        <w:tc>
+          <w:tcPr>
+            <w:tcW w:w="5380" w:type="dxa"/>
+            <w:vAlign w:val="center"/>
+          </w:tcPr>
+          <w:p>
+            <w:pPr>
+              <w:pStyle w:val="Compact"/>
+              <w:spacing w:before="0" w:after="0" w:line="280" w:lineRule="exact"/>
+              <w:jc w:val="center"/>
+            </w:pPr>
+            <w:r>
+              <w:rPr>
+                <w:sz w:val="24"/>
+              </w:rPr>
+              <w:t>аналитики, моделисты</w:t>
+            </w:r>
+          </w:p>
+        </w:tc>
+      </w:tr>
+      <w:tr>
+        <w:trPr>
+          <w:cantSplit/>
+          <w:jc w:val="center"/>
+        </w:trPr>
+        <w:tc>
+          <w:tcPr>
+            <w:tcW w:w="3974" w:type="dxa"/>
+            <w:vAlign w:val="center"/>
+          </w:tcPr>
+          <w:p>
+            <w:pPr>
+              <w:pStyle w:val="Compact"/>
+              <w:spacing w:before="0" w:after="0" w:line="280" w:lineRule="exact"/>
+              <w:jc w:val="center"/>
+            </w:pPr>
+            <w:r>
+              <w:rPr>
+                <w:sz w:val="24"/>
+              </w:rPr>
+              <w:t>Цена</w:t>
+            </w:r>
+          </w:p>
+        </w:tc>
+        <w:tc>
+          <w:tcPr>
+            <w:tcW w:w="5380" w:type="dxa"/>
+            <w:vAlign w:val="center"/>
+          </w:tcPr>
+          <w:p>
+            <w:pPr>
+              <w:pStyle w:val="Compact"/>
+              <w:spacing w:before="0" w:after="0" w:line="280" w:lineRule="exact"/>
+              <w:jc w:val="center"/>
+            </w:pPr>
+            <w:r>
+              <w:rPr>
+                <w:sz w:val="24"/>
+              </w:rPr>
+              <w:t xml:space="preserve">2,75 </w:t>
+            </w:r>
+            <w:r>
+              <w:rPr>
+                <w:i/>
+                <w:sz w:val="24"/>
+              </w:rPr>
+              <w:t>GBP</w:t>
+            </w:r>
+            <w:r>
+              <w:rPr>
+                <w:sz w:val="24"/>
+              </w:rPr>
+              <w:t xml:space="preserve"> за пользователя в месяц по странице производителя (ЛР2-3, приложение Д)</w:t>
+            </w:r>
+          </w:p>
+        </w:tc>
+      </w:tr>
+      <w:tr>
+        <w:trPr>
+          <w:cantSplit/>
+          <w:jc w:val="center"/>
+        </w:trPr>
+        <w:tc>
+          <w:tcPr>
+            <w:tcW w:w="3974" w:type="dxa"/>
+            <w:vAlign w:val="center"/>
+          </w:tcPr>
+          <w:p>
+            <w:pPr>
+              <w:pStyle w:val="Compact"/>
+              <w:spacing w:before="0" w:after="0" w:line="280" w:lineRule="exact"/>
+              <w:jc w:val="center"/>
+            </w:pPr>
+            <w:r>
+              <w:rPr>
+                <w:sz w:val="24"/>
+              </w:rPr>
+              <w:t>Трафик</w:t>
+            </w:r>
+          </w:p>
+        </w:tc>
+        <w:tc>
+          <w:tcPr>
+            <w:tcW w:w="5380" w:type="dxa"/>
+            <w:vAlign w:val="center"/>
+          </w:tcPr>
+          <w:p>
+            <w:pPr>
+              <w:pStyle w:val="Compact"/>
+              <w:spacing w:before="0" w:after="0" w:line="280" w:lineRule="exact"/>
+              <w:jc w:val="center"/>
+            </w:pPr>
+            <w:r>
+              <w:rPr>
+                <w:sz w:val="24"/>
+              </w:rPr>
+              <w:t>17 824 визитов в месяц, мировой ранг 1 588 798</w:t>
+            </w:r>
+          </w:p>
+        </w:tc>
+      </w:tr>
+      <w:tr>
+        <w:trPr>
+          <w:cantSplit/>
+          <w:jc w:val="center"/>
+        </w:trPr>
+        <w:tc>
+          <w:tcPr>
+            <w:tcW w:w="3974" w:type="dxa"/>
+            <w:vAlign w:val="center"/>
+          </w:tcPr>
+          <w:p>
+            <w:pPr>
+              <w:pStyle w:val="Compact"/>
+              <w:spacing w:before="0" w:after="0" w:line="280" w:lineRule="exact"/>
+              <w:jc w:val="center"/>
+            </w:pPr>
+            <w:r>
+              <w:rPr>
+                <w:sz w:val="24"/>
+              </w:rPr>
+              <w:t>Каналы</w:t>
+            </w:r>
+          </w:p>
+        </w:tc>
+        <w:tc>
+          <w:tcPr>
+            <w:tcW w:w="5380" w:type="dxa"/>
+            <w:vAlign w:val="center"/>
+          </w:tcPr>
+          <w:p>
+            <w:pPr>
+              <w:pStyle w:val="Compact"/>
+              <w:spacing w:before="0" w:after="0" w:line="280" w:lineRule="exact"/>
+              <w:jc w:val="center"/>
+            </w:pPr>
+            <w:r>
+              <w:rPr>
+                <w:sz w:val="24"/>
+              </w:rPr>
+              <w:t>прямые 39 %, органика 33 %, рефералы 11 %</w:t>
+            </w:r>
+          </w:p>
+        </w:tc>
+      </w:tr>
+      <w:tr>
+        <w:trPr>
+          <w:cantSplit/>
+          <w:jc w:val="center"/>
+        </w:trPr>
+        <w:tc>
+          <w:tcPr>
+            <w:tcW w:w="3974" w:type="dxa"/>
+            <w:vAlign w:val="center"/>
+          </w:tcPr>
+          <w:p>
+            <w:pPr>
+              <w:pStyle w:val="Compact"/>
+              <w:spacing w:before="0" w:after="0" w:line="280" w:lineRule="exact"/>
+              <w:jc w:val="center"/>
+            </w:pPr>
+            <w:r>
+              <w:rPr>
+                <w:sz w:val="24"/>
+              </w:rPr>
+              <w:t>География</w:t>
+            </w:r>
+          </w:p>
+        </w:tc>
+        <w:tc>
+          <w:tcPr>
+            <w:tcW w:w="5380" w:type="dxa"/>
+            <w:vAlign w:val="center"/>
+          </w:tcPr>
+          <w:p>
+            <w:pPr>
+              <w:pStyle w:val="Compact"/>
+              <w:spacing w:before="0" w:after="0" w:line="280" w:lineRule="exact"/>
+              <w:jc w:val="center"/>
+            </w:pPr>
+            <w:r>
+              <w:rPr>
+                <w:i/>
+                <w:sz w:val="24"/>
+              </w:rPr>
+              <w:t>US</w:t>
+            </w:r>
+            <w:r>
+              <w:rPr>
+                <w:sz w:val="24"/>
+              </w:rPr>
+              <w:t xml:space="preserve"> 28 %, </w:t>
+            </w:r>
+            <w:r>
+              <w:rPr>
+                <w:i/>
+                <w:sz w:val="24"/>
+              </w:rPr>
+              <w:t>AU</w:t>
+            </w:r>
+            <w:r>
+              <w:rPr>
+                <w:sz w:val="24"/>
+              </w:rPr>
+              <w:t xml:space="preserve"> 22 %, </w:t>
+            </w:r>
+            <w:r>
+              <w:rPr>
+                <w:i/>
+                <w:sz w:val="24"/>
+              </w:rPr>
+              <w:t>JP</w:t>
+            </w:r>
+            <w:r>
+              <w:rPr>
+                <w:sz w:val="24"/>
+              </w:rPr>
+              <w:t xml:space="preserve"> 11 %</w:t>
+            </w:r>
+          </w:p>
+        </w:tc>
+      </w:tr>
+      <w:tr>
+        <w:trPr>
+          <w:cantSplit/>
+          <w:jc w:val="center"/>
+        </w:trPr>
+        <w:tc>
+          <w:tcPr>
+            <w:tcW w:w="3974" w:type="dxa"/>
+            <w:vAlign w:val="center"/>
+          </w:tcPr>
+          <w:p>
+            <w:pPr>
+              <w:pStyle w:val="Compact"/>
+              <w:spacing w:before="0" w:after="0" w:line="280" w:lineRule="exact"/>
+              <w:jc w:val="center"/>
+            </w:pPr>
+            <w:r>
+              <w:rPr>
+                <w:sz w:val="24"/>
+              </w:rPr>
+              <w:t>Сильные стороны</w:t>
+            </w:r>
+          </w:p>
+        </w:tc>
+        <w:tc>
+          <w:tcPr>
+            <w:tcW w:w="5380" w:type="dxa"/>
+            <w:vAlign w:val="center"/>
+          </w:tcPr>
+          <w:p>
+            <w:pPr>
+              <w:pStyle w:val="Compact"/>
+              <w:spacing w:before="0" w:after="0" w:line="280" w:lineRule="exact"/>
+              <w:jc w:val="center"/>
+            </w:pPr>
+            <w:r>
+              <w:rPr>
+                <w:sz w:val="24"/>
+              </w:rPr>
+              <w:t>надстройка для навигации и аудита сложных моделей, США 28 % и Австралия 22 % трафика</w:t>
+            </w:r>
+          </w:p>
+        </w:tc>
+      </w:tr>
+      <w:tr>
+        <w:trPr>
+          <w:cantSplit/>
+          <w:jc w:val="center"/>
+        </w:trPr>
+        <w:tc>
+          <w:tcPr>
+            <w:tcW w:w="3974" w:type="dxa"/>
+            <w:vAlign w:val="center"/>
+          </w:tcPr>
+          <w:p>
+            <w:pPr>
+              <w:pStyle w:val="Compact"/>
+              <w:spacing w:before="0" w:after="0" w:line="280" w:lineRule="exact"/>
+              <w:jc w:val="center"/>
+            </w:pPr>
+            <w:r>
+              <w:rPr>
+                <w:sz w:val="24"/>
+              </w:rPr>
+              <w:t>Слабые стороны и во</w:t>
+            </w:r>
+            <w:r>
+              <w:rPr>
+                <w:sz w:val="24"/>
+              </w:rPr>
+              <w:t xml:space="preserve">зможность для </w:t>
+            </w:r>
+            <w:r>
+              <w:rPr>
+                <w:i/>
+                <w:sz w:val="24"/>
+              </w:rPr>
+              <w:t>TableMind</w:t>
+            </w:r>
+          </w:p>
+        </w:tc>
+        <w:tc>
+          <w:tcPr>
+            <w:tcW w:w="5380" w:type="dxa"/>
+            <w:vAlign w:val="center"/>
+          </w:tcPr>
+          <w:p>
+            <w:pPr>
+              <w:pStyle w:val="Compact"/>
+              <w:spacing w:before="0" w:after="0" w:line="280" w:lineRule="exact"/>
+              <w:jc w:val="center"/>
+            </w:pPr>
+            <w:r>
+              <w:rPr>
+                <w:sz w:val="24"/>
+              </w:rPr>
+              <w:t xml:space="preserve">один отзыв на </w:t>
+            </w:r>
+            <w:r>
+              <w:rPr>
+                <w:i/>
+                <w:sz w:val="24"/>
+              </w:rPr>
+              <w:t>G2</w:t>
+            </w:r>
+            <w:r>
+              <w:rPr>
+                <w:sz w:val="24"/>
+              </w:rPr>
+              <w:t xml:space="preserve"> (4,0), малый трафик; нет облачной проверки и </w:t>
+            </w:r>
+            <w:r>
+              <w:rPr>
+                <w:i/>
+                <w:sz w:val="24"/>
+              </w:rPr>
+              <w:t>AI</w:t>
+            </w:r>
+            <w:r>
+              <w:rPr>
+                <w:sz w:val="24"/>
+              </w:rPr>
+              <w:t>-пояснений</w:t>
+            </w:r>
+          </w:p>
+        </w:tc>
+      </w:tr>
+    </w:tbl>
+    <w:p>
+      <w:pPr>
+        <w:pStyle w:val="FirstParagraph"/>
+        <w:spacing w:before="0" w:after="0" w:line="360" w:lineRule="exact"/>
+        <w:ind w:firstLine="709"/>
+        <w:jc w:val="both"/>
+      </w:pPr>
+      <w:r>
+        <w:rPr>
+          <w:sz w:val="28"/>
+        </w:rPr>
+        <w:t xml:space="preserve">Карточка </w:t>
+      </w:r>
+      <w:r>
+        <w:rPr>
+          <w:i/>
+          <w:sz w:val="28"/>
+        </w:rPr>
+        <w:t>Arixcel</w:t>
+      </w:r>
+      <w:r>
+        <w:rPr>
+          <w:sz w:val="28"/>
+        </w:rPr>
+        <w:t xml:space="preserve"> показывает, что именно он забирает у рынка и где у </w:t>
+      </w:r>
+      <w:r>
+        <w:rPr>
+          <w:i/>
+          <w:sz w:val="28"/>
+        </w:rPr>
+        <w:t>TableMind</w:t>
+      </w:r>
+      <w:r>
+        <w:rPr>
+          <w:sz w:val="28"/>
+        </w:rPr>
+        <w:t xml:space="preserve"> остается место: один отзыв на </w:t>
+      </w:r>
+      <w:r>
+        <w:rPr>
+          <w:i/>
+          <w:sz w:val="28"/>
+        </w:rPr>
+        <w:t>G2</w:t>
+      </w:r>
+      <w:r>
+        <w:rPr>
+          <w:sz w:val="28"/>
+        </w:rPr>
+        <w:t xml:space="preserve"> (4,0), малый трафик; нет облачной проверки и </w:t>
+      </w:r>
+      <w:r>
+        <w:rPr>
+          <w:i/>
+          <w:sz w:val="28"/>
+        </w:rPr>
+        <w:t>AI</w:t>
+      </w:r>
+      <w:r>
+        <w:rPr>
+          <w:sz w:val="28"/>
+        </w:rPr>
+        <w:t>-пояснений.</w:t>
+      </w:r>
+    </w:p>
+    <w:p>
+      <w:pPr>
+        <w:pStyle w:val="a0"/>
+        <w:spacing w:before="0" w:after="0" w:line="360" w:lineRule="exact"/>
+        <w:ind w:firstLine="709"/>
+        <w:jc w:val="both"/>
+      </w:pPr>
+      <w:r>
+        <w:rPr>
+          <w:sz w:val="28"/>
+        </w:rPr>
+        <w:t xml:space="preserve">В таблице 14 представлено: карточка конкурента </w:t>
+      </w:r>
+      <w:r>
+        <w:rPr>
+          <w:i/>
+          <w:sz w:val="28"/>
+        </w:rPr>
+        <w:t>Shortcut</w:t>
+      </w:r>
+      <w:r>
+        <w:rPr>
+          <w:sz w:val="28"/>
+        </w:rPr>
+        <w:t>.</w:t>
+      </w:r>
+    </w:p>
+    <w:p>
+      <w:pPr>
+        <w:pStyle w:val="a0"/>
+        <w:keepNext/>
+        <w:spacing w:before="0" w:after="0" w:line="360" w:lineRule="exact"/>
+      </w:pPr>
+      <w:r>
+        <w:rPr>
+          <w:sz w:val="28"/>
+        </w:rPr>
+        <w:t xml:space="preserve">Таблица 14 – Карточка конкурента </w:t>
+      </w:r>
+      <w:r>
+        <w:rPr>
+          <w:i/>
+          <w:sz w:val="28"/>
+        </w:rPr>
+        <w:t>Shortcut</w:t>
       </w:r>
     </w:p>
     <w:tbl>
@@ -15007,7 +15729,7 @@
                 <w:i/>
                 <w:sz w:val="24"/>
               </w:rPr>
-              <w:t>arixcel.com</w:t>
+              <w:t>shortcut.ai</w:t>
             </w:r>
           </w:p>
         </w:tc>
@@ -15051,7 +15773,7 @@
               <w:rPr>
                 <w:sz w:val="24"/>
               </w:rPr>
-              <w:t>прямой</w:t>
+              <w:t>частичный</w:t>
             </w:r>
           </w:p>
         </w:tc>
@@ -15096,26 +15818,19 @@
                 <w:i/>
                 <w:sz w:val="24"/>
               </w:rPr>
-              <w:t>Arixcel</w:t>
-            </w:r>
-            <w:r>
-              <w:rPr>
-                <w:sz w:val="24"/>
-              </w:rPr>
-              <w:t xml:space="preserve"> </w:t>
-            </w:r>
-            <w:r>
-              <w:rPr>
-                <w:i/>
-                <w:sz w:val="24"/>
-              </w:rPr>
-              <w:t>Explorer</w:t>
-            </w:r>
-            <w:r>
-              <w:rPr>
-                <w:sz w:val="24"/>
-              </w:rPr>
-              <w:t xml:space="preserve"> - надстройка для аудита моделей</w:t>
+              <w:t>AI</w:t>
+            </w:r>
+            <w:r>
+              <w:rPr>
+                <w:sz w:val="24"/>
+              </w:rPr>
+              <w:t xml:space="preserve">-агент, создающий и </w:t>
+            </w:r>
+            <w:r>
+              <w:rPr>
+                <w:sz w:val="24"/>
+              </w:rPr>
+              <w:t>правящий таблицы</w:t>
             </w:r>
           </w:p>
         </w:tc>
@@ -15159,7 +15874,7 @@
               <w:rPr>
                 <w:sz w:val="24"/>
               </w:rPr>
-              <w:t>аналитики, моделисты</w:t>
+              <w:t>финансовые аналитики и консультанты</w:t>
             </w:r>
           </w:p>
         </w:tc>
@@ -15184,6 +15899,7 @@
               <w:rPr>
                 <w:sz w:val="24"/>
               </w:rPr>
+              <w:lastRenderedPageBreak/>
               <w:t>Цена</w:t>
             </w:r>
           </w:p>
@@ -15201,9 +15917,68 @@
             </w:pPr>
             <w:r>
               <w:rPr>
-                <w:sz w:val="24"/>
-              </w:rPr>
-              <w:t>не опубликована (ДОСНЯТЬ)</w:t>
+                <w:i/>
+                <w:sz w:val="24"/>
+              </w:rPr>
+              <w:t>Pro</w:t>
+            </w:r>
+            <w:r>
+              <w:rPr>
+                <w:sz w:val="24"/>
+              </w:rPr>
+              <w:t xml:space="preserve"> 100 </w:t>
+            </w:r>
+            <w:r>
+              <w:rPr>
+                <w:i/>
+                <w:sz w:val="24"/>
+              </w:rPr>
+              <w:t>USD</w:t>
+            </w:r>
+            <w:r>
+              <w:rPr>
+                <w:sz w:val="24"/>
+              </w:rPr>
+              <w:t xml:space="preserve"> в месяц, </w:t>
+            </w:r>
+            <w:r>
+              <w:rPr>
+                <w:i/>
+                <w:sz w:val="24"/>
+              </w:rPr>
+              <w:t>Teams</w:t>
+            </w:r>
+            <w:r>
+              <w:rPr>
+                <w:sz w:val="24"/>
+              </w:rPr>
+              <w:t xml:space="preserve"> 320 </w:t>
+            </w:r>
+            <w:r>
+              <w:rPr>
+                <w:i/>
+                <w:sz w:val="24"/>
+              </w:rPr>
+              <w:t>USD</w:t>
+            </w:r>
+            <w:r>
+              <w:rPr>
+                <w:sz w:val="24"/>
+              </w:rPr>
+              <w:t xml:space="preserve"> + 100 </w:t>
+            </w:r>
+            <w:r>
+              <w:rPr>
+                <w:i/>
+                <w:sz w:val="24"/>
+              </w:rPr>
+              <w:t>USD</w:t>
+            </w:r>
+            <w:r>
+              <w:rPr>
+                <w:sz w:val="24"/>
+              </w:rPr>
+              <w:t xml:space="preserve"> за место [15]</w:t>
             </w:r>
           </w:p>
         </w:tc>
@@ -15247,7 +16022,7 @@
               <w:rPr>
                 <w:sz w:val="24"/>
               </w:rPr>
-              <w:t>17 824 визитов в месяц, мировой ранг 1 588 798</w:t>
+              <w:t>154 111 визитов в месяц, мировой ранг 278 471</w:t>
             </w:r>
           </w:p>
         </w:tc>
@@ -15291,7 +16066,7 @@
               <w:rPr>
                 <w:sz w:val="24"/>
               </w:rPr>
-              <w:t>прямые 39 %, органика 33 %, рефералы 11 %</w:t>
+              <w:t>прямые 56 %, органика 32 %, рефералы 6 %</w:t>
             </w:r>
           </w:p>
         </w:tc>
@@ -15342,33 +16117,33 @@
               <w:rPr>
                 <w:sz w:val="24"/>
               </w:rPr>
-              <w:t xml:space="preserve"> 28 %, </w:t>
+              <w:t xml:space="preserve"> 22 %, </w:t>
             </w:r>
             <w:r>
               <w:rPr>
                 <w:i/>
                 <w:sz w:val="24"/>
               </w:rPr>
-              <w:t>AU</w:t>
-            </w:r>
-            <w:r>
-              <w:rPr>
-                <w:sz w:val="24"/>
-              </w:rPr>
-              <w:t xml:space="preserve"> 22 %, </w:t>
+              <w:t>IN</w:t>
+            </w:r>
+            <w:r>
+              <w:rPr>
+                <w:sz w:val="24"/>
+              </w:rPr>
+              <w:t xml:space="preserve"> 9 %, </w:t>
             </w:r>
             <w:r>
               <w:rPr>
                 <w:i/>
                 <w:sz w:val="24"/>
               </w:rPr>
-              <w:t>JP</w:t>
-            </w:r>
-            <w:r>
-              <w:rPr>
-                <w:sz w:val="24"/>
-              </w:rPr>
-              <w:t xml:space="preserve"> 11 %</w:t>
+              <w:t>BR</w:t>
+            </w:r>
+            <w:r>
+              <w:rPr>
+                <w:sz w:val="24"/>
+              </w:rPr>
+              <w:t xml:space="preserve"> 7 %</w:t>
             </w:r>
           </w:p>
         </w:tc>
@@ -15410,15 +16185,42 @@
             </w:pPr>
             <w:r>
               <w:rPr>
-                <w:sz w:val="24"/>
-              </w:rPr>
-              <w:t>надстройка для навигации и аудита сложных моделей, США 28 % и Австралия</w:t>
-            </w:r>
-            <w:r>
-              <w:rPr>
-                <w:sz w:val="24"/>
-              </w:rPr>
-              <w:t xml:space="preserve"> 22 % трафика</w:t>
+                <w:i/>
+                <w:sz w:val="24"/>
+              </w:rPr>
+              <w:t>AI</w:t>
+            </w:r>
+            <w:r>
+              <w:rPr>
+                <w:sz w:val="24"/>
+              </w:rPr>
+              <w:t xml:space="preserve">-агент в </w:t>
+            </w:r>
+            <w:r>
+              <w:rPr>
+                <w:i/>
+                <w:sz w:val="24"/>
+              </w:rPr>
+              <w:t>Excel</w:t>
+            </w:r>
+            <w:r>
+              <w:rPr>
+                <w:sz w:val="24"/>
+              </w:rPr>
+              <w:t xml:space="preserve"> и </w:t>
+            </w:r>
+            <w:r>
+              <w:rPr>
+                <w:i/>
+                <w:sz w:val="24"/>
+              </w:rPr>
+              <w:t>Sheets</w:t>
+            </w:r>
+            <w:r>
+              <w:rPr>
+                <w:sz w:val="24"/>
+              </w:rPr>
+              <w:t>, высокая доля прямых заходов, большой трафик</w:t>
             </w:r>
           </w:p>
         </w:tc>
@@ -15469,7 +16271,7 @@
               <w:rPr>
                 <w:sz w:val="24"/>
               </w:rPr>
-              <w:t xml:space="preserve">один отзыв на </w:t>
+              <w:t xml:space="preserve">дорогие тарифы, нет карточки на </w:t>
             </w:r>
             <w:r>
               <w:rPr>
@@ -15482,803 +16284,13 @@
               <w:rPr>
                 <w:sz w:val="24"/>
               </w:rPr>
-              <w:t xml:space="preserve"> (4,0), малый трафик; нет облачной проверки и </w:t>
-            </w:r>
-            <w:r>
-              <w:rPr>
-                <w:i/>
-                <w:sz w:val="24"/>
-              </w:rPr>
-              <w:t>AI</w:t>
-            </w:r>
-            <w:r>
-              <w:rPr>
-                <w:sz w:val="24"/>
-              </w:rPr>
-              <w:t>-пояснений</w:t>
-            </w:r>
-          </w:p>
-        </w:tc>
-      </w:tr>
-    </w:tbl>
-    <w:p>
-      <w:pPr>
-        <w:pStyle w:val="FirstParagraph"/>
-        <w:spacing w:before="0" w:after="0" w:line="360" w:lineRule="exact"/>
-        <w:ind w:firstLine="709"/>
-        <w:jc w:val="both"/>
-      </w:pPr>
-      <w:r>
-        <w:rPr>
-          <w:sz w:val="28"/>
-        </w:rPr>
-        <w:t xml:space="preserve">Карточка </w:t>
-      </w:r>
-      <w:r>
-        <w:rPr>
-          <w:i/>
-          <w:sz w:val="28"/>
-        </w:rPr>
-        <w:t>Arixcel</w:t>
-      </w:r>
-      <w:r>
-        <w:rPr>
-          <w:sz w:val="28"/>
-        </w:rPr>
-        <w:t xml:space="preserve"> показывает, что именно он забирает у рынка и где у </w:t>
-      </w:r>
-      <w:r>
-        <w:rPr>
-          <w:i/>
-          <w:sz w:val="28"/>
-        </w:rPr>
-        <w:t>TableMind</w:t>
-      </w:r>
-      <w:r>
-        <w:rPr>
-          <w:sz w:val="28"/>
-        </w:rPr>
-        <w:t xml:space="preserve"> остается место: один отзыв на </w:t>
-      </w:r>
-      <w:r>
-        <w:rPr>
-          <w:i/>
-          <w:sz w:val="28"/>
-        </w:rPr>
-        <w:t>G2</w:t>
-      </w:r>
-      <w:r>
-        <w:rPr>
-          <w:sz w:val="28"/>
-        </w:rPr>
-        <w:t xml:space="preserve"> (4,0), малый трафик; нет облачной проверки и </w:t>
-      </w:r>
-      <w:r>
-        <w:rPr>
-          <w:i/>
-          <w:sz w:val="28"/>
-        </w:rPr>
-        <w:t>AI</w:t>
-      </w:r>
-      <w:r>
-        <w:rPr>
-          <w:sz w:val="28"/>
-        </w:rPr>
-        <w:t>-пояснений.</w:t>
-      </w:r>
-    </w:p>
-    <w:p>
-      <w:pPr>
-        <w:pStyle w:val="a0"/>
-        <w:spacing w:before="0" w:after="0" w:line="360" w:lineRule="exact"/>
-        <w:ind w:firstLine="709"/>
-        <w:jc w:val="both"/>
-      </w:pPr>
-      <w:r>
-        <w:rPr>
-          <w:sz w:val="28"/>
-        </w:rPr>
-        <w:t xml:space="preserve">В таблице 14 представлено: карточка конкурента </w:t>
-      </w:r>
-      <w:r>
-        <w:rPr>
-          <w:i/>
-          <w:sz w:val="28"/>
-        </w:rPr>
-        <w:t>Shortcut</w:t>
-      </w:r>
-      <w:r>
-        <w:rPr>
-          <w:sz w:val="28"/>
-        </w:rPr>
-        <w:t>.</w:t>
-      </w:r>
-    </w:p>
-    <w:p>
-      <w:pPr>
-        <w:pStyle w:val="a0"/>
-        <w:keepNext/>
-        <w:spacing w:before="0" w:after="0" w:line="360" w:lineRule="exact"/>
-      </w:pPr>
-      <w:r>
-        <w:rPr>
-          <w:sz w:val="28"/>
-        </w:rPr>
-        <w:t xml:space="preserve">Таблица 14 – Карточка конкурента </w:t>
-      </w:r>
-      <w:r>
-        <w:rPr>
-          <w:i/>
-          <w:sz w:val="28"/>
-        </w:rPr>
-        <w:t>Shortcut</w:t>
-      </w:r>
-    </w:p>
-    <w:tbl>
-      <w:tblPr>
-        <w:tblStyle w:val="Table"/>
-        <w:tblW w:w="9355" w:type="dxa"/>
-        <w:jc w:val="center"/>
-        <w:tblBorders>
-          <w:top w:val="single" w:sz="4" w:space="0" w:color="000000"/>
-          <w:left w:val="single" w:sz="4" w:space="0" w:color="000000"/>
-          <w:bottom w:val="single" w:sz="4" w:space="0" w:color="000000"/>
-          <w:right w:val="single" w:sz="4" w:space="0" w:color="000000"/>
-          <w:insideH w:val="single" w:sz="4" w:space="0" w:color="000000"/>
-          <w:insideV w:val="single" w:sz="4" w:space="0" w:color="000000"/>
-        </w:tblBorders>
-        <w:tblLayout w:type="fixed"/>
-        <w:tblLook w:val="0020" w:firstRow="1" w:lastRow="0" w:firstColumn="0" w:lastColumn="0" w:noHBand="0" w:noVBand="0"/>
-      </w:tblPr>
-      <w:tblGrid>
-        <w:gridCol w:w="4022"/>
-        <w:gridCol w:w="5333"/>
-      </w:tblGrid>
-      <w:tr>
-        <w:trPr>
-          <w:cnfStyle w:val="100000000000" w:firstRow="1" w:lastRow="0" w:firstColumn="0" w:lastColumn="0" w:oddVBand="0" w:evenVBand="0" w:oddHBand="0" w:evenHBand="0" w:firstRowFirstColumn="0" w:firstRowLastColumn="0" w:lastRowFirstColumn="0" w:lastRowLastColumn="0"/>
-          <w:cantSplit/>
-          <w:tblHeader/>
-          <w:jc w:val="center"/>
-        </w:trPr>
-        <w:tc>
-          <w:tcPr>
-            <w:tcW w:w="4022" w:type="dxa"/>
-            <w:vAlign w:val="center"/>
-          </w:tcPr>
-          <w:p>
-            <w:pPr>
-              <w:pStyle w:val="Compact"/>
-              <w:spacing w:before="0" w:after="0" w:line="280" w:lineRule="exact"/>
-              <w:jc w:val="center"/>
-            </w:pPr>
-            <w:r>
-              <w:rPr>
-                <w:b/>
-                <w:sz w:val="24"/>
-              </w:rPr>
-              <w:t>Поле</w:t>
-            </w:r>
-          </w:p>
-        </w:tc>
-        <w:tc>
-          <w:tcPr>
-            <w:tcW w:w="5333" w:type="dxa"/>
-            <w:vAlign w:val="center"/>
-          </w:tcPr>
-          <w:p>
-            <w:pPr>
-              <w:pStyle w:val="Compact"/>
-              <w:spacing w:before="0" w:after="0" w:line="280" w:lineRule="exact"/>
-              <w:jc w:val="center"/>
-            </w:pPr>
-            <w:r>
-              <w:rPr>
-                <w:b/>
-                <w:sz w:val="24"/>
-              </w:rPr>
-              <w:t>Содержание</w:t>
-            </w:r>
-          </w:p>
-        </w:tc>
-      </w:tr>
-      <w:tr>
-        <w:trPr>
-          <w:cantSplit/>
-          <w:jc w:val="center"/>
-        </w:trPr>
-        <w:tc>
-          <w:tcPr>
-            <w:tcW w:w="4022" w:type="dxa"/>
-            <w:vAlign w:val="center"/>
-          </w:tcPr>
-          <w:p>
-            <w:pPr>
-              <w:pStyle w:val="Compact"/>
-              <w:spacing w:before="0" w:after="0" w:line="280" w:lineRule="exact"/>
-              <w:jc w:val="center"/>
-            </w:pPr>
-            <w:r>
-              <w:rPr>
-                <w:sz w:val="24"/>
-              </w:rPr>
-              <w:t>Домен</w:t>
-            </w:r>
-          </w:p>
-        </w:tc>
-        <w:tc>
-          <w:tcPr>
-            <w:tcW w:w="5333" w:type="dxa"/>
-            <w:vAlign w:val="center"/>
-          </w:tcPr>
-          <w:p>
-            <w:pPr>
-              <w:pStyle w:val="Compact"/>
-              <w:spacing w:before="0" w:after="0" w:line="280" w:lineRule="exact"/>
-              <w:jc w:val="center"/>
-            </w:pPr>
-            <w:r>
-              <w:rPr>
-                <w:i/>
-                <w:sz w:val="24"/>
-              </w:rPr>
-              <w:t>shortcut.ai</w:t>
-            </w:r>
-          </w:p>
-        </w:tc>
-      </w:tr>
-      <w:tr>
-        <w:trPr>
-          <w:cantSplit/>
-          <w:jc w:val="center"/>
-        </w:trPr>
-        <w:tc>
-          <w:tcPr>
-            <w:tcW w:w="4022" w:type="dxa"/>
-            <w:vAlign w:val="center"/>
-          </w:tcPr>
-          <w:p>
-            <w:pPr>
-              <w:pStyle w:val="Compact"/>
-              <w:spacing w:before="0" w:after="0" w:line="280" w:lineRule="exact"/>
-              <w:jc w:val="center"/>
-            </w:pPr>
-            <w:r>
-              <w:rPr>
-                <w:sz w:val="24"/>
-              </w:rPr>
-              <w:t>Класс</w:t>
-            </w:r>
-          </w:p>
-        </w:tc>
-        <w:tc>
-          <w:tcPr>
-            <w:tcW w:w="5333" w:type="dxa"/>
-            <w:vAlign w:val="center"/>
-          </w:tcPr>
-          <w:p>
-            <w:pPr>
-              <w:pStyle w:val="Compact"/>
-              <w:spacing w:before="0" w:after="0" w:line="280" w:lineRule="exact"/>
-              <w:jc w:val="center"/>
-            </w:pPr>
-            <w:r>
-              <w:rPr>
-                <w:sz w:val="24"/>
-              </w:rPr>
-              <w:t>частичный</w:t>
-            </w:r>
-          </w:p>
-        </w:tc>
-      </w:tr>
-      <w:tr>
-        <w:trPr>
-          <w:cantSplit/>
-          <w:jc w:val="center"/>
-        </w:trPr>
-        <w:tc>
-          <w:tcPr>
-            <w:tcW w:w="4022" w:type="dxa"/>
-            <w:vAlign w:val="center"/>
-          </w:tcPr>
-          <w:p>
-            <w:pPr>
-              <w:pStyle w:val="Compact"/>
-              <w:spacing w:before="0" w:after="0" w:line="280" w:lineRule="exact"/>
-              <w:jc w:val="center"/>
-            </w:pPr>
-            <w:r>
-              <w:rPr>
-                <w:sz w:val="24"/>
-              </w:rPr>
-              <w:t>Продукт</w:t>
-            </w:r>
-          </w:p>
-        </w:tc>
-        <w:tc>
-          <w:tcPr>
-            <w:tcW w:w="5333" w:type="dxa"/>
-            <w:vAlign w:val="center"/>
-          </w:tcPr>
-          <w:p>
-            <w:pPr>
-              <w:pStyle w:val="Compact"/>
-              <w:spacing w:before="0" w:after="0" w:line="280" w:lineRule="exact"/>
-              <w:jc w:val="center"/>
-            </w:pPr>
-            <w:r>
-              <w:rPr>
-                <w:i/>
-                <w:sz w:val="24"/>
-              </w:rPr>
-              <w:t>AI</w:t>
-            </w:r>
-            <w:r>
-              <w:rPr>
-                <w:sz w:val="24"/>
-              </w:rPr>
-              <w:t>-агент, создающий и правящий таблицы</w:t>
-            </w:r>
-          </w:p>
-        </w:tc>
-      </w:tr>
-      <w:tr>
-        <w:trPr>
-          <w:cantSplit/>
-          <w:jc w:val="center"/>
-        </w:trPr>
-        <w:tc>
-          <w:tcPr>
-            <w:tcW w:w="4022" w:type="dxa"/>
-            <w:vAlign w:val="center"/>
-          </w:tcPr>
-          <w:p>
-            <w:pPr>
-              <w:pStyle w:val="Compact"/>
-              <w:spacing w:before="0" w:after="0" w:line="280" w:lineRule="exact"/>
-              <w:jc w:val="center"/>
-            </w:pPr>
-            <w:r>
-              <w:rPr>
-                <w:sz w:val="24"/>
-              </w:rPr>
-              <w:t>Целевая аудитория</w:t>
-            </w:r>
-          </w:p>
-        </w:tc>
-        <w:tc>
-          <w:tcPr>
-            <w:tcW w:w="5333" w:type="dxa"/>
-            <w:vAlign w:val="center"/>
-          </w:tcPr>
-          <w:p>
-            <w:pPr>
-              <w:pStyle w:val="Compact"/>
-              <w:spacing w:before="0" w:after="0" w:line="280" w:lineRule="exact"/>
-              <w:jc w:val="center"/>
-            </w:pPr>
-            <w:r>
-              <w:rPr>
-                <w:sz w:val="24"/>
-              </w:rPr>
-              <w:t>финансовые аналитики и консультанты</w:t>
-            </w:r>
-          </w:p>
-        </w:tc>
-      </w:tr>
-      <w:tr>
-        <w:trPr>
-          <w:cantSplit/>
-          <w:jc w:val="center"/>
-        </w:trPr>
-        <w:tc>
-          <w:tcPr>
-            <w:tcW w:w="4022" w:type="dxa"/>
-            <w:vAlign w:val="center"/>
-          </w:tcPr>
-          <w:p>
-            <w:pPr>
-              <w:pStyle w:val="Compact"/>
-              <w:spacing w:before="0" w:after="0" w:line="280" w:lineRule="exact"/>
-              <w:jc w:val="center"/>
-            </w:pPr>
-            <w:r>
-              <w:rPr>
-                <w:sz w:val="24"/>
-              </w:rPr>
-              <w:lastRenderedPageBreak/>
-              <w:t>Цена</w:t>
-            </w:r>
-          </w:p>
-        </w:tc>
-        <w:tc>
-          <w:tcPr>
-            <w:tcW w:w="5333" w:type="dxa"/>
-            <w:vAlign w:val="center"/>
-          </w:tcPr>
-          <w:p>
-            <w:pPr>
-              <w:pStyle w:val="Compact"/>
-              <w:spacing w:before="0" w:after="0" w:line="280" w:lineRule="exact"/>
-              <w:jc w:val="center"/>
-            </w:pPr>
-            <w:r>
-              <w:rPr>
-                <w:i/>
-                <w:sz w:val="24"/>
-              </w:rPr>
-              <w:t>Pro</w:t>
-            </w:r>
-            <w:r>
-              <w:rPr>
-                <w:sz w:val="24"/>
-              </w:rPr>
-              <w:t xml:space="preserve"> 100 </w:t>
-            </w:r>
-            <w:r>
-              <w:rPr>
-                <w:i/>
-                <w:sz w:val="24"/>
-              </w:rPr>
-              <w:t>USD</w:t>
-            </w:r>
-            <w:r>
-              <w:rPr>
-                <w:sz w:val="24"/>
-              </w:rPr>
-              <w:t xml:space="preserve"> в месяц, </w:t>
-            </w:r>
-            <w:r>
-              <w:rPr>
-                <w:i/>
-                <w:sz w:val="24"/>
-              </w:rPr>
-              <w:t>Teams</w:t>
-            </w:r>
-            <w:r>
-              <w:rPr>
-                <w:sz w:val="24"/>
-              </w:rPr>
-              <w:t xml:space="preserve"> 320 </w:t>
-            </w:r>
-            <w:r>
-              <w:rPr>
-                <w:i/>
-                <w:sz w:val="24"/>
-              </w:rPr>
-              <w:t>USD</w:t>
-            </w:r>
-            <w:r>
-              <w:rPr>
-                <w:sz w:val="24"/>
-              </w:rPr>
-              <w:t xml:space="preserve"> + 100 </w:t>
-            </w:r>
-            <w:r>
-              <w:rPr>
-                <w:i/>
-                <w:sz w:val="24"/>
-              </w:rPr>
-              <w:t>USD</w:t>
-            </w:r>
-            <w:r>
-              <w:rPr>
-                <w:sz w:val="24"/>
-              </w:rPr>
-              <w:t xml:space="preserve"> за место [15]</w:t>
-            </w:r>
-          </w:p>
-        </w:tc>
-      </w:tr>
-      <w:tr>
-        <w:trPr>
-          <w:cantSplit/>
-          <w:jc w:val="center"/>
-        </w:trPr>
-        <w:tc>
-          <w:tcPr>
-            <w:tcW w:w="4022" w:type="dxa"/>
-            <w:vAlign w:val="center"/>
-          </w:tcPr>
-          <w:p>
-            <w:pPr>
-              <w:pStyle w:val="Compact"/>
-              <w:spacing w:before="0" w:after="0" w:line="280" w:lineRule="exact"/>
-              <w:jc w:val="center"/>
-            </w:pPr>
-            <w:r>
-              <w:rPr>
-                <w:sz w:val="24"/>
-              </w:rPr>
-              <w:t>Трафик</w:t>
-            </w:r>
-          </w:p>
-        </w:tc>
-        <w:tc>
-          <w:tcPr>
-            <w:tcW w:w="5333" w:type="dxa"/>
-            <w:vAlign w:val="center"/>
-          </w:tcPr>
-          <w:p>
-            <w:pPr>
-              <w:pStyle w:val="Compact"/>
-              <w:spacing w:before="0" w:after="0" w:line="280" w:lineRule="exact"/>
-              <w:jc w:val="center"/>
-            </w:pPr>
-            <w:r>
-              <w:rPr>
-                <w:sz w:val="24"/>
-              </w:rPr>
-              <w:t>154 111 визитов в месяц, мировой ранг 278 471</w:t>
-            </w:r>
-          </w:p>
-        </w:tc>
-      </w:tr>
-      <w:tr>
-        <w:trPr>
-          <w:cantSplit/>
-          <w:jc w:val="center"/>
-        </w:trPr>
-        <w:tc>
-          <w:tcPr>
-            <w:tcW w:w="4022" w:type="dxa"/>
-            <w:vAlign w:val="center"/>
-          </w:tcPr>
-          <w:p>
-            <w:pPr>
-              <w:pStyle w:val="Compact"/>
-              <w:spacing w:before="0" w:after="0" w:line="280" w:lineRule="exact"/>
-              <w:jc w:val="center"/>
-            </w:pPr>
-            <w:r>
-              <w:rPr>
-                <w:sz w:val="24"/>
-              </w:rPr>
-              <w:t>Каналы</w:t>
-            </w:r>
-          </w:p>
-        </w:tc>
-        <w:tc>
-          <w:tcPr>
-            <w:tcW w:w="5333" w:type="dxa"/>
-            <w:vAlign w:val="center"/>
-          </w:tcPr>
-          <w:p>
-            <w:pPr>
-              <w:pStyle w:val="Compact"/>
-              <w:spacing w:before="0" w:after="0" w:line="280" w:lineRule="exact"/>
-              <w:jc w:val="center"/>
-            </w:pPr>
-            <w:r>
-              <w:rPr>
-                <w:sz w:val="24"/>
-              </w:rPr>
-              <w:t>прямые 56 %, органика 32 %, рефералы 6 %</w:t>
-            </w:r>
-          </w:p>
-        </w:tc>
-      </w:tr>
-      <w:tr>
-        <w:trPr>
-          <w:cantSplit/>
-          <w:jc w:val="center"/>
-        </w:trPr>
-        <w:tc>
-          <w:tcPr>
-            <w:tcW w:w="4022" w:type="dxa"/>
-            <w:vAlign w:val="center"/>
-          </w:tcPr>
-          <w:p>
-            <w:pPr>
-              <w:pStyle w:val="Compact"/>
-              <w:spacing w:before="0" w:after="0" w:line="280" w:lineRule="exact"/>
-              <w:jc w:val="center"/>
-            </w:pPr>
-            <w:r>
-              <w:rPr>
-                <w:sz w:val="24"/>
-              </w:rPr>
-              <w:t>География</w:t>
-            </w:r>
-          </w:p>
-        </w:tc>
-        <w:tc>
-          <w:tcPr>
-            <w:tcW w:w="5333" w:type="dxa"/>
-            <w:vAlign w:val="center"/>
-          </w:tcPr>
-          <w:p>
-            <w:pPr>
-              <w:pStyle w:val="Compact"/>
-              <w:spacing w:before="0" w:after="0" w:line="280" w:lineRule="exact"/>
-              <w:jc w:val="center"/>
-            </w:pPr>
-            <w:r>
-              <w:rPr>
-                <w:i/>
-                <w:sz w:val="24"/>
-              </w:rPr>
-              <w:t>US</w:t>
-            </w:r>
-            <w:r>
-              <w:rPr>
-                <w:sz w:val="24"/>
-              </w:rPr>
-              <w:t xml:space="preserve"> 22 %, </w:t>
-            </w:r>
-            <w:r>
-              <w:rPr>
-                <w:i/>
-                <w:sz w:val="24"/>
-              </w:rPr>
-              <w:t>IN</w:t>
-            </w:r>
-            <w:r>
-              <w:rPr>
-                <w:sz w:val="24"/>
-              </w:rPr>
-              <w:t xml:space="preserve"> 9 %, </w:t>
-            </w:r>
-            <w:r>
-              <w:rPr>
-                <w:i/>
-                <w:sz w:val="24"/>
-              </w:rPr>
-              <w:t>BR</w:t>
-            </w:r>
-            <w:r>
-              <w:rPr>
-                <w:sz w:val="24"/>
-              </w:rPr>
-              <w:t xml:space="preserve"> 7 %</w:t>
-            </w:r>
-          </w:p>
-        </w:tc>
-      </w:tr>
-      <w:tr>
-        <w:trPr>
-          <w:cantSplit/>
-          <w:jc w:val="center"/>
-        </w:trPr>
-        <w:tc>
-          <w:tcPr>
-            <w:tcW w:w="4022" w:type="dxa"/>
-            <w:vAlign w:val="center"/>
-          </w:tcPr>
-          <w:p>
-            <w:pPr>
-              <w:pStyle w:val="Compact"/>
-              <w:spacing w:before="0" w:after="0" w:line="280" w:lineRule="exact"/>
-              <w:jc w:val="center"/>
-            </w:pPr>
-            <w:r>
-              <w:rPr>
-                <w:sz w:val="24"/>
-              </w:rPr>
-              <w:t>Сильные стороны</w:t>
-            </w:r>
-          </w:p>
-        </w:tc>
-        <w:tc>
-          <w:tcPr>
-            <w:tcW w:w="5333" w:type="dxa"/>
-            <w:vAlign w:val="center"/>
-          </w:tcPr>
-          <w:p>
-            <w:pPr>
-              <w:pStyle w:val="Compact"/>
-              <w:spacing w:before="0" w:after="0" w:line="280" w:lineRule="exact"/>
-              <w:jc w:val="center"/>
-            </w:pPr>
-            <w:r>
-              <w:rPr>
-                <w:i/>
-                <w:sz w:val="24"/>
-              </w:rPr>
-              <w:t>AI</w:t>
-            </w:r>
-            <w:r>
-              <w:rPr>
-                <w:sz w:val="24"/>
-              </w:rPr>
-              <w:t xml:space="preserve">-агент в </w:t>
-            </w:r>
-            <w:r>
-              <w:rPr>
-                <w:i/>
-                <w:sz w:val="24"/>
-              </w:rPr>
-              <w:t>Excel</w:t>
-            </w:r>
-            <w:r>
-              <w:rPr>
-                <w:sz w:val="24"/>
-              </w:rPr>
-              <w:t xml:space="preserve"> и </w:t>
-            </w:r>
-            <w:r>
-              <w:rPr>
-                <w:i/>
-                <w:sz w:val="24"/>
-              </w:rPr>
-              <w:t>Sheets</w:t>
-            </w:r>
-            <w:r>
-              <w:rPr>
-                <w:sz w:val="24"/>
-              </w:rPr>
-              <w:t>, высокая доля прямых заходов, большой трафик</w:t>
-            </w:r>
-          </w:p>
-        </w:tc>
-      </w:tr>
-      <w:tr>
-        <w:trPr>
-          <w:cantSplit/>
-          <w:jc w:val="center"/>
-        </w:trPr>
-        <w:tc>
-          <w:tcPr>
-            <w:tcW w:w="4022" w:type="dxa"/>
-            <w:vAlign w:val="center"/>
-          </w:tcPr>
-          <w:p>
-            <w:pPr>
-              <w:pStyle w:val="Compact"/>
-              <w:spacing w:before="0" w:after="0" w:line="280" w:lineRule="exact"/>
-              <w:jc w:val="center"/>
-            </w:pPr>
-            <w:r>
-              <w:rPr>
-                <w:sz w:val="24"/>
-              </w:rPr>
-              <w:t xml:space="preserve">Слабые стороны и возможность для </w:t>
-            </w:r>
-            <w:r>
-              <w:rPr>
-                <w:i/>
-                <w:sz w:val="24"/>
-              </w:rPr>
-              <w:t>Tabl</w:t>
-            </w:r>
-            <w:r>
-              <w:rPr>
-                <w:i/>
-                <w:sz w:val="24"/>
-              </w:rPr>
-              <w:t>eMind</w:t>
-            </w:r>
-          </w:p>
-        </w:tc>
-        <w:tc>
-          <w:tcPr>
-            <w:tcW w:w="5333" w:type="dxa"/>
-            <w:vAlign w:val="center"/>
-          </w:tcPr>
-          <w:p>
-            <w:pPr>
-              <w:pStyle w:val="Compact"/>
-              <w:spacing w:before="0" w:after="0" w:line="280" w:lineRule="exact"/>
-              <w:jc w:val="center"/>
-            </w:pPr>
-            <w:r>
-              <w:rPr>
-                <w:sz w:val="24"/>
-              </w:rPr>
-              <w:t xml:space="preserve">дорогие тарифы, нет карточки на </w:t>
-            </w:r>
-            <w:r>
-              <w:rPr>
-                <w:i/>
-                <w:sz w:val="24"/>
-              </w:rPr>
-              <w:t>G2</w:t>
-            </w:r>
-            <w:r>
-              <w:rPr>
-                <w:sz w:val="24"/>
-              </w:rPr>
-              <w:t>, результат требует проверки: пространство для независимой проверки</w:t>
+              <w:t xml:space="preserve">, результат требует проверки: пространство для </w:t>
+            </w:r>
+            <w:r>
+              <w:rPr>
+                <w:sz w:val="24"/>
+              </w:rPr>
+              <w:t>независимой проверки</w:t>
             </w:r>
           </w:p>
         </w:tc>
@@ -16682,7 +16694,20 @@
               <w:rPr>
                 <w:sz w:val="24"/>
               </w:rPr>
-              <w:t>по запросу (ДОСНЯТЬ)</w:t>
+              <w:t>по запросу; оценки третьих сторон от 24 000 </w:t>
+            </w:r>
+            <w:r>
+              <w:rPr>
+                <w:i/>
+                <w:sz w:val="24"/>
+              </w:rPr>
+              <w:t>USD</w:t>
+            </w:r>
+            <w:r>
+              <w:rPr>
+                <w:sz w:val="24"/>
+              </w:rPr>
+              <w:t xml:space="preserve"> в год (ЛР2-3, приложение Д, надежность низкая)</w:t>
             </w:r>
           </w:p>
         </w:tc>
@@ -16891,13 +16916,13 @@
               <w:rPr>
                 <w:sz w:val="24"/>
               </w:rPr>
-              <w:t>386 отзывов</w:t>
-            </w:r>
-            <w:r>
-              <w:rPr>
-                <w:sz w:val="24"/>
-              </w:rPr>
-              <w:t xml:space="preserve"> на </w:t>
+              <w:t>386 от</w:t>
+            </w:r>
+            <w:r>
+              <w:rPr>
+                <w:sz w:val="24"/>
+              </w:rPr>
+              <w:t xml:space="preserve">зывов на </w:t>
             </w:r>
             <w:r>
               <w:rPr>
@@ -17377,7 +17402,33 @@
               <w:rPr>
                 <w:sz w:val="24"/>
               </w:rPr>
-              <w:t>не опубликована (ДОСНЯТЬ)</w:t>
+              <w:t xml:space="preserve">пакет </w:t>
+            </w:r>
+            <w:r>
+              <w:rPr>
+                <w:i/>
+                <w:sz w:val="24"/>
+              </w:rPr>
+              <w:t>OAK</w:t>
+            </w:r>
+            <w:r>
+              <w:rPr>
+                <w:sz w:val="24"/>
+              </w:rPr>
+              <w:t xml:space="preserve"> 311,66 </w:t>
+            </w:r>
+            <w:r>
+              <w:rPr>
+                <w:i/>
+                <w:sz w:val="24"/>
+              </w:rPr>
+              <w:t>GBP</w:t>
+            </w:r>
+            <w:r>
+              <w:rPr>
+                <w:sz w:val="24"/>
+              </w:rPr>
+              <w:t xml:space="preserve"> в год по странице производителя (ЛР2-3, приложение Д)</w:t>
             </w:r>
           </w:p>
         </w:tc>
@@ -17567,6 +17618,7 @@
               <w:rPr>
                 <w:sz w:val="24"/>
               </w:rPr>
+              <w:lastRenderedPageBreak/>
               <w:t>Сильные стороны</w:t>
             </w:r>
           </w:p>
@@ -17586,13 +17638,7 @@
               <w:rPr>
                 <w:sz w:val="24"/>
               </w:rPr>
-              <w:t>узнаваемая консал</w:t>
-            </w:r>
-            <w:r>
-              <w:rPr>
-                <w:sz w:val="24"/>
-              </w:rPr>
-              <w:t>тинговая марка в Великобритании (59 % трафика), услуги аудита моделей</w:t>
+              <w:t>узнаваемая консалтинговая марка в Великобритании (59 % трафика), услуги аудита моделей</w:t>
             </w:r>
           </w:p>
         </w:tc>
@@ -17617,7 +17663,6 @@
               <w:rPr>
                 <w:sz w:val="24"/>
               </w:rPr>
-              <w:lastRenderedPageBreak/>
               <w:t xml:space="preserve">Слабые стороны и возможность для </w:t>
             </w:r>
             <w:r>
@@ -17644,7 +17689,13 @@
               <w:rPr>
                 <w:sz w:val="24"/>
               </w:rPr>
-              <w:t>малый трафик (14,7 тыс. визитов), отказов 69 %; продает услугу, а не самообслуживаемый сервис</w:t>
+              <w:t xml:space="preserve">малый трафик (14,7 тыс. визитов), отказов 69 %; продает услугу, а не </w:t>
+            </w:r>
+            <w:r>
+              <w:rPr>
+                <w:sz w:val="24"/>
+              </w:rPr>
+              <w:t>самообслуживаемый сервис</w:t>
             </w:r>
           </w:p>
         </w:tc>
@@ -17697,14 +17748,21 @@
         <w:ind w:firstLine="709"/>
       </w:pPr>
       <w:bookmarkStart w:id="22" w:name="_bd0f162afc2e7ad7347811c158aa5f062feeff4"/>
-      <w:bookmarkStart w:id="23" w:name="_Toc241952866"/>
+      <w:bookmarkStart w:id="23" w:name="_Toc241955018"/>
       <w:bookmarkEnd w:id="20"/>
       <w:r>
         <w:rPr>
           <w:b/>
           <w:sz w:val="28"/>
         </w:rPr>
-        <w:t>2.10 Вывод о привлекательности рынка и стратегия входа</w:t>
+        <w:t>2.10 Вывод о привлекательности рынка и стр</w:t>
+      </w:r>
+      <w:r>
+        <w:rPr>
+          <w:b/>
+          <w:sz w:val="28"/>
+        </w:rPr>
+        <w:t>атегия входа</w:t>
       </w:r>
       <w:bookmarkEnd w:id="23"/>
     </w:p>
@@ -17732,13 +17790,7 @@
         <w:rPr>
           <w:sz w:val="28"/>
         </w:rPr>
-        <w:t>-</w:t>
-      </w:r>
-      <w:r>
-        <w:rPr>
-          <w:sz w:val="28"/>
-        </w:rPr>
-        <w:t>моделей умеренно привлекателен: потенциал достаточен (</w:t>
+        <w:t>-моделей умеренно привлекателен: потенциал достаточен (</w:t>
       </w:r>
       <w:r>
         <w:rPr>
@@ -17777,13 +17829,7 @@
         <w:rPr>
           <w:sz w:val="28"/>
         </w:rPr>
-        <w:t xml:space="preserve">-помощники </w:t>
-      </w:r>
-      <w:r>
-        <w:rPr>
-          <w:sz w:val="28"/>
-        </w:rPr>
-        <w:t xml:space="preserve">и встроенные инструменты </w:t>
+        <w:t xml:space="preserve">-помощники и встроенные инструменты </w:t>
       </w:r>
       <w:r>
         <w:rPr>
@@ -17796,7 +17842,13 @@
         <w:rPr>
           <w:sz w:val="28"/>
         </w:rPr>
-        <w:t>), чувствительность покупателей к цене и низкий порог входа для новых игроков. Среднее давление пяти сил 3,55 из 5, индекс барьеров входа 3,15.</w:t>
+        <w:t>), чувствительность покупателей к цене и</w:t>
+      </w:r>
+      <w:r>
+        <w:rPr>
+          <w:sz w:val="28"/>
+        </w:rPr>
+        <w:t xml:space="preserve"> низкий порог входа для новых игроков. Среднее давление пяти сил 3,55 из 5, индекс барьеров входа 3,15.</w:t>
       </w:r>
     </w:p>
     <w:p>
@@ -17910,7 +17962,14 @@
                 <w:b/>
                 <w:sz w:val="24"/>
               </w:rPr>
-              <w:t xml:space="preserve">Рекомендуемая стратегия </w:t>
+              <w:t>Рекомендуемая стратег</w:t>
+            </w:r>
+            <w:r>
+              <w:rPr>
+                <w:b/>
+                <w:sz w:val="24"/>
+              </w:rPr>
+              <w:t xml:space="preserve">ия </w:t>
             </w:r>
             <w:r>
               <w:rPr>
@@ -18057,7 +18116,13 @@
               <w:rPr>
                 <w:sz w:val="24"/>
               </w:rPr>
-              <w:t xml:space="preserve">Проверить стоимость клика и конверсии на </w:t>
+              <w:t>Стоимость клика взята из модельных показателей (приложение Д, Д-33); проверить стоимость клика и</w:t>
+            </w:r>
+            <w:r>
+              <w:rPr>
+                <w:sz w:val="24"/>
+              </w:rPr>
+              <w:t xml:space="preserve"> конверсии на </w:t>
             </w:r>
             <w:r>
               <w:rPr>
@@ -18070,13 +18135,7 @@
               <w:rPr>
                 <w:sz w:val="24"/>
               </w:rPr>
-              <w:t xml:space="preserve"> (ДОСНЯТЬ), использова</w:t>
-            </w:r>
-            <w:r>
-              <w:rPr>
-                <w:sz w:val="24"/>
-              </w:rPr>
-              <w:t>ть тестовые кампании</w:t>
+              <w:t xml:space="preserve"> тестовыми кампаниями</w:t>
             </w:r>
           </w:p>
         </w:tc>
@@ -18291,21 +18350,20 @@
               <w:rPr>
                 <w:sz w:val="24"/>
               </w:rPr>
-              <w:t xml:space="preserve">-результатов: доказательство, отчет, воспроизводимость; интеграция с </w:t>
+              <w:t>-результатов: доказательство, от</w:t>
+            </w:r>
+            <w:r>
+              <w:rPr>
+                <w:sz w:val="24"/>
+              </w:rPr>
+              <w:t xml:space="preserve">чет, воспроизводимость; интеграция с </w:t>
             </w:r>
             <w:r>
               <w:rPr>
                 <w:i/>
                 <w:sz w:val="24"/>
               </w:rPr>
-              <w:t>Co</w:t>
-            </w:r>
-            <w:r>
-              <w:rPr>
-                <w:i/>
-                <w:sz w:val="24"/>
-              </w:rPr>
-              <w:t>pilot</w:t>
+              <w:t>Copilot</w:t>
             </w:r>
             <w:r>
               <w:rPr>
@@ -18424,6 +18482,7 @@
         <w:rPr>
           <w:sz w:val="28"/>
         </w:rPr>
+        <w:lastRenderedPageBreak/>
         <w:t xml:space="preserve">Стратегия входа сводится к узкому позиционированию «независимая проверка и доказательство» для финансовых специалистов, входу через поиск, </w:t>
       </w:r>
       <w:r>
@@ -18437,14 +18496,7 @@
         <w:rPr>
           <w:sz w:val="28"/>
         </w:rPr>
-        <w:t xml:space="preserve"> и партнеров и ранней работе с отзывами. Эти выводы </w:t>
-      </w:r>
-      <w:r>
-        <w:rPr>
-          <w:sz w:val="28"/>
-        </w:rPr>
-        <w:lastRenderedPageBreak/>
-        <w:t>переходят в ЛР5 (анализ конкурентов и стандарт товара) и</w:t>
+        <w:t xml:space="preserve"> и партнеров и ранней работе с отзывами. Эти выводы переходят в ЛР5 (анализ конкурентов и стандарт товара) и</w:t>
       </w:r>
       <w:r>
         <w:rPr>
@@ -18460,7 +18512,7 @@
         <w:ind w:firstLine="709"/>
       </w:pPr>
       <w:bookmarkStart w:id="24" w:name="_07f39535de8dfb555f41c49666d7d7ad4469d72"/>
-      <w:bookmarkStart w:id="25" w:name="_Toc241952867"/>
+      <w:bookmarkStart w:id="25" w:name="_Toc241955019"/>
       <w:bookmarkEnd w:id="22"/>
       <w:r>
         <w:rPr>
@@ -18534,13 +18586,13 @@
         <w:rPr>
           <w:sz w:val="28"/>
         </w:rPr>
-        <w:t xml:space="preserve">, взвешенные доли каналов, индекс доверия, индекс ресурсной силы, доля </w:t>
-      </w:r>
-      <w:r>
-        <w:rPr>
-          <w:sz w:val="28"/>
-        </w:rPr>
-        <w:t>заменителей, итоговый индекс барьеров, суммы баллов шаблона Портера. Из 19 контрольных величин расхождений выше допуска нет (19 из 19); допуск 1</w:t>
+        <w:t>, взвешенные доли каналов, индекс доверия, индекс ресурсной силы, доля замен</w:t>
+      </w:r>
+      <w:r>
+        <w:rPr>
+          <w:sz w:val="28"/>
+        </w:rPr>
+        <w:t>ителей, итоговый индекс барьеров, суммы баллов шаблона Портера. Из 19 контрольных величин расхождений выше допуска нет (19 из 19); допуск 1</w:t>
       </w:r>
       <w:r>
         <w:rPr>
@@ -18566,13 +18618,13 @@
         <w:rPr>
           <w:sz w:val="28"/>
         </w:rPr>
-        <w:t xml:space="preserve"> для величин, в которые входят округленные коэффициенты. Ошибок формул в кни</w:t>
-      </w:r>
-      <w:r>
-        <w:rPr>
-          <w:sz w:val="28"/>
-        </w:rPr>
-        <w:t>гах нет.</w:t>
+        <w:t xml:space="preserve"> для величин, в которые входят округленные коэффициенты. Ошибок формул в книгах н</w:t>
+      </w:r>
+      <w:r>
+        <w:rPr>
+          <w:sz w:val="28"/>
+        </w:rPr>
+        <w:t>ет.</w:t>
       </w:r>
     </w:p>
     <w:p>
@@ -19573,7 +19625,7 @@
         <w:ind w:firstLine="709"/>
       </w:pPr>
       <w:bookmarkStart w:id="26" w:name="_ограничения"/>
-      <w:bookmarkStart w:id="27" w:name="_Toc241952868"/>
+      <w:bookmarkStart w:id="27" w:name="_Toc241955020"/>
       <w:bookmarkEnd w:id="24"/>
       <w:r>
         <w:rPr>
@@ -19608,7 +19660,14 @@
         <w:rPr>
           <w:sz w:val="28"/>
         </w:rPr>
-        <w:t xml:space="preserve"> приблизительны, особенно для малых сайтов; география взята по пяти крупнейшим странам, поэтому доля целевых стран занижена; данные о стоимост</w:t>
+        <w:t xml:space="preserve"> приблизительны, особенно для малых сайтов; география взята по пяти крупнейшим странам, поэтому доля целевых стран занижена; данные о </w:t>
+      </w:r>
+      <w:r>
+        <w:rPr>
+          <w:sz w:val="28"/>
+        </w:rPr>
+        <w:lastRenderedPageBreak/>
+        <w:t>стоимост</w:t>
       </w:r>
       <w:r>
         <w:rPr>
@@ -19660,7 +19719,6 @@
           <w:i/>
           <w:sz w:val="28"/>
         </w:rPr>
-        <w:lastRenderedPageBreak/>
         <w:t>Similarweb</w:t>
       </w:r>
       <w:r>
@@ -19736,7 +19794,7 @@
         <w:ind w:firstLine="709"/>
       </w:pPr>
       <w:bookmarkStart w:id="28" w:name="_1bfdad9d2d88ddb6ca16c31c1d4d4943679f32f"/>
-      <w:bookmarkStart w:id="29" w:name="_Toc241952869"/>
+      <w:bookmarkStart w:id="29" w:name="_Toc241955021"/>
       <w:bookmarkEnd w:id="26"/>
       <w:bookmarkEnd w:id="2"/>
       <w:r>
@@ -19852,7 +19910,7 @@
         <w:rPr>
           <w:sz w:val="28"/>
         </w:rPr>
-        <w:t>; поисковая выдача и реклама - частично (ДОСНЯТЬ).</w:t>
+        <w:t>; поисковая выдача и реклама - модельные показатели (приложение Д, Д-33).</w:t>
       </w:r>
     </w:p>
     <w:p>
@@ -19870,13 +19928,7 @@
         <w:rPr>
           <w:sz w:val="28"/>
         </w:rPr>
-        <w:t xml:space="preserve">Проверены ли каналы трафика и зависимость от </w:t>
-      </w:r>
-      <w:r>
-        <w:rPr>
-          <w:sz w:val="28"/>
-        </w:rPr>
-        <w:t>поисковых систем, рекламы и платформ? Да, таблица 4: поиск и прямые заходы около трех четвертей трафика.</w:t>
+        <w:t>Проверены ли каналы трафика и зависимость от поисковых систем, рекламы и платформ? Да, таблица 4: поиск и прямые заходы около трех четвертей трафика.</w:t>
       </w:r>
     </w:p>
     <w:p>
@@ -19894,7 +19946,13 @@
         <w:rPr>
           <w:sz w:val="28"/>
         </w:rPr>
-        <w:t>Оценена ли угроза входа новых участников с учетом стоимости привлечения клиента и доверия? Да, таблица 6; стоимость клика не получена (ДОСНЯТЬ).</w:t>
+        <w:t xml:space="preserve">Оценена ли угроза входа новых участников с учетом стоимости привлечения клиента и доверия? Да, таблица 6; </w:t>
+      </w:r>
+      <w:r>
+        <w:rPr>
+          <w:sz w:val="28"/>
+        </w:rPr>
+        <w:t>стоимость клика принята по модельным показателям (приложение Д, Д-33).</w:t>
       </w:r>
     </w:p>
     <w:p>
@@ -19930,7 +19988,13 @@
         <w:rPr>
           <w:sz w:val="28"/>
         </w:rPr>
-        <w:t>Оценена ли сила поставщиков, включая трафик, данные, платежи и инфраструктуру? Да, таблица 8.</w:t>
+        <w:t>Оценена ли сила поставщиков, включая трафик, данные, платежи и инфраструктуру? Да, т</w:t>
+      </w:r>
+      <w:r>
+        <w:rPr>
+          <w:sz w:val="28"/>
+        </w:rPr>
+        <w:t>аблица 8.</w:t>
       </w:r>
     </w:p>
     <w:p>
@@ -19948,13 +20012,7 @@
         <w:rPr>
           <w:sz w:val="28"/>
         </w:rPr>
-        <w:t xml:space="preserve">Выявлены ли цифровые заменители, включая автоматизацию, ИИ и </w:t>
-      </w:r>
-      <w:r>
-        <w:rPr>
-          <w:sz w:val="28"/>
-        </w:rPr>
-        <w:t>самостоятельные решения? Да, таблица 9 и список игроков.</w:t>
+        <w:t>Выявлены ли цифровые заменители, включая автоматизацию, ИИ и самостоятельные решения? Да, таблица 9 и список игроков.</w:t>
       </w:r>
     </w:p>
     <w:p>
@@ -19990,7 +20048,13 @@
         <w:rPr>
           <w:sz w:val="28"/>
         </w:rPr>
-        <w:t>Сформулирован ли итоговый вывод о привлекательности рынка и условиях входа? Да, раздел 2.10.</w:t>
+        <w:t>Сформулирован ли итог</w:t>
+      </w:r>
+      <w:r>
+        <w:rPr>
+          <w:sz w:val="28"/>
+        </w:rPr>
+        <w:t>овый вывод о привлекательности рынка и условиях входа? Да, раздел 2.10.</w:t>
       </w:r>
     </w:p>
     <w:p>
@@ -20072,7 +20136,14 @@
           <w:i/>
           <w:sz w:val="28"/>
         </w:rPr>
-        <w:t>Capterra</w:t>
+        <w:t>Capterr</w:t>
+      </w:r>
+      <w:r>
+        <w:rPr>
+          <w:i/>
+          <w:sz w:val="28"/>
+        </w:rPr>
+        <w:t>a</w:t>
       </w:r>
       <w:r>
         <w:rPr>
@@ -20128,7 +20199,7 @@
         <w:jc w:val="center"/>
       </w:pPr>
       <w:bookmarkStart w:id="30" w:name="_выводы"/>
-      <w:bookmarkStart w:id="31" w:name="_Toc241952870"/>
+      <w:bookmarkStart w:id="31" w:name="_Toc241955022"/>
       <w:bookmarkEnd w:id="28"/>
       <w:r>
         <w:rPr>
@@ -20136,14 +20207,7 @@
           <w:sz w:val="28"/>
         </w:rPr>
         <w:lastRenderedPageBreak/>
-        <w:t>ВЫВОД</w:t>
-      </w:r>
-      <w:r>
-        <w:rPr>
-          <w:b/>
-          <w:sz w:val="28"/>
-        </w:rPr>
-        <w:t>Ы</w:t>
+        <w:t>ВЫВОДЫ</w:t>
       </w:r>
       <w:bookmarkEnd w:id="31"/>
     </w:p>
@@ -20171,13 +20235,13 @@
         <w:rPr>
           <w:sz w:val="28"/>
         </w:rPr>
-        <w:t>-моделей. Конкурентное поле состоит из пяти небольших прямых конкурентов (около 75 тысяч визитов в месяц на всех) и большого числа заменителей, которые дают 73 % релевантного</w:t>
-      </w:r>
-      <w:r>
-        <w:rPr>
-          <w:sz w:val="28"/>
-        </w:rPr>
-        <w:t xml:space="preserve"> трафика. Концентрация умеренная: </w:t>
+        <w:t>-моделей. Конкурентное поле состоит из пяти небольших прямых конкурентов (около 75 тысяч визитов в меся</w:t>
+      </w:r>
+      <w:r>
+        <w:rPr>
+          <w:sz w:val="28"/>
+        </w:rPr>
+        <w:t xml:space="preserve">ц на всех) и большого числа заменителей, которые дают 73 % релевантного трафика. Концентрация умеренная: </w:t>
       </w:r>
       <w:r>
         <w:rPr>
@@ -20230,7 +20294,13 @@
         <w:rPr>
           <w:sz w:val="28"/>
         </w:rPr>
-        <w:t>Среднее давление пяти сил равно 3,55 из 5, индекс барьеров входа 3,15: рынок умеренно привлекателен. Критичная сила - заменители (</w:t>
+        <w:t xml:space="preserve">Среднее давление пяти сил равно 3,55 из 5, индекс барьеров входа 3,15: рынок умеренно привлекателен. Критичная сила - </w:t>
+      </w:r>
+      <w:r>
+        <w:rPr>
+          <w:sz w:val="28"/>
+        </w:rPr>
+        <w:t>заменители (</w:t>
       </w:r>
       <w:r>
         <w:rPr>
@@ -20269,7 +20339,13 @@
         <w:rPr>
           <w:sz w:val="28"/>
         </w:rPr>
-        <w:t>-подписками и специализированным аудитом свободна.</w:t>
+        <w:t>-подписками и специализированным аудит</w:t>
+      </w:r>
+      <w:r>
+        <w:rPr>
+          <w:sz w:val="28"/>
+        </w:rPr>
+        <w:t>ом свободна.</w:t>
       </w:r>
     </w:p>
     <w:p>
@@ -20283,13 +20359,7 @@
         <w:rPr>
           <w:sz w:val="28"/>
         </w:rPr>
-        <w:t>С</w:t>
-      </w:r>
-      <w:r>
-        <w:rPr>
-          <w:sz w:val="28"/>
-        </w:rPr>
-        <w:t xml:space="preserve">тратегия входа: узкое позиционирование независимой проверки с доказательствами для финансовых специалистов, вход через поиск, </w:t>
+        <w:t xml:space="preserve">Стратегия входа: узкое позиционирование независимой проверки с доказательствами для финансовых специалистов, вход через поиск, </w:t>
       </w:r>
       <w:r>
         <w:rPr>
@@ -20374,7 +20444,14 @@
           <w:i/>
           <w:sz w:val="28"/>
         </w:rPr>
-        <w:t>Crunchbase</w:t>
+        <w:t>C</w:t>
+      </w:r>
+      <w:r>
+        <w:rPr>
+          <w:i/>
+          <w:sz w:val="28"/>
+        </w:rPr>
+        <w:t>runchbase</w:t>
       </w:r>
       <w:r>
         <w:rPr>
@@ -20387,14 +20464,7 @@
           <w:i/>
           <w:sz w:val="28"/>
         </w:rPr>
-        <w:t>Li</w:t>
-      </w:r>
-      <w:r>
-        <w:rPr>
-          <w:i/>
-          <w:sz w:val="28"/>
-        </w:rPr>
-        <w:t>nkedIn</w:t>
+        <w:t>LinkedIn</w:t>
       </w:r>
       <w:r>
         <w:rPr>
@@ -20411,7 +20481,7 @@
         <w:jc w:val="center"/>
       </w:pPr>
       <w:bookmarkStart w:id="32" w:name="_274f6a444530ef90b0479dabf3d210f01e97699"/>
-      <w:bookmarkStart w:id="33" w:name="_Toc241952871"/>
+      <w:bookmarkStart w:id="33" w:name="_Toc241955023"/>
       <w:bookmarkEnd w:id="30"/>
       <w:r>
         <w:rPr>
@@ -20438,13 +20508,13 @@
         <w:rPr>
           <w:sz w:val="28"/>
         </w:rPr>
-        <w:t>Методические материалы дисциплины «Электронный бизнес» к лабораторной работе № 4: методика пяти сил Портера для электронного бизнеса и источники да</w:t>
-      </w:r>
-      <w:r>
-        <w:rPr>
-          <w:sz w:val="28"/>
-        </w:rPr>
-        <w:t>нных по силам Портера. – Минск : БГУИР, 2026.</w:t>
+        <w:t xml:space="preserve">Методические материалы дисциплины «Электронный бизнес» к лабораторной работе № 4: методика пяти сил Портера для электронного бизнеса </w:t>
+      </w:r>
+      <w:r>
+        <w:rPr>
+          <w:sz w:val="28"/>
+        </w:rPr>
+        <w:t>и источники данных по силам Портера. – Минск : БГУИР, 2026.</w:t>
       </w:r>
     </w:p>
     <w:p>
@@ -20488,7 +20558,13 @@
         <w:rPr>
           <w:sz w:val="28"/>
         </w:rPr>
-        <w:t xml:space="preserve"> оценки конкуренции и барьеров входа. Методические материалы дисциплины «Электронный бизнес». – Минск : БГУИР, 2026.</w:t>
+        <w:t xml:space="preserve"> оценки конкуренции и барьеров входа. Методические материалы дисциплины «Электронный бизнес». – Минск : БГУИР,</w:t>
+      </w:r>
+      <w:r>
+        <w:rPr>
+          <w:sz w:val="28"/>
+        </w:rPr>
+        <w:t xml:space="preserve"> 2026.</w:t>
       </w:r>
     </w:p>
     <w:p>
@@ -20513,13 +20589,7 @@
         <w:rPr>
           <w:sz w:val="28"/>
         </w:rPr>
-        <w:t>,</w:t>
-      </w:r>
-      <w:r>
-        <w:rPr>
-          <w:sz w:val="28"/>
-        </w:rPr>
-        <w:t xml:space="preserve"> </w:t>
+        <w:t xml:space="preserve">, </w:t>
       </w:r>
       <w:r>
         <w:rPr>
@@ -20908,7 +20978,13 @@
         <w:rPr>
           <w:sz w:val="28"/>
         </w:rPr>
-        <w:t>. 78–93.</w:t>
+        <w:t xml:space="preserve">. </w:t>
+      </w:r>
+      <w:r>
+        <w:rPr>
+          <w:sz w:val="28"/>
+        </w:rPr>
+        <w:t>78–93.</w:t>
       </w:r>
     </w:p>
     <w:p>
@@ -20944,7 +21020,13 @@
         <w:rPr>
           <w:sz w:val="28"/>
         </w:rPr>
-        <w:t>Земляник, Р. В. Отчет по лабораторной работе № 2–3 «Оценка объема рынка» / Р. В. Земляник. – Минск : БГУИР, 2026.</w:t>
+        <w:t xml:space="preserve">Земляник, Р. В. Отчет по лабораторной работе № 2–3 «Оценка объема рынка» / Р. В. Земляник. – Минск : БГУИР, </w:t>
+      </w:r>
+      <w:r>
+        <w:rPr>
+          <w:sz w:val="28"/>
+        </w:rPr>
+        <w:t>2026.</w:t>
       </w:r>
     </w:p>
     <w:p>
@@ -20962,13 +21044,7 @@
         <w:rPr>
           <w:sz w:val="28"/>
         </w:rPr>
-        <w:t>З</w:t>
-      </w:r>
-      <w:r>
-        <w:rPr>
-          <w:sz w:val="28"/>
-        </w:rPr>
-        <w:t xml:space="preserve">емляник, Р. В. Концепция проекта </w:t>
+        <w:t xml:space="preserve">Земляник, Р. В. Концепция проекта </w:t>
       </w:r>
       <w:r>
         <w:rPr>
@@ -21084,13 +21160,13 @@
         <w:rPr>
           <w:sz w:val="28"/>
         </w:rPr>
-        <w:t>) [Электр</w:t>
-      </w:r>
-      <w:r>
-        <w:rPr>
-          <w:sz w:val="28"/>
-        </w:rPr>
-        <w:t>онный ресурс]. – Режим доступа: https://pro.similarweb.com/. – Дата доступа: 03.10.2026.</w:t>
+        <w:t xml:space="preserve">) </w:t>
+      </w:r>
+      <w:r>
+        <w:rPr>
+          <w:sz w:val="28"/>
+        </w:rPr>
+        <w:t>[Электронный ресурс]. – Режим доступа: https://pro.similarweb.com/. – Дата доступа: 03.10.2026.</w:t>
       </w:r>
     </w:p>
     <w:p>
@@ -21269,7 +21345,13 @@
         <w:rPr>
           <w:sz w:val="28"/>
         </w:rPr>
-        <w:t xml:space="preserve"> [Электронный ресурс]. – Режим доступа: https://www.trustpilot.com/review/perfectxl.com. – Дата доступа: 03.10.2026.</w:t>
+        <w:t xml:space="preserve"> [Электронный рес</w:t>
+      </w:r>
+      <w:r>
+        <w:rPr>
+          <w:sz w:val="28"/>
+        </w:rPr>
+        <w:t>урс]. – Режим доступа: https://www.trustpilot.com/review/perfectxl.com. – Дата доступа: 03.10.2026.</w:t>
       </w:r>
     </w:p>
     <w:p>
@@ -21301,14 +21383,7 @@
           <w:i/>
           <w:sz w:val="28"/>
         </w:rPr>
-        <w:t>Pric</w:t>
-      </w:r>
-      <w:r>
-        <w:rPr>
-          <w:i/>
-          <w:sz w:val="28"/>
-        </w:rPr>
-        <w:t>ing</w:t>
+        <w:t>Pricing</w:t>
       </w:r>
       <w:r>
         <w:rPr>
@@ -21352,7 +21427,13 @@
         <w:rPr>
           <w:sz w:val="28"/>
         </w:rPr>
-        <w:t xml:space="preserve"> [Электронный ресурс]. – Режим доступа: https://www.numerous.ai/pricing. – Дата доступа: 03.10.2026.</w:t>
+        <w:t xml:space="preserve"> [Электронный </w:t>
+      </w:r>
+      <w:r>
+        <w:rPr>
+          <w:sz w:val="28"/>
+        </w:rPr>
+        <w:t>ресурс]. – Режим доступа: https://www.numerous.ai/pricing. – Дата доступа: 03.10.2026.</w:t>
       </w:r>
     </w:p>
     <w:p>
@@ -21390,13 +21471,7 @@
         <w:rPr>
           <w:sz w:val="28"/>
         </w:rPr>
-        <w:t xml:space="preserve"> [Электронный р</w:t>
-      </w:r>
-      <w:r>
-        <w:rPr>
-          <w:sz w:val="28"/>
-        </w:rPr>
-        <w:t>есурс]. – Режим доступа: https://rows.com/pricing. – Дата доступа: 03.10.2026.</w:t>
+        <w:t xml:space="preserve"> [Электронный ресурс]. – Режим доступа: https://rows.com/pricing. – Дата доступа: 03.10.2026.</w:t>
       </w:r>
     </w:p>
     <w:p>
@@ -21434,7 +21509,13 @@
         <w:rPr>
           <w:sz w:val="28"/>
         </w:rPr>
-        <w:t xml:space="preserve"> [Электронный ресурс]. – Режим доступа: https://www.shortcut.ai/pricing. – Дата доступа: 03.10.2026.</w:t>
+        <w:t xml:space="preserve"> [Электронный ресурс]. – Режим доступа: https</w:t>
+      </w:r>
+      <w:r>
+        <w:rPr>
+          <w:sz w:val="28"/>
+        </w:rPr>
+        <w:t>://www.shortcut.ai/pricing. – Дата доступа: 03.10.2026.</w:t>
       </w:r>
     </w:p>
     <w:p>
@@ -21525,13 +21606,7 @@
         <w:rPr>
           <w:sz w:val="28"/>
         </w:rPr>
-        <w:t xml:space="preserve"> [Электро</w:t>
-      </w:r>
-      <w:r>
-        <w:rPr>
-          <w:sz w:val="28"/>
-        </w:rPr>
-        <w:t>нный ресурс]. – Режим доступа: https://www.microsoft.com/en-us/microsoft-365-copilot/pricing. – Дата доступа: 03.10.2026.</w:t>
+        <w:t xml:space="preserve"> [Электронный ресурс]. – Режим доступа: https://www.microsoft.com/en-us/microsoft-365-copilot/pricing. – Дата доступа: 03.10.2026.</w:t>
       </w:r>
     </w:p>
     <w:p>
@@ -21563,7 +21638,14 @@
           <w:i/>
           <w:sz w:val="28"/>
         </w:rPr>
-        <w:t>DataSnipper</w:t>
+        <w:t>DataSnipp</w:t>
+      </w:r>
+      <w:r>
+        <w:rPr>
+          <w:i/>
+          <w:sz w:val="28"/>
+        </w:rPr>
+        <w:t>er</w:t>
       </w:r>
       <w:r>
         <w:rPr>
@@ -21608,13 +21690,7 @@
         <w:rPr>
           <w:sz w:val="28"/>
         </w:rPr>
-        <w:t xml:space="preserve"> [Электронный ресурс]. – Режим доступа: https://www.capterra.com/p/10002513/DataSni</w:t>
-      </w:r>
-      <w:r>
-        <w:rPr>
-          <w:sz w:val="28"/>
-        </w:rPr>
-        <w:t>pper/. – Дата доступа: 03.10.2026.</w:t>
+        <w:t xml:space="preserve"> [Электронный ресурс]. – Режим доступа: https://www.capterra.com/p/10002513/DataSnipper/. – Дата доступа: 03.10.2026.</w:t>
       </w:r>
     </w:p>
     <w:p>
@@ -21665,7 +21741,13 @@
         <w:rPr>
           <w:sz w:val="28"/>
         </w:rPr>
-        <w:t xml:space="preserve"> [Электронный ресурс]. – Режим доступа: https://www.trustpilot.com/review/numerous.ai. – Дата доступа: 03.10.2026.</w:t>
+        <w:t xml:space="preserve"> [Электронный ресурс]. – Режим доступа: https://www.trustpilot.com/review/n</w:t>
+      </w:r>
+      <w:r>
+        <w:rPr>
+          <w:sz w:val="28"/>
+        </w:rPr>
+        <w:t>umerous.ai. – Дата доступа: 03.10.2026.</w:t>
       </w:r>
     </w:p>
     <w:p>
@@ -21677,7 +21759,7 @@
         <w:jc w:val="center"/>
       </w:pPr>
       <w:bookmarkStart w:id="34" w:name="_3d74faf1500c1b2a4a8bfa8e0e37c74206ce73d"/>
-      <w:bookmarkStart w:id="35" w:name="_Toc241952872"/>
+      <w:bookmarkStart w:id="35" w:name="_Toc241955024"/>
       <w:bookmarkEnd w:id="32"/>
       <w:r>
         <w:rPr>
@@ -22741,7 +22823,7 @@
         <w:jc w:val="center"/>
       </w:pPr>
       <w:bookmarkStart w:id="36" w:name="_25083b51e17d9d99817d1269b6af13d75b604a4"/>
-      <w:bookmarkStart w:id="37" w:name="_Toc241952873"/>
+      <w:bookmarkStart w:id="37" w:name="_Toc241955025"/>
       <w:bookmarkEnd w:id="34"/>
       <w:r>
         <w:rPr>
@@ -23829,7 +23911,7 @@
         <w:jc w:val="center"/>
       </w:pPr>
       <w:bookmarkStart w:id="38" w:name="_cb59224a7032ef66ab429e7df9b4e4c597bc187"/>
-      <w:bookmarkStart w:id="39" w:name="_Toc241952874"/>
+      <w:bookmarkStart w:id="39" w:name="_Toc241955026"/>
       <w:bookmarkEnd w:id="36"/>
       <w:r>
         <w:rPr>
@@ -24571,7 +24653,7 @@
         <w:jc w:val="center"/>
       </w:pPr>
       <w:bookmarkStart w:id="40" w:name="_36e5ced6b29eabb38058bfd1a6b3384d71712dd"/>
-      <w:bookmarkStart w:id="41" w:name="_Toc241952875"/>
+      <w:bookmarkStart w:id="41" w:name="_Toc241955027"/>
       <w:bookmarkEnd w:id="38"/>
       <w:r>
         <w:rPr>
@@ -24682,7 +24764,13 @@
         <w:rPr>
           <w:sz w:val="28"/>
         </w:rPr>
-        <w:t>В таблице 22 представлено: дополнительные отзывы и рейтинги.</w:t>
+        <w:t>В таблице 22 представлено: дополнительные отзывы и рей</w:t>
+      </w:r>
+      <w:r>
+        <w:rPr>
+          <w:sz w:val="28"/>
+        </w:rPr>
+        <w:t>тинги.</w:t>
       </w:r>
     </w:p>
     <w:p>
@@ -24803,14 +24891,7 @@
                 <w:b/>
                 <w:sz w:val="24"/>
               </w:rPr>
-              <w:t>Комментар</w:t>
-            </w:r>
-            <w:r>
-              <w:rPr>
-                <w:b/>
-                <w:sz w:val="24"/>
-              </w:rPr>
-              <w:t>ий</w:t>
+              <w:t>Комментарий</w:t>
             </w:r>
           </w:p>
         </w:tc>
@@ -25185,13 +25266,13 @@
               <w:rPr>
                 <w:sz w:val="24"/>
               </w:rPr>
-              <w:t>все отзывы однозвездочные</w:t>
-            </w:r>
-            <w:r>
-              <w:rPr>
-                <w:sz w:val="24"/>
-              </w:rPr>
-              <w:t>: списание после пробного периода, сложная отмена, отказ в возврате</w:t>
+              <w:t>все</w:t>
+            </w:r>
+            <w:r>
+              <w:rPr>
+                <w:sz w:val="24"/>
+              </w:rPr>
+              <w:t xml:space="preserve"> отзывы однозвездочные: списание после пробного периода, сложная отмена, отказ в возврате</w:t>
             </w:r>
           </w:p>
         </w:tc>
@@ -25454,7 +25535,13 @@
         <w:rPr>
           <w:sz w:val="28"/>
         </w:rPr>
-        <w:t xml:space="preserve">) их нет, что подтверждает слабое доверие как барьер и возможность для </w:t>
+        <w:t xml:space="preserve">) их </w:t>
+      </w:r>
+      <w:r>
+        <w:rPr>
+          <w:sz w:val="28"/>
+        </w:rPr>
+        <w:t xml:space="preserve">нет, что подтверждает слабое доверие как барьер и возможность для </w:t>
       </w:r>
       <w:r>
         <w:rPr>
@@ -25505,7 +25592,7 @@
         <w:jc w:val="center"/>
       </w:pPr>
       <w:bookmarkStart w:id="42" w:name="_66fcbafe8bc9e7780670ba4b2232c7930f0801d"/>
-      <w:bookmarkStart w:id="43" w:name="_Toc241952876"/>
+      <w:bookmarkStart w:id="43" w:name="_Toc241955028"/>
       <w:bookmarkEnd w:id="40"/>
       <w:r>
         <w:rPr>
@@ -25513,14 +25600,7 @@
           <w:sz w:val="28"/>
         </w:rPr>
         <w:lastRenderedPageBreak/>
-        <w:t>ПР</w:t>
-      </w:r>
-      <w:r>
-        <w:rPr>
-          <w:b/>
-          <w:sz w:val="28"/>
-        </w:rPr>
-        <w:t>ИЛОЖЕНИЕ Д</w:t>
+        <w:t>ПРИЛОЖЕНИЕ Д</w:t>
       </w:r>
       <w:bookmarkEnd w:id="43"/>
     </w:p>
@@ -25533,7 +25613,13 @@
         <w:rPr>
           <w:sz w:val="28"/>
         </w:rPr>
-        <w:t>(справочное)</w:t>
+        <w:t>(</w:t>
+      </w:r>
+      <w:r>
+        <w:rPr>
+          <w:sz w:val="28"/>
+        </w:rPr>
+        <w:t>справочное)</w:t>
       </w:r>
     </w:p>
     <w:p>
@@ -28173,7 +28259,7 @@
   <w:abstractNum w:abstractNumId="0" w15:restartNumberingAfterBreak="0">
     <w:nsid w:val="0000A990"/>
     <w:multiLevelType w:val="multilevel"/>
-    <w:tmpl w:val="A1E67196"/>
+    <w:tmpl w:val="CC705A92"/>
     <w:lvl w:ilvl="0">
       <w:numFmt w:val="bullet"/>
       <w:lvlText w:val=" "/>
@@ -28250,7 +28336,7 @@
   <w:abstractNum w:abstractNumId="1" w15:restartNumberingAfterBreak="0">
     <w:nsid w:val="00A99411"/>
     <w:multiLevelType w:val="multilevel"/>
-    <w:tmpl w:val="2A543D0E"/>
+    <w:tmpl w:val="EF066130"/>
     <w:lvl w:ilvl="0">
       <w:start w:val="1"/>
       <w:numFmt w:val="decimal"/>
@@ -29728,7 +29814,7 @@
     <w:autoRedefine/>
     <w:uiPriority w:val="39"/>
     <w:unhideWhenUsed/>
-    <w:rsid w:val="008E210B"/>
+    <w:rsid w:val="00C90B76"/>
     <w:pPr>
       <w:spacing w:after="100"/>
     </w:pPr>
@@ -29740,7 +29826,7 @@
     <w:autoRedefine/>
     <w:uiPriority w:val="39"/>
     <w:unhideWhenUsed/>
-    <w:rsid w:val="008E210B"/>
+    <w:rsid w:val="00C90B76"/>
     <w:pPr>
       <w:spacing w:after="100"/>
       <w:ind w:left="240"/>

</xml_diff>

<commit_message>
audit pass 2: source numbering order, control checklists, text fixes, rebuilt reports (final 260 pages)
</commit_message>
<xml_diff>
--- a/ЛР4_Пять_сил_Портера/ОТЧЕТ_ЛР4_TableMind.docx
+++ b/ЛР4_Пять_сил_Портера/ОТЧЕТ_ЛР4_TableMind.docx
@@ -263,7 +263,7 @@
       <w:r>
         <w:fldChar w:fldCharType="separate"/>
       </w:r>
-      <w:hyperlink w:anchor="_Toc242017691" w:history="1">
+      <w:hyperlink w:anchor="_Toc242018470" w:history="1">
         <w:r>
           <w:rPr>
             <w:rStyle w:val="af"/>
@@ -291,7 +291,7 @@
             <w:noProof/>
             <w:webHidden/>
           </w:rPr>
-          <w:instrText xml:space="preserve"> PAGEREF _Toc242017691 \h </w:instrText>
+          <w:instrText xml:space="preserve"> PAGEREF _Toc242018470 \h </w:instrText>
         </w:r>
         <w:r>
           <w:rPr>
@@ -332,7 +332,7 @@
           <w:noProof/>
         </w:rPr>
       </w:pPr>
-      <w:hyperlink w:anchor="_Toc242017692" w:history="1">
+      <w:hyperlink w:anchor="_Toc242018471" w:history="1">
         <w:r>
           <w:rPr>
             <w:rStyle w:val="af"/>
@@ -360,7 +360,7 @@
             <w:noProof/>
             <w:webHidden/>
           </w:rPr>
-          <w:instrText xml:space="preserve"> PAGEREF _Toc242017692 \h </w:instrText>
+          <w:instrText xml:space="preserve"> PAGEREF _Toc242018471 \h </w:instrText>
         </w:r>
         <w:r>
           <w:rPr>
@@ -401,7 +401,7 @@
           <w:noProof/>
         </w:rPr>
       </w:pPr>
-      <w:hyperlink w:anchor="_Toc242017693" w:history="1">
+      <w:hyperlink w:anchor="_Toc242018472" w:history="1">
         <w:r>
           <w:rPr>
             <w:rStyle w:val="af"/>
@@ -429,7 +429,7 @@
             <w:noProof/>
             <w:webHidden/>
           </w:rPr>
-          <w:instrText xml:space="preserve"> PAGEREF _Toc242017693 \h </w:instrText>
+          <w:instrText xml:space="preserve"> PAGEREF _Toc242018472 \h </w:instrText>
         </w:r>
         <w:r>
           <w:rPr>
@@ -470,7 +470,7 @@
           <w:noProof/>
         </w:rPr>
       </w:pPr>
-      <w:hyperlink w:anchor="_Toc242017694" w:history="1">
+      <w:hyperlink w:anchor="_Toc242018473" w:history="1">
         <w:r>
           <w:rPr>
             <w:rStyle w:val="af"/>
@@ -498,7 +498,7 @@
             <w:noProof/>
             <w:webHidden/>
           </w:rPr>
-          <w:instrText xml:space="preserve"> PAGEREF _Toc242017694 \h </w:instrText>
+          <w:instrText xml:space="preserve"> PAGEREF _Toc242018473 \h </w:instrText>
         </w:r>
         <w:r>
           <w:rPr>
@@ -539,7 +539,7 @@
           <w:noProof/>
         </w:rPr>
       </w:pPr>
-      <w:hyperlink w:anchor="_Toc242017695" w:history="1">
+      <w:hyperlink w:anchor="_Toc242018474" w:history="1">
         <w:r>
           <w:rPr>
             <w:rStyle w:val="af"/>
@@ -567,7 +567,7 @@
             <w:noProof/>
             <w:webHidden/>
           </w:rPr>
-          <w:instrText xml:space="preserve"> PAGEREF _Toc242017695 \h </w:instrText>
+          <w:instrText xml:space="preserve"> PAGEREF _Toc242018474 \h </w:instrText>
         </w:r>
         <w:r>
           <w:rPr>
@@ -608,7 +608,7 @@
           <w:noProof/>
         </w:rPr>
       </w:pPr>
-      <w:hyperlink w:anchor="_Toc242017696" w:history="1">
+      <w:hyperlink w:anchor="_Toc242018475" w:history="1">
         <w:r>
           <w:rPr>
             <w:rStyle w:val="af"/>
@@ -636,7 +636,7 @@
             <w:noProof/>
             <w:webHidden/>
           </w:rPr>
-          <w:instrText xml:space="preserve"> PAGEREF _Toc242017696 \h </w:instrText>
+          <w:instrText xml:space="preserve"> PAGEREF _Toc242018475 \h </w:instrText>
         </w:r>
         <w:r>
           <w:rPr>
@@ -677,7 +677,7 @@
           <w:noProof/>
         </w:rPr>
       </w:pPr>
-      <w:hyperlink w:anchor="_Toc242017697" w:history="1">
+      <w:hyperlink w:anchor="_Toc242018476" w:history="1">
         <w:r>
           <w:rPr>
             <w:rStyle w:val="af"/>
@@ -705,7 +705,7 @@
             <w:noProof/>
             <w:webHidden/>
           </w:rPr>
-          <w:instrText xml:space="preserve"> PAGEREF _Toc242017697 \h </w:instrText>
+          <w:instrText xml:space="preserve"> PAGEREF _Toc242018476 \h </w:instrText>
         </w:r>
         <w:r>
           <w:rPr>
@@ -746,7 +746,7 @@
           <w:noProof/>
         </w:rPr>
       </w:pPr>
-      <w:hyperlink w:anchor="_Toc242017698" w:history="1">
+      <w:hyperlink w:anchor="_Toc242018477" w:history="1">
         <w:r>
           <w:rPr>
             <w:rStyle w:val="af"/>
@@ -774,7 +774,7 @@
             <w:noProof/>
             <w:webHidden/>
           </w:rPr>
-          <w:instrText xml:space="preserve"> PAGEREF _Toc242017698 \h </w:instrText>
+          <w:instrText xml:space="preserve"> PAGEREF _Toc242018477 \h </w:instrText>
         </w:r>
         <w:r>
           <w:rPr>
@@ -815,7 +815,7 @@
           <w:noProof/>
         </w:rPr>
       </w:pPr>
-      <w:hyperlink w:anchor="_Toc242017699" w:history="1">
+      <w:hyperlink w:anchor="_Toc242018478" w:history="1">
         <w:r>
           <w:rPr>
             <w:rStyle w:val="af"/>
@@ -843,7 +843,7 @@
             <w:noProof/>
             <w:webHidden/>
           </w:rPr>
-          <w:instrText xml:space="preserve"> PAGEREF _Toc242017699 \h </w:instrText>
+          <w:instrText xml:space="preserve"> PAGEREF _Toc242018478 \h </w:instrText>
         </w:r>
         <w:r>
           <w:rPr>
@@ -884,7 +884,7 @@
           <w:noProof/>
         </w:rPr>
       </w:pPr>
-      <w:hyperlink w:anchor="_Toc242017700" w:history="1">
+      <w:hyperlink w:anchor="_Toc242018479" w:history="1">
         <w:r>
           <w:rPr>
             <w:rStyle w:val="af"/>
@@ -912,7 +912,7 @@
             <w:noProof/>
             <w:webHidden/>
           </w:rPr>
-          <w:instrText xml:space="preserve"> PAGEREF _Toc242017700 \h </w:instrText>
+          <w:instrText xml:space="preserve"> PAGEREF _Toc242018479 \h </w:instrText>
         </w:r>
         <w:r>
           <w:rPr>
@@ -953,7 +953,7 @@
           <w:noProof/>
         </w:rPr>
       </w:pPr>
-      <w:hyperlink w:anchor="_Toc242017701" w:history="1">
+      <w:hyperlink w:anchor="_Toc242018480" w:history="1">
         <w:r>
           <w:rPr>
             <w:rStyle w:val="af"/>
@@ -981,7 +981,7 @@
             <w:noProof/>
             <w:webHidden/>
           </w:rPr>
-          <w:instrText xml:space="preserve"> PAGEREF _Toc242017701 \h </w:instrText>
+          <w:instrText xml:space="preserve"> PAGEREF _Toc242018480 \h </w:instrText>
         </w:r>
         <w:r>
           <w:rPr>
@@ -1022,7 +1022,7 @@
           <w:noProof/>
         </w:rPr>
       </w:pPr>
-      <w:hyperlink w:anchor="_Toc242017702" w:history="1">
+      <w:hyperlink w:anchor="_Toc242018481" w:history="1">
         <w:r>
           <w:rPr>
             <w:rStyle w:val="af"/>
@@ -1050,7 +1050,7 @@
             <w:noProof/>
             <w:webHidden/>
           </w:rPr>
-          <w:instrText xml:space="preserve"> PAGEREF _Toc242017702 \h </w:instrText>
+          <w:instrText xml:space="preserve"> PAGEREF _Toc242018481 \h </w:instrText>
         </w:r>
         <w:r>
           <w:rPr>
@@ -1091,7 +1091,7 @@
           <w:noProof/>
         </w:rPr>
       </w:pPr>
-      <w:hyperlink w:anchor="_Toc242017703" w:history="1">
+      <w:hyperlink w:anchor="_Toc242018482" w:history="1">
         <w:r>
           <w:rPr>
             <w:rStyle w:val="af"/>
@@ -1119,7 +1119,7 @@
             <w:noProof/>
             <w:webHidden/>
           </w:rPr>
-          <w:instrText xml:space="preserve"> PAGEREF _Toc242017703 \h </w:instrText>
+          <w:instrText xml:space="preserve"> PAGEREF _Toc242018482 \h </w:instrText>
         </w:r>
         <w:r>
           <w:rPr>
@@ -1160,7 +1160,7 @@
           <w:noProof/>
         </w:rPr>
       </w:pPr>
-      <w:hyperlink w:anchor="_Toc242017704" w:history="1">
+      <w:hyperlink w:anchor="_Toc242018483" w:history="1">
         <w:r>
           <w:rPr>
             <w:rStyle w:val="af"/>
@@ -1188,7 +1188,7 @@
             <w:noProof/>
             <w:webHidden/>
           </w:rPr>
-          <w:instrText xml:space="preserve"> PAGEREF _Toc242017704 \h </w:instrText>
+          <w:instrText xml:space="preserve"> PAGEREF _Toc242018483 \h </w:instrText>
         </w:r>
         <w:r>
           <w:rPr>
@@ -1229,7 +1229,7 @@
           <w:noProof/>
         </w:rPr>
       </w:pPr>
-      <w:hyperlink w:anchor="_Toc242017705" w:history="1">
+      <w:hyperlink w:anchor="_Toc242018484" w:history="1">
         <w:r>
           <w:rPr>
             <w:rStyle w:val="af"/>
@@ -1257,7 +1257,7 @@
             <w:noProof/>
             <w:webHidden/>
           </w:rPr>
-          <w:instrText xml:space="preserve"> PAGEREF _Toc242017705 \h </w:instrText>
+          <w:instrText xml:space="preserve"> PAGEREF _Toc242018484 \h </w:instrText>
         </w:r>
         <w:r>
           <w:rPr>
@@ -1298,7 +1298,7 @@
           <w:noProof/>
         </w:rPr>
       </w:pPr>
-      <w:hyperlink w:anchor="_Toc242017706" w:history="1">
+      <w:hyperlink w:anchor="_Toc242018485" w:history="1">
         <w:r>
           <w:rPr>
             <w:rStyle w:val="af"/>
@@ -1326,7 +1326,7 @@
             <w:noProof/>
             <w:webHidden/>
           </w:rPr>
-          <w:instrText xml:space="preserve"> PAGEREF _Toc242017706 \h </w:instrText>
+          <w:instrText xml:space="preserve"> PAGEREF _Toc242018485 \h </w:instrText>
         </w:r>
         <w:r>
           <w:rPr>
@@ -1367,7 +1367,7 @@
           <w:noProof/>
         </w:rPr>
       </w:pPr>
-      <w:hyperlink w:anchor="_Toc242017707" w:history="1">
+      <w:hyperlink w:anchor="_Toc242018486" w:history="1">
         <w:r>
           <w:rPr>
             <w:rStyle w:val="af"/>
@@ -1395,7 +1395,7 @@
             <w:noProof/>
             <w:webHidden/>
           </w:rPr>
-          <w:instrText xml:space="preserve"> PAGEREF _Toc242017707 \h </w:instrText>
+          <w:instrText xml:space="preserve"> PAGEREF _Toc242018486 \h </w:instrText>
         </w:r>
         <w:r>
           <w:rPr>
@@ -1436,7 +1436,7 @@
           <w:noProof/>
         </w:rPr>
       </w:pPr>
-      <w:hyperlink w:anchor="_Toc242017708" w:history="1">
+      <w:hyperlink w:anchor="_Toc242018487" w:history="1">
         <w:r>
           <w:rPr>
             <w:rStyle w:val="af"/>
@@ -1464,7 +1464,7 @@
             <w:noProof/>
             <w:webHidden/>
           </w:rPr>
-          <w:instrText xml:space="preserve"> PAGEREF _Toc242017708 \h </w:instrText>
+          <w:instrText xml:space="preserve"> PAGEREF _Toc242018487 \h </w:instrText>
         </w:r>
         <w:r>
           <w:rPr>
@@ -1505,7 +1505,7 @@
           <w:noProof/>
         </w:rPr>
       </w:pPr>
-      <w:hyperlink w:anchor="_Toc242017709" w:history="1">
+      <w:hyperlink w:anchor="_Toc242018488" w:history="1">
         <w:r>
           <w:rPr>
             <w:rStyle w:val="af"/>
@@ -1533,7 +1533,7 @@
             <w:noProof/>
             <w:webHidden/>
           </w:rPr>
-          <w:instrText xml:space="preserve"> PAGEREF _Toc242017709 \h </w:instrText>
+          <w:instrText xml:space="preserve"> PAGEREF _Toc242018488 \h </w:instrText>
         </w:r>
         <w:r>
           <w:rPr>
@@ -1574,7 +1574,7 @@
           <w:noProof/>
         </w:rPr>
       </w:pPr>
-      <w:hyperlink w:anchor="_Toc242017710" w:history="1">
+      <w:hyperlink w:anchor="_Toc242018489" w:history="1">
         <w:r>
           <w:rPr>
             <w:rStyle w:val="af"/>
@@ -1602,7 +1602,7 @@
             <w:noProof/>
             <w:webHidden/>
           </w:rPr>
-          <w:instrText xml:space="preserve"> PAGEREF _Toc242017710 \h </w:instrText>
+          <w:instrText xml:space="preserve"> PAGEREF _Toc242018489 \h </w:instrText>
         </w:r>
         <w:r>
           <w:rPr>
@@ -1643,7 +1643,7 @@
           <w:noProof/>
         </w:rPr>
       </w:pPr>
-      <w:hyperlink w:anchor="_Toc242017711" w:history="1">
+      <w:hyperlink w:anchor="_Toc242018490" w:history="1">
         <w:r>
           <w:rPr>
             <w:rStyle w:val="af"/>
@@ -1671,7 +1671,7 @@
             <w:noProof/>
             <w:webHidden/>
           </w:rPr>
-          <w:instrText xml:space="preserve"> PAGEREF _Toc242017711 \h </w:instrText>
+          <w:instrText xml:space="preserve"> PAGEREF _Toc242018490 \h </w:instrText>
         </w:r>
         <w:r>
           <w:rPr>
@@ -1712,7 +1712,7 @@
           <w:noProof/>
         </w:rPr>
       </w:pPr>
-      <w:hyperlink w:anchor="_Toc242017712" w:history="1">
+      <w:hyperlink w:anchor="_Toc242018491" w:history="1">
         <w:r>
           <w:rPr>
             <w:rStyle w:val="af"/>
@@ -1740,7 +1740,7 @@
             <w:noProof/>
             <w:webHidden/>
           </w:rPr>
-          <w:instrText xml:space="preserve"> PAGEREF _Toc242017712 \h </w:instrText>
+          <w:instrText xml:space="preserve"> PAGEREF _Toc242018491 \h </w:instrText>
         </w:r>
         <w:r>
           <w:rPr>
@@ -1781,7 +1781,7 @@
           <w:noProof/>
         </w:rPr>
       </w:pPr>
-      <w:hyperlink w:anchor="_Toc242017713" w:history="1">
+      <w:hyperlink w:anchor="_Toc242018492" w:history="1">
         <w:r>
           <w:rPr>
             <w:rStyle w:val="af"/>
@@ -1809,7 +1809,7 @@
             <w:noProof/>
             <w:webHidden/>
           </w:rPr>
-          <w:instrText xml:space="preserve"> PAGEREF _Toc242017713 \h </w:instrText>
+          <w:instrText xml:space="preserve"> PAGEREF _Toc242018492 \h </w:instrText>
         </w:r>
         <w:r>
           <w:rPr>
@@ -1850,7 +1850,7 @@
           <w:noProof/>
         </w:rPr>
       </w:pPr>
-      <w:hyperlink w:anchor="_Toc242017714" w:history="1">
+      <w:hyperlink w:anchor="_Toc242018493" w:history="1">
         <w:r>
           <w:rPr>
             <w:rStyle w:val="af"/>
@@ -1878,7 +1878,7 @@
             <w:noProof/>
             <w:webHidden/>
           </w:rPr>
-          <w:instrText xml:space="preserve"> PAGEREF _Toc242017714 \h </w:instrText>
+          <w:instrText xml:space="preserve"> PAGEREF _Toc242018493 \h </w:instrText>
         </w:r>
         <w:r>
           <w:rPr>
@@ -1919,7 +1919,7 @@
           <w:noProof/>
         </w:rPr>
       </w:pPr>
-      <w:hyperlink w:anchor="_Toc242017715" w:history="1">
+      <w:hyperlink w:anchor="_Toc242018494" w:history="1">
         <w:r>
           <w:rPr>
             <w:rStyle w:val="af"/>
@@ -1947,7 +1947,7 @@
             <w:noProof/>
             <w:webHidden/>
           </w:rPr>
-          <w:instrText xml:space="preserve"> PAGEREF _Toc242017715 \h </w:instrText>
+          <w:instrText xml:space="preserve"> PAGEREF _Toc242018494 \h </w:instrText>
         </w:r>
         <w:r>
           <w:rPr>
@@ -1993,7 +1993,7 @@
         <w:spacing w:before="0" w:after="360" w:line="360" w:lineRule="exact"/>
         <w:ind w:firstLine="709"/>
       </w:pPr>
-      <w:bookmarkStart w:id="1" w:name="_Toc242017691"/>
+      <w:bookmarkStart w:id="1" w:name="_Toc242018470"/>
       <w:r>
         <w:rPr>
           <w:b/>
@@ -2201,7 +2201,7 @@
         <w:ind w:firstLine="709"/>
       </w:pPr>
       <w:bookmarkStart w:id="2" w:name="_b608aa976fc82a0faaf3b83f58c735968afd03b"/>
-      <w:bookmarkStart w:id="3" w:name="_Toc242017692"/>
+      <w:bookmarkStart w:id="3" w:name="_Toc242018471"/>
       <w:bookmarkEnd w:id="0"/>
       <w:r>
         <w:rPr>
@@ -2266,7 +2266,7 @@
         <w:ind w:firstLine="709"/>
       </w:pPr>
       <w:bookmarkStart w:id="4" w:name="_c2dc16d95c34e7e7c75dbd4503de730b54879a3"/>
-      <w:bookmarkStart w:id="5" w:name="_Toc242017693"/>
+      <w:bookmarkStart w:id="5" w:name="_Toc242018472"/>
       <w:r>
         <w:rPr>
           <w:b/>
@@ -5173,7 +5173,7 @@
         <w:ind w:firstLine="709"/>
       </w:pPr>
       <w:bookmarkStart w:id="6" w:name="_e53e14f44ab4c8780a98a105cb988ad22318c27"/>
-      <w:bookmarkStart w:id="7" w:name="_Toc242017694"/>
+      <w:bookmarkStart w:id="7" w:name="_Toc242018473"/>
       <w:bookmarkEnd w:id="4"/>
       <w:r>
         <w:rPr>
@@ -9092,7 +9092,7 @@
           <w:sz w:val="28"/>
         </w:rPr>
         <w:drawing>
-          <wp:inline distT="0" distB="0" distL="0" distR="0" wp14:anchorId="0824A6B8" wp14:editId="011CA675">
+          <wp:inline distT="0" distB="0" distL="0" distR="0" wp14:anchorId="228F0471" wp14:editId="63AA35C5">
             <wp:extent cx="5334000" cy="3088105"/>
             <wp:effectExtent l="0" t="0" r="0" b="0"/>
             <wp:docPr id="12" name="Picture"/>
@@ -9195,7 +9195,7 @@
         </w:rPr>
         <w:lastRenderedPageBreak/>
         <w:drawing>
-          <wp:inline distT="0" distB="0" distL="0" distR="0" wp14:anchorId="432A802A" wp14:editId="5083A4CC">
+          <wp:inline distT="0" distB="0" distL="0" distR="0" wp14:anchorId="13DDB4CA" wp14:editId="3B6D6447">
             <wp:extent cx="5334000" cy="2862146"/>
             <wp:effectExtent l="0" t="0" r="0" b="0"/>
             <wp:docPr id="15" name="Picture"/>
@@ -9628,7 +9628,7 @@
           <w:sz w:val="28"/>
         </w:rPr>
         <w:drawing>
-          <wp:inline distT="0" distB="0" distL="0" distR="0" wp14:anchorId="65560DBC" wp14:editId="3159C728">
+          <wp:inline distT="0" distB="0" distL="0" distR="0" wp14:anchorId="6EACC8CA" wp14:editId="759FD4C8">
             <wp:extent cx="5334000" cy="2536902"/>
             <wp:effectExtent l="0" t="0" r="0" b="0"/>
             <wp:docPr id="18" name="Picture"/>
@@ -10470,7 +10470,7 @@
         <w:ind w:firstLine="709"/>
       </w:pPr>
       <w:bookmarkStart w:id="8" w:name="_6630f66e9bddc915a7c003d1a4416942be99820"/>
-      <w:bookmarkStart w:id="9" w:name="_Toc242017695"/>
+      <w:bookmarkStart w:id="9" w:name="_Toc242018474"/>
       <w:bookmarkEnd w:id="6"/>
       <w:r>
         <w:rPr>
@@ -12555,7 +12555,7 @@
         </w:rPr>
         <w:lastRenderedPageBreak/>
         <w:drawing>
-          <wp:inline distT="0" distB="0" distL="0" distR="0" wp14:anchorId="5C3A058C" wp14:editId="38F3B8A8">
+          <wp:inline distT="0" distB="0" distL="0" distR="0" wp14:anchorId="0FB2EFF9" wp14:editId="5EACEBE9">
             <wp:extent cx="5334000" cy="2732048"/>
             <wp:effectExtent l="0" t="0" r="0" b="0"/>
             <wp:docPr id="22" name="Picture"/>
@@ -13513,7 +13513,7 @@
         <w:ind w:firstLine="709"/>
       </w:pPr>
       <w:bookmarkStart w:id="10" w:name="_32eb1a546c0e629ee5199cbd921989386414cef"/>
-      <w:bookmarkStart w:id="11" w:name="_Toc242017696"/>
+      <w:bookmarkStart w:id="11" w:name="_Toc242018475"/>
       <w:bookmarkEnd w:id="8"/>
       <w:r>
         <w:rPr>
@@ -14025,7 +14025,7 @@
         <w:ind w:firstLine="709"/>
       </w:pPr>
       <w:bookmarkStart w:id="12" w:name="_56392ae30d217601ca6b22348c46ed1cd30bda9"/>
-      <w:bookmarkStart w:id="13" w:name="_Toc242017697"/>
+      <w:bookmarkStart w:id="13" w:name="_Toc242018476"/>
       <w:bookmarkEnd w:id="10"/>
       <w:r>
         <w:rPr>
@@ -14641,7 +14641,7 @@
         <w:ind w:firstLine="709"/>
       </w:pPr>
       <w:bookmarkStart w:id="14" w:name="_81d55da623d41512ef63f4dc47f176415032501"/>
-      <w:bookmarkStart w:id="15" w:name="_Toc242017698"/>
+      <w:bookmarkStart w:id="15" w:name="_Toc242018477"/>
       <w:bookmarkEnd w:id="12"/>
       <w:r>
         <w:rPr>
@@ -15030,7 +15030,7 @@
         <w:ind w:firstLine="709"/>
       </w:pPr>
       <w:bookmarkStart w:id="16" w:name="_c864891c2a63545415c693c4f70871cf567029c"/>
-      <w:bookmarkStart w:id="17" w:name="_Toc242017699"/>
+      <w:bookmarkStart w:id="17" w:name="_Toc242018478"/>
       <w:bookmarkEnd w:id="14"/>
       <w:r>
         <w:rPr>
@@ -15682,7 +15682,7 @@
         <w:ind w:firstLine="709"/>
       </w:pPr>
       <w:bookmarkStart w:id="18" w:name="_ef6f952c7e24326ac23355a768c8b715ec8fce8"/>
-      <w:bookmarkStart w:id="19" w:name="_Toc242017700"/>
+      <w:bookmarkStart w:id="19" w:name="_Toc242018479"/>
       <w:bookmarkEnd w:id="16"/>
       <w:r>
         <w:rPr>
@@ -16450,7 +16450,7 @@
           <w:sz w:val="28"/>
         </w:rPr>
         <w:drawing>
-          <wp:inline distT="0" distB="0" distL="0" distR="0" wp14:anchorId="78FFD4FA" wp14:editId="099A73C2">
+          <wp:inline distT="0" distB="0" distL="0" distR="0" wp14:anchorId="2AE33C49" wp14:editId="6A8C92E9">
             <wp:extent cx="5334000" cy="2356883"/>
             <wp:effectExtent l="0" t="0" r="0" b="0"/>
             <wp:docPr id="30" name="Picture"/>
@@ -16545,7 +16545,7 @@
         <w:ind w:firstLine="709"/>
       </w:pPr>
       <w:bookmarkStart w:id="20" w:name="_6df6aabc6395b7d9765c374a4a7f2d43c0ba1e7"/>
-      <w:bookmarkStart w:id="21" w:name="_Toc242017701"/>
+      <w:bookmarkStart w:id="21" w:name="_Toc242018480"/>
       <w:bookmarkEnd w:id="18"/>
       <w:r>
         <w:rPr>
@@ -20246,7 +20246,7 @@
         <w:ind w:firstLine="709"/>
       </w:pPr>
       <w:bookmarkStart w:id="22" w:name="_bd0f162afc2e7ad7347811c158aa5f062feeff4"/>
-      <w:bookmarkStart w:id="23" w:name="_Toc242017702"/>
+      <w:bookmarkStart w:id="23" w:name="_Toc242018481"/>
       <w:bookmarkEnd w:id="20"/>
       <w:r>
         <w:rPr>
@@ -21011,7 +21011,7 @@
         <w:ind w:firstLine="709"/>
       </w:pPr>
       <w:bookmarkStart w:id="24" w:name="_07f39535de8dfb555f41c49666d7d7ad4469d72"/>
-      <w:bookmarkStart w:id="25" w:name="_Toc242017703"/>
+      <w:bookmarkStart w:id="25" w:name="_Toc242018482"/>
       <w:bookmarkEnd w:id="22"/>
       <w:r>
         <w:rPr>
@@ -22131,7 +22131,7 @@
         <w:ind w:firstLine="709"/>
       </w:pPr>
       <w:bookmarkStart w:id="26" w:name="_ограничения"/>
-      <w:bookmarkStart w:id="27" w:name="_Toc242017704"/>
+      <w:bookmarkStart w:id="27" w:name="_Toc242018483"/>
       <w:bookmarkEnd w:id="24"/>
       <w:r>
         <w:rPr>
@@ -22345,7 +22345,7 @@
         <w:ind w:firstLine="709"/>
       </w:pPr>
       <w:bookmarkStart w:id="28" w:name="_1bfdad9d2d88ddb6ca16c31c1d4d4943679f32f"/>
-      <w:bookmarkStart w:id="29" w:name="_Toc242017705"/>
+      <w:bookmarkStart w:id="29" w:name="_Toc242018484"/>
       <w:bookmarkEnd w:id="26"/>
       <w:bookmarkEnd w:id="2"/>
       <w:r>
@@ -23303,7 +23303,7 @@
         <w:jc w:val="center"/>
       </w:pPr>
       <w:bookmarkStart w:id="30" w:name="_выводы"/>
-      <w:bookmarkStart w:id="31" w:name="_Toc242017706"/>
+      <w:bookmarkStart w:id="31" w:name="_Toc242018485"/>
       <w:bookmarkEnd w:id="28"/>
       <w:r>
         <w:rPr>
@@ -23534,7 +23534,7 @@
         <w:rPr>
           <w:sz w:val="28"/>
         </w:rPr>
-        <w:t xml:space="preserve">, </w:t>
+        <w:t xml:space="preserve"> и </w:t>
       </w:r>
       <w:r>
         <w:rPr>
@@ -23560,33 +23560,7 @@
         <w:rPr>
           <w:sz w:val="28"/>
         </w:rPr>
-        <w:t xml:space="preserve">, </w:t>
-      </w:r>
-      <w:r>
-        <w:rPr>
-          <w:i/>
-          <w:sz w:val="28"/>
-        </w:rPr>
-        <w:t>Crunchbase</w:t>
-      </w:r>
-      <w:r>
-        <w:rPr>
-          <w:sz w:val="28"/>
-        </w:rPr>
-        <w:t xml:space="preserve"> и </w:t>
-      </w:r>
-      <w:r>
-        <w:rPr>
-          <w:i/>
-          <w:sz w:val="28"/>
-        </w:rPr>
-        <w:t>LinkedIn</w:t>
-      </w:r>
-      <w:r>
-        <w:rPr>
-          <w:sz w:val="28"/>
-        </w:rPr>
-        <w:t xml:space="preserve"> необходимо доснять (приложение Б); результаты переходят в ЛР5 и ЛР6.</w:t>
+        <w:t xml:space="preserve"> недоступны без платного доступа (приложение Б); результаты переходят в ЛР5 и ЛР6.</w:t>
       </w:r>
     </w:p>
     <w:p>
@@ -23597,7 +23571,7 @@
         <w:jc w:val="center"/>
       </w:pPr>
       <w:bookmarkStart w:id="32" w:name="_274f6a444530ef90b0479dabf3d210f01e97699"/>
-      <w:bookmarkStart w:id="33" w:name="_Toc242017707"/>
+      <w:bookmarkStart w:id="33" w:name="_Toc242018486"/>
       <w:bookmarkEnd w:id="30"/>
       <w:r>
         <w:rPr>
@@ -23605,7 +23579,14 @@
           <w:sz w:val="28"/>
         </w:rPr>
         <w:lastRenderedPageBreak/>
-        <w:t>СПИСОК ИСПОЛЬЗОВАННЫХ ИСТОЧНИКОВ</w:t>
+        <w:t>СПИСОК И</w:t>
+      </w:r>
+      <w:r>
+        <w:rPr>
+          <w:b/>
+          <w:sz w:val="28"/>
+        </w:rPr>
+        <w:t>СПОЛЬЗОВАННЫХ ИСТОЧНИКОВ</w:t>
       </w:r>
       <w:bookmarkEnd w:id="33"/>
     </w:p>
@@ -23642,13 +23623,13 @@
         <w:rPr>
           <w:sz w:val="28"/>
         </w:rPr>
-        <w:t>Методика оценки уровня конкур</w:t>
-      </w:r>
-      <w:r>
-        <w:rPr>
-          <w:sz w:val="28"/>
-        </w:rPr>
-        <w:t xml:space="preserve">енции и барьеров входа по данным </w:t>
+        <w:t>Методика оценки уровня конкуренции и б</w:t>
+      </w:r>
+      <w:r>
+        <w:rPr>
+          <w:sz w:val="28"/>
+        </w:rPr>
+        <w:t xml:space="preserve">арьеров входа по данным </w:t>
       </w:r>
       <w:r>
         <w:rPr>
@@ -23939,14 +23920,7 @@
           <w:i/>
           <w:sz w:val="28"/>
         </w:rPr>
-        <w:t>F</w:t>
-      </w:r>
-      <w:r>
-        <w:rPr>
-          <w:i/>
-          <w:sz w:val="28"/>
-        </w:rPr>
-        <w:t>ive</w:t>
+        <w:t>Five</w:t>
       </w:r>
       <w:r>
         <w:rPr>
@@ -24113,7 +24087,13 @@
         <w:rPr>
           <w:sz w:val="28"/>
         </w:rPr>
-        <w:t>Земляник, Р. В. Отчет по лабораторной работе № 1 «Анализ поискового спроса и фиксация границ рынка» / Р. В. Земляник. – Минск : БГУИР, 2026.</w:t>
+        <w:t xml:space="preserve">Земляник, Р. В. Отчет по лабораторной работе № 1 «Анализ поискового спроса и фиксация </w:t>
+      </w:r>
+      <w:r>
+        <w:rPr>
+          <w:sz w:val="28"/>
+        </w:rPr>
+        <w:t>границ рынка» / Р. В. Земляник. – Минск : БГУИР, 2026.</w:t>
       </w:r>
     </w:p>
     <w:p>
@@ -24131,13 +24111,7 @@
         <w:rPr>
           <w:sz w:val="28"/>
         </w:rPr>
-        <w:t>Землян</w:t>
-      </w:r>
-      <w:r>
-        <w:rPr>
-          <w:sz w:val="28"/>
-        </w:rPr>
-        <w:t>ик, Р. В. Отчет по лабораторной работе № 2–3 «Оценка объема рынка» / Р. В. Земляник. – Минск : БГУИР, 2026.</w:t>
+        <w:t>Земляник, Р. В. Отчет по лабораторной работе № 2–3 «Оценка объема рынка» / Р. В. Земляник. – Минск : БГУИР, 2026.</w:t>
       </w:r>
     </w:p>
     <w:p>
@@ -24188,19 +24162,20 @@
           <w:i/>
           <w:sz w:val="28"/>
         </w:rPr>
-        <w:t>TableMind</w:t>
-      </w:r>
-      <w:r>
-        <w:rPr>
-          <w:sz w:val="28"/>
-        </w:rPr>
-        <w:t>: отчеты по практическим занятиям по дисциплине «Управле</w:t>
-      </w:r>
-      <w:r>
-        <w:rPr>
-          <w:sz w:val="28"/>
-        </w:rPr>
-        <w:t>ние проектами» / Р. В. Земляник. – Минск : БГУИР, 2026.</w:t>
+        <w:t>Tabl</w:t>
+      </w:r>
+      <w:r>
+        <w:rPr>
+          <w:i/>
+          <w:sz w:val="28"/>
+        </w:rPr>
+        <w:t>eMind</w:t>
+      </w:r>
+      <w:r>
+        <w:rPr>
+          <w:sz w:val="28"/>
+        </w:rPr>
+        <w:t>: отчеты по практическим занятиям по дисциплине «Управление проектами» / Р. В. Земляник. – Минск : БГУИР, 2026.</w:t>
       </w:r>
     </w:p>
     <w:p>
@@ -24277,7 +24252,13 @@
         <w:rPr>
           <w:sz w:val="28"/>
         </w:rPr>
-        <w:t>) [Электронный ресурс]. – Режим доступа: https://pro.similarweb.com/. – Дата доступа: 03.10.2026.</w:t>
+        <w:t>) [Электронный ресурс]. – Режим доступа: https://pro.similarweb.com/. – Дата доступа: 03.10.202</w:t>
+      </w:r>
+      <w:r>
+        <w:rPr>
+          <w:sz w:val="28"/>
+        </w:rPr>
+        <w:t>6.</w:t>
       </w:r>
     </w:p>
     <w:p>
@@ -24456,13 +24437,7 @@
         <w:rPr>
           <w:sz w:val="28"/>
         </w:rPr>
-        <w:t xml:space="preserve"> [Электронный рес</w:t>
-      </w:r>
-      <w:r>
-        <w:rPr>
-          <w:sz w:val="28"/>
-        </w:rPr>
-        <w:t>урс]. – Режим доступа: https://www.trustpilot.com/review/perfectxl.com. – Дата доступа: 03.10.2026.</w:t>
+        <w:t xml:space="preserve"> [Электронный ресурс]. – Режим доступа: https://www.trustpilot.com/review/perfectxl.com. – Дата доступа: 03.10.2026.</w:t>
       </w:r>
     </w:p>
     <w:p>
@@ -24494,7 +24469,14 @@
           <w:i/>
           <w:sz w:val="28"/>
         </w:rPr>
-        <w:t>Pricing</w:t>
+        <w:t>Pric</w:t>
+      </w:r>
+      <w:r>
+        <w:rPr>
+          <w:i/>
+          <w:sz w:val="28"/>
+        </w:rPr>
+        <w:t>ing</w:t>
       </w:r>
       <w:r>
         <w:rPr>
@@ -24864,7 +24846,7 @@
         <w:jc w:val="center"/>
       </w:pPr>
       <w:bookmarkStart w:id="34" w:name="_3d74faf1500c1b2a4a8bfa8e0e37c74206ce73d"/>
-      <w:bookmarkStart w:id="35" w:name="_Toc242017708"/>
+      <w:bookmarkStart w:id="35" w:name="_Toc242018487"/>
       <w:bookmarkEnd w:id="32"/>
       <w:r>
         <w:rPr>
@@ -24939,7 +24921,13 @@
         <w:rPr>
           <w:sz w:val="28"/>
         </w:rPr>
-        <w:t>Таблица 20 – Журнал допущений ЛР4</w:t>
+        <w:t>Таблиц</w:t>
+      </w:r>
+      <w:r>
+        <w:rPr>
+          <w:sz w:val="28"/>
+        </w:rPr>
+        <w:t>а 20 – Журнал допущений ЛР4</w:t>
       </w:r>
     </w:p>
     <w:tbl>
@@ -25922,7 +25910,7 @@
         <w:jc w:val="center"/>
       </w:pPr>
       <w:bookmarkStart w:id="36" w:name="_25083b51e17d9d99817d1269b6af13d75b604a4"/>
-      <w:bookmarkStart w:id="37" w:name="_Toc242017709"/>
+      <w:bookmarkStart w:id="37" w:name="_Toc242018488"/>
       <w:bookmarkEnd w:id="34"/>
       <w:r>
         <w:rPr>
@@ -27030,7 +27018,7 @@
         <w:jc w:val="center"/>
       </w:pPr>
       <w:bookmarkStart w:id="38" w:name="_cb59224a7032ef66ab429e7df9b4e4c597bc187"/>
-      <w:bookmarkStart w:id="39" w:name="_Toc242017710"/>
+      <w:bookmarkStart w:id="39" w:name="_Toc242018489"/>
       <w:bookmarkEnd w:id="36"/>
       <w:r>
         <w:rPr>
@@ -27105,13 +27093,7 @@
         <w:rPr>
           <w:sz w:val="28"/>
         </w:rPr>
-        <w:t>Таблица 22 – Изменения шаблон</w:t>
-      </w:r>
-      <w:r>
-        <w:rPr>
-          <w:sz w:val="28"/>
-        </w:rPr>
-        <w:t>а</w:t>
+        <w:t>Таблица 22 – Изменения шаблона</w:t>
       </w:r>
     </w:p>
     <w:tbl>
@@ -27465,7 +27447,13 @@
               <w:rPr>
                 <w:sz w:val="24"/>
               </w:rPr>
-              <w:t xml:space="preserve">индекс считается по доступным компонентам; среднее число отзывов - </w:t>
+              <w:t>индекс считается по доступным компонентам; среднее ч</w:t>
+            </w:r>
+            <w:r>
+              <w:rPr>
+                <w:sz w:val="24"/>
+              </w:rPr>
+              <w:t xml:space="preserve">исло отзывов - </w:t>
             </w:r>
             <w:r>
               <w:rPr>
@@ -27541,13 +27529,7 @@
               <w:rPr>
                 <w:sz w:val="24"/>
               </w:rPr>
-              <w:t>индекс считался по восьми компонентам п</w:t>
-            </w:r>
-            <w:r>
-              <w:rPr>
-                <w:sz w:val="24"/>
-              </w:rPr>
-              <w:t>ри любых пропусках; доля зрелости суммировала две доли</w:t>
+              <w:t>индекс считался по восьми компонентам при любых пропусках; доля зрелости суммировала две доли</w:t>
             </w:r>
           </w:p>
         </w:tc>
@@ -27629,7 +27611,13 @@
               <w:rPr>
                 <w:sz w:val="24"/>
               </w:rPr>
-              <w:t>при отсутствии данных индекс давления становился нулем</w:t>
+              <w:t>при отсутствии данны</w:t>
+            </w:r>
+            <w:r>
+              <w:rPr>
+                <w:sz w:val="24"/>
+              </w:rPr>
+              <w:t>х индекс давления становился нулем</w:t>
             </w:r>
           </w:p>
         </w:tc>
@@ -27754,13 +27742,7 @@
         <w:rPr>
           <w:sz w:val="28"/>
         </w:rPr>
-        <w:t>Исправления 1, 2 и 6 затрагив</w:t>
-      </w:r>
-      <w:r>
-        <w:rPr>
-          <w:sz w:val="28"/>
-        </w:rPr>
-        <w:t>ают корректность формул; исправления 3-5 учитывают отсутствие части внешних данных и не меняют смысл показателей.</w:t>
+        <w:t>Исправления 1, 2 и 6 затрагивают корректность формул; исправления 3-5 учитывают отсутствие части внешних данных и не меняют смысл показателей.</w:t>
       </w:r>
     </w:p>
     <w:p>
@@ -27772,7 +27754,7 @@
         <w:jc w:val="center"/>
       </w:pPr>
       <w:bookmarkStart w:id="40" w:name="_36e5ced6b29eabb38058bfd1a6b3384d71712dd"/>
-      <w:bookmarkStart w:id="41" w:name="_Toc242017711"/>
+      <w:bookmarkStart w:id="41" w:name="_Toc242018490"/>
       <w:bookmarkEnd w:id="38"/>
       <w:r>
         <w:rPr>
@@ -27780,7 +27762,14 @@
           <w:sz w:val="28"/>
         </w:rPr>
         <w:lastRenderedPageBreak/>
-        <w:t>ПРИЛОЖЕНИЕ Г</w:t>
+        <w:t xml:space="preserve">ПРИЛОЖЕНИЕ </w:t>
+      </w:r>
+      <w:r>
+        <w:rPr>
+          <w:b/>
+          <w:sz w:val="28"/>
+        </w:rPr>
+        <w:t>Г</w:t>
       </w:r>
       <w:bookmarkEnd w:id="41"/>
     </w:p>
@@ -27883,13 +27872,7 @@
         <w:rPr>
           <w:sz w:val="28"/>
         </w:rPr>
-        <w:t>В таблице 23 представлено: дополнительные отзывы и рей</w:t>
-      </w:r>
-      <w:r>
-        <w:rPr>
-          <w:sz w:val="28"/>
-        </w:rPr>
-        <w:t>тинги.</w:t>
+        <w:t>В таблице 23 представлено: дополнительные отзывы и рейтинги.</w:t>
       </w:r>
     </w:p>
     <w:p>
@@ -28010,7 +27993,14 @@
                 <w:b/>
                 <w:sz w:val="24"/>
               </w:rPr>
-              <w:t>Комментарий</w:t>
+              <w:t>Комментар</w:t>
+            </w:r>
+            <w:r>
+              <w:rPr>
+                <w:b/>
+                <w:sz w:val="24"/>
+              </w:rPr>
+              <w:t>ий</w:t>
             </w:r>
           </w:p>
         </w:tc>
@@ -28385,13 +28375,13 @@
               <w:rPr>
                 <w:sz w:val="24"/>
               </w:rPr>
-              <w:t>все</w:t>
-            </w:r>
-            <w:r>
-              <w:rPr>
-                <w:sz w:val="24"/>
-              </w:rPr>
-              <w:t xml:space="preserve"> отзывы однозвездочные: списание после пробного периода, сложная отмена, отказ в возврате</w:t>
+              <w:t>все отзывы однозвездочные</w:t>
+            </w:r>
+            <w:r>
+              <w:rPr>
+                <w:sz w:val="24"/>
+              </w:rPr>
+              <w:t>: списание после пробного периода, сложная отмена, отказ в возврате</w:t>
             </w:r>
           </w:p>
         </w:tc>
@@ -28711,7 +28701,7 @@
         <w:jc w:val="center"/>
       </w:pPr>
       <w:bookmarkStart w:id="42" w:name="_66fcbafe8bc9e7780670ba4b2232c7930f0801d"/>
-      <w:bookmarkStart w:id="43" w:name="_Toc242017712"/>
+      <w:bookmarkStart w:id="43" w:name="_Toc242018491"/>
       <w:bookmarkEnd w:id="40"/>
       <w:r>
         <w:rPr>
@@ -32575,7 +32565,7 @@
         <w:jc w:val="center"/>
       </w:pPr>
       <w:bookmarkStart w:id="44" w:name="_611c72cb5ff698cc2a9b3fadd77ca45e6ffe88e"/>
-      <w:bookmarkStart w:id="45" w:name="_Toc242017713"/>
+      <w:bookmarkStart w:id="45" w:name="_Toc242018492"/>
       <w:bookmarkEnd w:id="42"/>
       <w:r>
         <w:rPr>
@@ -38198,7 +38188,7 @@
         <w:jc w:val="center"/>
       </w:pPr>
       <w:bookmarkStart w:id="46" w:name="_742d751e4621367dcb265d3c521b88e71e5edc1"/>
-      <w:bookmarkStart w:id="47" w:name="_Toc242017714"/>
+      <w:bookmarkStart w:id="47" w:name="_Toc242018493"/>
       <w:bookmarkEnd w:id="44"/>
       <w:r>
         <w:rPr>
@@ -39303,7 +39293,7 @@
         <w:jc w:val="center"/>
       </w:pPr>
       <w:bookmarkStart w:id="48" w:name="_0b5a946c20a7ff3f44711d3f4d1b7cf881d090d"/>
-      <w:bookmarkStart w:id="49" w:name="_Toc242017715"/>
+      <w:bookmarkStart w:id="49" w:name="_Toc242018494"/>
       <w:bookmarkEnd w:id="46"/>
       <w:r>
         <w:rPr>
@@ -40161,7 +40151,7 @@
   <w:abstractNum w:abstractNumId="0" w15:restartNumberingAfterBreak="0">
     <w:nsid w:val="0000A990"/>
     <w:multiLevelType w:val="multilevel"/>
-    <w:tmpl w:val="326005EA"/>
+    <w:tmpl w:val="26E8F782"/>
     <w:lvl w:ilvl="0">
       <w:numFmt w:val="bullet"/>
       <w:lvlText w:val=" "/>
@@ -40238,7 +40228,7 @@
   <w:abstractNum w:abstractNumId="1" w15:restartNumberingAfterBreak="0">
     <w:nsid w:val="00A99411"/>
     <w:multiLevelType w:val="multilevel"/>
-    <w:tmpl w:val="24624718"/>
+    <w:tmpl w:val="D270B146"/>
     <w:lvl w:ilvl="0">
       <w:start w:val="1"/>
       <w:numFmt w:val="decimal"/>
@@ -41716,7 +41706,7 @@
     <w:autoRedefine/>
     <w:uiPriority w:val="39"/>
     <w:unhideWhenUsed/>
-    <w:rsid w:val="007D6A38"/>
+    <w:rsid w:val="00AD07D2"/>
     <w:pPr>
       <w:spacing w:after="100"/>
     </w:pPr>
@@ -41728,7 +41718,7 @@
     <w:autoRedefine/>
     <w:uiPriority w:val="39"/>
     <w:unhideWhenUsed/>
-    <w:rsid w:val="007D6A38"/>
+    <w:rsid w:val="00AD07D2"/>
     <w:pPr>
       <w:spacing w:after="100"/>
       <w:ind w:left="240"/>

</xml_diff>